<commit_message>
Actualiza planificacion y cronograma del Avance 2 con tareas de las reuniones de agosto-septiembre
</commit_message>
<xml_diff>
--- a/docs/Proyecto de Gestión de Reservas para Hoteles.docx
+++ b/docs/Proyecto de Gestión de Reservas para Hoteles.docx
@@ -8450,6 +8450,2333 @@
           </w:p>
         </w:tc>
       </w:tr>
+      <w:tr>
+        <w:trPr>
+          <w:trHeight w:val="300"/>
+        </w:trPr>
+        <w:tc>
+          <w:tcPr>
+            <w:tcW w:w="3050" w:type="dxa"/>
+          </w:tcPr>
+          <w:p>
+            <w:pPr>
+              <w:spacing w:line="480" w:lineRule="auto"/>
+              <w:rPr>
+                <w:rFonts w:ascii="Arial" w:hAnsi="Arial" w:cs="Arial"/>
+                <w:sz w:val="22"/>
+                <w:szCs w:val="22"/>
+              </w:rPr>
+            </w:pPr>
+            <w:r>
+              <w:rPr>
+                <w:rFonts w:ascii="Arial" w:hAnsi="Arial" w:cs="Arial"/>
+                <w:sz w:val="22"/>
+                <w:szCs w:val="22"/>
+              </w:rPr>
+              <w:t>Organizar reunión de kickoff del Avance 2</w:t>
+            </w:r>
+          </w:p>
+        </w:tc>
+        <w:tc>
+          <w:tcPr>
+            <w:tcW w:w="2338" w:type="dxa"/>
+          </w:tcPr>
+          <w:p>
+            <w:pPr>
+              <w:spacing w:line="480" w:lineRule="auto"/>
+              <w:rPr>
+                <w:rFonts w:ascii="Arial" w:hAnsi="Arial" w:cs="Arial"/>
+                <w:sz w:val="22"/>
+                <w:szCs w:val="22"/>
+              </w:rPr>
+            </w:pPr>
+            <w:r>
+              <w:rPr>
+                <w:rFonts w:ascii="Arial" w:hAnsi="Arial" w:cs="Arial"/>
+                <w:sz w:val="22"/>
+                <w:szCs w:val="22"/>
+              </w:rPr>
+              <w:t xml:space="preserve">Scrum </w:t>
+            </w:r>
+            <w:proofErr w:type="gramStart"/>
+            <w:r>
+              <w:rPr>
+                <w:rFonts w:ascii="Arial" w:hAnsi="Arial" w:cs="Arial"/>
+                <w:sz w:val="22"/>
+                <w:szCs w:val="22"/>
+              </w:rPr>
+              <w:t>Master</w:t>
+            </w:r>
+            <w:proofErr w:type="gramEnd"/>
+          </w:p>
+        </w:tc>
+        <w:tc>
+          <w:tcPr>
+            <w:tcW w:w="2338" w:type="dxa"/>
+          </w:tcPr>
+          <w:p>
+            <w:pPr>
+              <w:spacing w:line="480" w:lineRule="auto"/>
+              <w:rPr>
+                <w:rFonts w:ascii="Arial" w:hAnsi="Arial" w:cs="Arial"/>
+                <w:sz w:val="22"/>
+                <w:szCs w:val="22"/>
+              </w:rPr>
+            </w:pPr>
+            <w:r>
+              <w:rPr>
+                <w:rFonts w:ascii="Arial" w:hAnsi="Arial" w:cs="Arial"/>
+                <w:sz w:val="22"/>
+                <w:szCs w:val="22"/>
+              </w:rPr>
+              <w:t>Carla Vanesa Franco Avelar</w:t>
+            </w:r>
+          </w:p>
+        </w:tc>
+        <w:tc>
+          <w:tcPr>
+            <w:tcW w:w="1634" w:type="dxa"/>
+          </w:tcPr>
+          <w:p>
+            <w:pPr>
+              <w:spacing w:line="480" w:lineRule="auto"/>
+              <w:rPr>
+                <w:rFonts w:ascii="Arial" w:hAnsi="Arial" w:cs="Arial"/>
+                <w:sz w:val="22"/>
+                <w:szCs w:val="22"/>
+              </w:rPr>
+            </w:pPr>
+            <w:r>
+              <w:rPr>
+                <w:rFonts w:ascii="Arial" w:hAnsi="Arial" w:cs="Arial"/>
+                <w:sz w:val="22"/>
+                <w:szCs w:val="22"/>
+              </w:rPr>
+              <w:t>30 ago</w:t>
+            </w:r>
+          </w:p>
+        </w:tc>
+      </w:tr>
+      <w:tr>
+        <w:trPr>
+          <w:trHeight w:val="300"/>
+        </w:trPr>
+        <w:tc>
+          <w:tcPr>
+            <w:tcW w:w="3050" w:type="dxa"/>
+          </w:tcPr>
+          <w:p>
+            <w:pPr>
+              <w:spacing w:line="480" w:lineRule="auto"/>
+              <w:rPr>
+                <w:rFonts w:ascii="Arial" w:hAnsi="Arial" w:cs="Arial"/>
+                <w:sz w:val="22"/>
+                <w:szCs w:val="22"/>
+              </w:rPr>
+            </w:pPr>
+            <w:r>
+              <w:rPr>
+                <w:rFonts w:ascii="Arial" w:hAnsi="Arial" w:cs="Arial"/>
+                <w:sz w:val="22"/>
+                <w:szCs w:val="22"/>
+              </w:rPr>
+              <w:t>Repasar requerimientos técnicos obligatorios de la guía con el equipo</w:t>
+            </w:r>
+          </w:p>
+        </w:tc>
+        <w:tc>
+          <w:tcPr>
+            <w:tcW w:w="2338" w:type="dxa"/>
+          </w:tcPr>
+          <w:p>
+            <w:pPr>
+              <w:spacing w:line="480" w:lineRule="auto"/>
+              <w:rPr>
+                <w:rFonts w:ascii="Arial" w:hAnsi="Arial" w:cs="Arial"/>
+                <w:sz w:val="22"/>
+                <w:szCs w:val="22"/>
+              </w:rPr>
+            </w:pPr>
+            <w:r>
+              <w:rPr>
+                <w:rFonts w:ascii="Arial" w:hAnsi="Arial" w:cs="Arial"/>
+                <w:sz w:val="22"/>
+                <w:szCs w:val="22"/>
+              </w:rPr>
+              <w:t>Todos</w:t>
+            </w:r>
+          </w:p>
+        </w:tc>
+        <w:tc>
+          <w:tcPr>
+            <w:tcW w:w="2338" w:type="dxa"/>
+          </w:tcPr>
+          <w:p>
+            <w:pPr>
+              <w:spacing w:line="480" w:lineRule="auto"/>
+              <w:rPr>
+                <w:rFonts w:ascii="Arial" w:hAnsi="Arial" w:cs="Arial"/>
+                <w:sz w:val="22"/>
+                <w:szCs w:val="22"/>
+              </w:rPr>
+            </w:pPr>
+            <w:r>
+              <w:rPr>
+                <w:rFonts w:ascii="Arial" w:hAnsi="Arial" w:cs="Arial"/>
+                <w:sz w:val="22"/>
+                <w:szCs w:val="22"/>
+              </w:rPr>
+              <w:t>Todos los integrantes</w:t>
+            </w:r>
+          </w:p>
+        </w:tc>
+        <w:tc>
+          <w:tcPr>
+            <w:tcW w:w="1634" w:type="dxa"/>
+          </w:tcPr>
+          <w:p>
+            <w:pPr>
+              <w:spacing w:line="480" w:lineRule="auto"/>
+              <w:rPr>
+                <w:rFonts w:ascii="Arial" w:hAnsi="Arial" w:cs="Arial"/>
+                <w:sz w:val="22"/>
+                <w:szCs w:val="22"/>
+              </w:rPr>
+            </w:pPr>
+            <w:r>
+              <w:rPr>
+                <w:rFonts w:ascii="Arial" w:hAnsi="Arial" w:cs="Arial"/>
+                <w:sz w:val="22"/>
+                <w:szCs w:val="22"/>
+              </w:rPr>
+              <w:t>30 ago</w:t>
+            </w:r>
+          </w:p>
+        </w:tc>
+      </w:tr>
+      <w:tr>
+        <w:trPr>
+          <w:trHeight w:val="300"/>
+        </w:trPr>
+        <w:tc>
+          <w:tcPr>
+            <w:tcW w:w="3050" w:type="dxa"/>
+          </w:tcPr>
+          <w:p>
+            <w:pPr>
+              <w:spacing w:line="480" w:lineRule="auto"/>
+              <w:rPr>
+                <w:rFonts w:ascii="Arial" w:hAnsi="Arial" w:cs="Arial"/>
+                <w:sz w:val="22"/>
+                <w:szCs w:val="22"/>
+              </w:rPr>
+            </w:pPr>
+            <w:r>
+              <w:rPr>
+                <w:rFonts w:ascii="Arial" w:hAnsi="Arial" w:cs="Arial"/>
+                <w:sz w:val="22"/>
+                <w:szCs w:val="22"/>
+              </w:rPr>
+              <w:t xml:space="preserve">Enviar correo/nombre </w:t>
+            </w:r>
+            <w:r>
+              <w:rPr>
+                <w:rFonts w:ascii="Arial" w:hAnsi="Arial" w:cs="Arial"/>
+                <w:sz w:val="22"/>
+                <w:szCs w:val="22"/>
+              </w:rPr>
+              <w:t xml:space="preserve">de usuario </w:t>
+            </w:r>
+            <w:r>
+              <w:rPr>
+                <w:rFonts w:ascii="Arial" w:hAnsi="Arial" w:cs="Arial"/>
+                <w:sz w:val="22"/>
+                <w:szCs w:val="22"/>
+              </w:rPr>
+              <w:t>para acceso al repositorio</w:t>
+            </w:r>
+          </w:p>
+        </w:tc>
+        <w:tc>
+          <w:tcPr>
+            <w:tcW w:w="2338" w:type="dxa"/>
+          </w:tcPr>
+          <w:p>
+            <w:pPr>
+              <w:spacing w:line="480" w:lineRule="auto"/>
+              <w:rPr>
+                <w:rFonts w:ascii="Arial" w:hAnsi="Arial" w:cs="Arial"/>
+                <w:sz w:val="22"/>
+                <w:szCs w:val="22"/>
+              </w:rPr>
+            </w:pPr>
+            <w:r>
+              <w:rPr>
+                <w:rFonts w:ascii="Arial" w:hAnsi="Arial" w:cs="Arial"/>
+                <w:sz w:val="22"/>
+                <w:szCs w:val="22"/>
+              </w:rPr>
+              <w:t>Todos</w:t>
+            </w:r>
+          </w:p>
+        </w:tc>
+        <w:tc>
+          <w:tcPr>
+            <w:tcW w:w="2338" w:type="dxa"/>
+          </w:tcPr>
+          <w:p>
+            <w:pPr>
+              <w:spacing w:line="480" w:lineRule="auto"/>
+              <w:rPr>
+                <w:rFonts w:ascii="Arial" w:hAnsi="Arial" w:cs="Arial"/>
+                <w:sz w:val="22"/>
+                <w:szCs w:val="22"/>
+              </w:rPr>
+            </w:pPr>
+            <w:r>
+              <w:rPr>
+                <w:rFonts w:ascii="Arial" w:hAnsi="Arial" w:cs="Arial"/>
+                <w:sz w:val="22"/>
+                <w:szCs w:val="22"/>
+              </w:rPr>
+              <w:t>Todos los integrantes</w:t>
+            </w:r>
+          </w:p>
+        </w:tc>
+        <w:tc>
+          <w:tcPr>
+            <w:tcW w:w="1634" w:type="dxa"/>
+          </w:tcPr>
+          <w:p>
+            <w:pPr>
+              <w:spacing w:line="480" w:lineRule="auto"/>
+              <w:rPr>
+                <w:rFonts w:ascii="Arial" w:hAnsi="Arial" w:cs="Arial"/>
+                <w:sz w:val="22"/>
+                <w:szCs w:val="22"/>
+              </w:rPr>
+            </w:pPr>
+            <w:r>
+              <w:rPr>
+                <w:rFonts w:ascii="Arial" w:hAnsi="Arial" w:cs="Arial"/>
+                <w:sz w:val="22"/>
+                <w:szCs w:val="22"/>
+              </w:rPr>
+              <w:t xml:space="preserve">30 </w:t>
+            </w:r>
+            <w:proofErr w:type="spellStart"/>
+            <w:r>
+              <w:rPr>
+                <w:rFonts w:ascii="Arial" w:hAnsi="Arial" w:cs="Arial"/>
+                <w:sz w:val="22"/>
+                <w:szCs w:val="22"/>
+              </w:rPr>
+              <w:t>ago</w:t>
+            </w:r>
+            <w:proofErr w:type="spellEnd"/>
+          </w:p>
+        </w:tc>
+      </w:tr>
+      <w:tr>
+        <w:trPr>
+          <w:trHeight w:val="300"/>
+        </w:trPr>
+        <w:tc>
+          <w:tcPr>
+            <w:tcW w:w="3050" w:type="dxa"/>
+          </w:tcPr>
+          <w:p>
+            <w:pPr>
+              <w:spacing w:line="480" w:lineRule="auto"/>
+              <w:rPr>
+                <w:rFonts w:ascii="Arial" w:hAnsi="Arial" w:cs="Arial"/>
+                <w:sz w:val="22"/>
+                <w:szCs w:val="22"/>
+              </w:rPr>
+            </w:pPr>
+            <w:r>
+              <w:rPr>
+                <w:rFonts w:ascii="Arial" w:hAnsi="Arial" w:cs="Arial"/>
+                <w:sz w:val="22"/>
+                <w:szCs w:val="22"/>
+              </w:rPr>
+              <w:t>Crear el nuevo repositorio para el Avance 2</w:t>
+            </w:r>
+          </w:p>
+        </w:tc>
+        <w:tc>
+          <w:tcPr>
+            <w:tcW w:w="2338" w:type="dxa"/>
+          </w:tcPr>
+          <w:p>
+            <w:pPr>
+              <w:spacing w:line="480" w:lineRule="auto"/>
+              <w:rPr>
+                <w:rFonts w:ascii="Arial" w:hAnsi="Arial" w:cs="Arial"/>
+                <w:sz w:val="22"/>
+                <w:szCs w:val="22"/>
+              </w:rPr>
+            </w:pPr>
+            <w:proofErr w:type="spellStart"/>
+            <w:r>
+              <w:rPr>
+                <w:rFonts w:ascii="Arial" w:hAnsi="Arial" w:cs="Arial"/>
+                <w:sz w:val="22"/>
+                <w:szCs w:val="22"/>
+              </w:rPr>
+              <w:t>Backend</w:t>
+            </w:r>
+            <w:proofErr w:type="spellEnd"/>
+          </w:p>
+        </w:tc>
+        <w:tc>
+          <w:tcPr>
+            <w:tcW w:w="2338" w:type="dxa"/>
+          </w:tcPr>
+          <w:p>
+            <w:pPr>
+              <w:spacing w:line="480" w:lineRule="auto"/>
+              <w:rPr>
+                <w:rFonts w:ascii="Arial" w:hAnsi="Arial" w:cs="Arial"/>
+                <w:sz w:val="22"/>
+                <w:szCs w:val="22"/>
+              </w:rPr>
+            </w:pPr>
+            <w:r>
+              <w:rPr>
+                <w:rFonts w:ascii="Arial" w:hAnsi="Arial" w:cs="Arial"/>
+                <w:sz w:val="22"/>
+                <w:szCs w:val="22"/>
+              </w:rPr>
+              <w:t>Franklin Martin Fuentes Chávez</w:t>
+            </w:r>
+          </w:p>
+        </w:tc>
+        <w:tc>
+          <w:tcPr>
+            <w:tcW w:w="1634" w:type="dxa"/>
+          </w:tcPr>
+          <w:p>
+            <w:pPr>
+              <w:spacing w:line="480" w:lineRule="auto"/>
+              <w:rPr>
+                <w:rFonts w:ascii="Arial" w:hAnsi="Arial" w:cs="Arial"/>
+                <w:sz w:val="22"/>
+                <w:szCs w:val="22"/>
+              </w:rPr>
+            </w:pPr>
+            <w:r>
+              <w:rPr>
+                <w:rFonts w:ascii="Arial" w:hAnsi="Arial" w:cs="Arial"/>
+                <w:sz w:val="22"/>
+                <w:szCs w:val="22"/>
+              </w:rPr>
+              <w:t>30 ago</w:t>
+            </w:r>
+          </w:p>
+        </w:tc>
+      </w:tr>
+      <w:tr>
+        <w:trPr>
+          <w:trHeight w:val="300"/>
+        </w:trPr>
+        <w:tc>
+          <w:tcPr>
+            <w:tcW w:w="3050" w:type="dxa"/>
+          </w:tcPr>
+          <w:p>
+            <w:pPr>
+              <w:spacing w:line="480" w:lineRule="auto"/>
+              <w:jc w:val="right"/>
+              <w:rPr>
+                <w:rFonts w:ascii="Arial" w:hAnsi="Arial" w:cs="Arial"/>
+                <w:sz w:val="22"/>
+                <w:szCs w:val="22"/>
+              </w:rPr>
+            </w:pPr>
+            <w:r>
+              <w:rPr>
+                <w:rFonts w:ascii="Arial" w:hAnsi="Arial" w:cs="Arial"/>
+                <w:sz w:val="22"/>
+                <w:szCs w:val="22"/>
+              </w:rPr>
+              <w:t xml:space="preserve">Implementar concurrencia (hilos + </w:t>
+            </w:r>
+            <w:proofErr w:type="spellStart"/>
+            <w:r>
+              <w:rPr>
+                <w:rFonts w:ascii="Arial" w:hAnsi="Arial" w:cs="Arial"/>
+                <w:sz w:val="22"/>
+                <w:szCs w:val="22"/>
+              </w:rPr>
+              <w:t>synchronized</w:t>
+            </w:r>
+            <w:proofErr w:type="spellEnd"/>
+            <w:r>
+              <w:rPr>
+                <w:rFonts w:ascii="Arial" w:hAnsi="Arial" w:cs="Arial"/>
+                <w:sz w:val="22"/>
+                <w:szCs w:val="22"/>
+              </w:rPr>
+              <w:t>, evitar doble reserva de habitación)</w:t>
+            </w:r>
+          </w:p>
+        </w:tc>
+        <w:tc>
+          <w:tcPr>
+            <w:tcW w:w="2338" w:type="dxa"/>
+          </w:tcPr>
+          <w:p>
+            <w:pPr>
+              <w:spacing w:line="480" w:lineRule="auto"/>
+              <w:rPr>
+                <w:rFonts w:ascii="Arial" w:hAnsi="Arial" w:cs="Arial"/>
+                <w:sz w:val="22"/>
+                <w:szCs w:val="22"/>
+              </w:rPr>
+            </w:pPr>
+            <w:proofErr w:type="spellStart"/>
+            <w:r>
+              <w:rPr>
+                <w:rFonts w:ascii="Arial" w:hAnsi="Arial" w:cs="Arial"/>
+                <w:sz w:val="22"/>
+                <w:szCs w:val="22"/>
+              </w:rPr>
+              <w:t>Backend</w:t>
+            </w:r>
+            <w:proofErr w:type="spellEnd"/>
+          </w:p>
+        </w:tc>
+        <w:tc>
+          <w:tcPr>
+            <w:tcW w:w="2338" w:type="dxa"/>
+          </w:tcPr>
+          <w:p>
+            <w:pPr>
+              <w:spacing w:line="480" w:lineRule="auto"/>
+              <w:rPr>
+                <w:rFonts w:ascii="Arial" w:hAnsi="Arial" w:cs="Arial"/>
+                <w:sz w:val="22"/>
+                <w:szCs w:val="22"/>
+              </w:rPr>
+            </w:pPr>
+            <w:r>
+              <w:rPr>
+                <w:rFonts w:ascii="Arial" w:hAnsi="Arial" w:cs="Arial"/>
+                <w:sz w:val="22"/>
+                <w:szCs w:val="22"/>
+              </w:rPr>
+              <w:t>Franklin Martin Fuentes Chávez</w:t>
+            </w:r>
+          </w:p>
+        </w:tc>
+        <w:tc>
+          <w:tcPr>
+            <w:tcW w:w="1634" w:type="dxa"/>
+          </w:tcPr>
+          <w:p>
+            <w:pPr>
+              <w:spacing w:line="480" w:lineRule="auto"/>
+              <w:rPr>
+                <w:rFonts w:ascii="Arial" w:hAnsi="Arial" w:cs="Arial"/>
+                <w:sz w:val="22"/>
+                <w:szCs w:val="22"/>
+              </w:rPr>
+            </w:pPr>
+            <w:r>
+              <w:rPr>
+                <w:rFonts w:ascii="Arial" w:hAnsi="Arial" w:cs="Arial"/>
+                <w:sz w:val="22"/>
+                <w:szCs w:val="22"/>
+              </w:rPr>
+              <w:t>13 sept</w:t>
+            </w:r>
+          </w:p>
+        </w:tc>
+      </w:tr>
+      <w:tr>
+        <w:trPr>
+          <w:trHeight w:val="300"/>
+        </w:trPr>
+        <w:tc>
+          <w:tcPr>
+            <w:tcW w:w="3050" w:type="dxa"/>
+          </w:tcPr>
+          <w:p>
+            <w:pPr>
+              <w:spacing w:line="480" w:lineRule="auto"/>
+              <w:rPr>
+                <w:rFonts w:ascii="Arial" w:hAnsi="Arial" w:cs="Arial"/>
+                <w:sz w:val="22"/>
+                <w:szCs w:val="22"/>
+              </w:rPr>
+            </w:pPr>
+            <w:r>
+              <w:rPr>
+                <w:rFonts w:ascii="Arial" w:hAnsi="Arial" w:cs="Arial"/>
+                <w:sz w:val="22"/>
+                <w:szCs w:val="22"/>
+              </w:rPr>
+              <w:t>Implementar persistencia mediante archivos .</w:t>
+            </w:r>
+            <w:proofErr w:type="spellStart"/>
+            <w:r>
+              <w:rPr>
+                <w:rFonts w:ascii="Arial" w:hAnsi="Arial" w:cs="Arial"/>
+                <w:sz w:val="22"/>
+                <w:szCs w:val="22"/>
+              </w:rPr>
+              <w:t>dat</w:t>
+            </w:r>
+            <w:proofErr w:type="spellEnd"/>
+          </w:p>
+        </w:tc>
+        <w:tc>
+          <w:tcPr>
+            <w:tcW w:w="2338" w:type="dxa"/>
+          </w:tcPr>
+          <w:p>
+            <w:pPr>
+              <w:spacing w:line="480" w:lineRule="auto"/>
+              <w:rPr>
+                <w:rFonts w:ascii="Arial" w:hAnsi="Arial" w:cs="Arial"/>
+                <w:sz w:val="22"/>
+                <w:szCs w:val="22"/>
+              </w:rPr>
+            </w:pPr>
+            <w:proofErr w:type="spellStart"/>
+            <w:r>
+              <w:rPr>
+                <w:rFonts w:ascii="Arial" w:hAnsi="Arial" w:cs="Arial"/>
+                <w:sz w:val="22"/>
+                <w:szCs w:val="22"/>
+              </w:rPr>
+              <w:t>Backend</w:t>
+            </w:r>
+            <w:proofErr w:type="spellEnd"/>
+          </w:p>
+        </w:tc>
+        <w:tc>
+          <w:tcPr>
+            <w:tcW w:w="2338" w:type="dxa"/>
+          </w:tcPr>
+          <w:p>
+            <w:pPr>
+              <w:spacing w:line="480" w:lineRule="auto"/>
+              <w:rPr>
+                <w:rFonts w:ascii="Arial" w:hAnsi="Arial" w:cs="Arial"/>
+                <w:sz w:val="22"/>
+                <w:szCs w:val="22"/>
+              </w:rPr>
+            </w:pPr>
+            <w:r>
+              <w:rPr>
+                <w:rFonts w:ascii="Arial" w:hAnsi="Arial" w:cs="Arial"/>
+                <w:sz w:val="22"/>
+                <w:szCs w:val="22"/>
+              </w:rPr>
+              <w:t>Franklin Martin Fuentes Chávez</w:t>
+            </w:r>
+          </w:p>
+        </w:tc>
+        <w:tc>
+          <w:tcPr>
+            <w:tcW w:w="1634" w:type="dxa"/>
+          </w:tcPr>
+          <w:p>
+            <w:pPr>
+              <w:spacing w:line="480" w:lineRule="auto"/>
+              <w:rPr>
+                <w:rFonts w:ascii="Arial" w:hAnsi="Arial" w:cs="Arial"/>
+                <w:sz w:val="22"/>
+                <w:szCs w:val="22"/>
+              </w:rPr>
+            </w:pPr>
+            <w:r>
+              <w:rPr>
+                <w:rFonts w:ascii="Arial" w:hAnsi="Arial" w:cs="Arial"/>
+                <w:sz w:val="22"/>
+                <w:szCs w:val="22"/>
+              </w:rPr>
+              <w:t>13 sept</w:t>
+            </w:r>
+          </w:p>
+        </w:tc>
+      </w:tr>
+      <w:tr>
+        <w:trPr>
+          <w:trHeight w:val="300"/>
+        </w:trPr>
+        <w:tc>
+          <w:tcPr>
+            <w:tcW w:w="3050" w:type="dxa"/>
+          </w:tcPr>
+          <w:p>
+            <w:pPr>
+              <w:spacing w:line="480" w:lineRule="auto"/>
+              <w:rPr>
+                <w:rFonts w:ascii="Arial" w:hAnsi="Arial" w:cs="Arial"/>
+                <w:sz w:val="22"/>
+                <w:szCs w:val="22"/>
+              </w:rPr>
+            </w:pPr>
+            <w:r>
+              <w:rPr>
+                <w:rFonts w:ascii="Arial" w:hAnsi="Arial" w:cs="Arial"/>
+                <w:sz w:val="22"/>
+                <w:szCs w:val="22"/>
+              </w:rPr>
+              <w:lastRenderedPageBreak/>
+              <w:t>Implementar encapsulamiento</w:t>
+            </w:r>
+          </w:p>
+        </w:tc>
+        <w:tc>
+          <w:tcPr>
+            <w:tcW w:w="2338" w:type="dxa"/>
+          </w:tcPr>
+          <w:p>
+            <w:pPr>
+              <w:spacing w:line="480" w:lineRule="auto"/>
+              <w:rPr>
+                <w:rFonts w:ascii="Arial" w:hAnsi="Arial" w:cs="Arial"/>
+                <w:sz w:val="22"/>
+                <w:szCs w:val="22"/>
+              </w:rPr>
+            </w:pPr>
+            <w:proofErr w:type="spellStart"/>
+            <w:r>
+              <w:rPr>
+                <w:rFonts w:ascii="Arial" w:hAnsi="Arial" w:cs="Arial"/>
+                <w:sz w:val="22"/>
+                <w:szCs w:val="22"/>
+              </w:rPr>
+              <w:t>Backend</w:t>
+            </w:r>
+            <w:proofErr w:type="spellEnd"/>
+          </w:p>
+        </w:tc>
+        <w:tc>
+          <w:tcPr>
+            <w:tcW w:w="2338" w:type="dxa"/>
+          </w:tcPr>
+          <w:p>
+            <w:pPr>
+              <w:spacing w:line="480" w:lineRule="auto"/>
+              <w:rPr>
+                <w:rFonts w:ascii="Arial" w:hAnsi="Arial" w:cs="Arial"/>
+                <w:sz w:val="22"/>
+                <w:szCs w:val="22"/>
+              </w:rPr>
+            </w:pPr>
+            <w:r>
+              <w:rPr>
+                <w:rFonts w:ascii="Arial" w:hAnsi="Arial" w:cs="Arial"/>
+                <w:sz w:val="22"/>
+                <w:szCs w:val="22"/>
+              </w:rPr>
+              <w:t>Franklin Martin Fuentes Chávez</w:t>
+            </w:r>
+          </w:p>
+        </w:tc>
+        <w:tc>
+          <w:tcPr>
+            <w:tcW w:w="1634" w:type="dxa"/>
+          </w:tcPr>
+          <w:p>
+            <w:pPr>
+              <w:spacing w:line="480" w:lineRule="auto"/>
+              <w:rPr>
+                <w:rFonts w:ascii="Arial" w:hAnsi="Arial" w:cs="Arial"/>
+                <w:sz w:val="22"/>
+                <w:szCs w:val="22"/>
+              </w:rPr>
+            </w:pPr>
+            <w:r>
+              <w:rPr>
+                <w:rFonts w:ascii="Arial" w:hAnsi="Arial" w:cs="Arial"/>
+                <w:sz w:val="22"/>
+                <w:szCs w:val="22"/>
+              </w:rPr>
+              <w:t>13 sept</w:t>
+            </w:r>
+          </w:p>
+        </w:tc>
+      </w:tr>
+      <w:tr>
+        <w:trPr>
+          <w:trHeight w:val="300"/>
+        </w:trPr>
+        <w:tc>
+          <w:tcPr>
+            <w:tcW w:w="3050" w:type="dxa"/>
+          </w:tcPr>
+          <w:p>
+            <w:pPr>
+              <w:spacing w:line="480" w:lineRule="auto"/>
+              <w:rPr>
+                <w:rFonts w:ascii="Arial" w:hAnsi="Arial" w:cs="Arial"/>
+                <w:sz w:val="22"/>
+                <w:szCs w:val="22"/>
+              </w:rPr>
+            </w:pPr>
+            <w:r>
+              <w:rPr>
+                <w:rFonts w:ascii="Arial" w:hAnsi="Arial" w:cs="Arial"/>
+                <w:sz w:val="22"/>
+                <w:szCs w:val="22"/>
+              </w:rPr>
+              <w:t>Implementar herencia</w:t>
+            </w:r>
+          </w:p>
+        </w:tc>
+        <w:tc>
+          <w:tcPr>
+            <w:tcW w:w="2338" w:type="dxa"/>
+          </w:tcPr>
+          <w:p>
+            <w:pPr>
+              <w:spacing w:line="480" w:lineRule="auto"/>
+              <w:rPr>
+                <w:rFonts w:ascii="Arial" w:hAnsi="Arial" w:cs="Arial"/>
+                <w:sz w:val="22"/>
+                <w:szCs w:val="22"/>
+              </w:rPr>
+            </w:pPr>
+            <w:proofErr w:type="spellStart"/>
+            <w:r>
+              <w:rPr>
+                <w:rFonts w:ascii="Arial" w:hAnsi="Arial" w:cs="Arial"/>
+                <w:sz w:val="22"/>
+                <w:szCs w:val="22"/>
+              </w:rPr>
+              <w:t>Backend</w:t>
+            </w:r>
+            <w:proofErr w:type="spellEnd"/>
+          </w:p>
+        </w:tc>
+        <w:tc>
+          <w:tcPr>
+            <w:tcW w:w="2338" w:type="dxa"/>
+          </w:tcPr>
+          <w:p>
+            <w:pPr>
+              <w:spacing w:line="480" w:lineRule="auto"/>
+              <w:rPr>
+                <w:rFonts w:ascii="Arial" w:hAnsi="Arial" w:cs="Arial"/>
+                <w:sz w:val="22"/>
+                <w:szCs w:val="22"/>
+              </w:rPr>
+            </w:pPr>
+            <w:r>
+              <w:rPr>
+                <w:rFonts w:ascii="Arial" w:hAnsi="Arial" w:cs="Arial"/>
+                <w:sz w:val="22"/>
+                <w:szCs w:val="22"/>
+              </w:rPr>
+              <w:t>Franklin Martin Fuentes Chávez</w:t>
+            </w:r>
+          </w:p>
+        </w:tc>
+        <w:tc>
+          <w:tcPr>
+            <w:tcW w:w="1634" w:type="dxa"/>
+          </w:tcPr>
+          <w:p>
+            <w:pPr>
+              <w:spacing w:line="480" w:lineRule="auto"/>
+              <w:rPr>
+                <w:rFonts w:ascii="Arial" w:hAnsi="Arial" w:cs="Arial"/>
+                <w:sz w:val="22"/>
+                <w:szCs w:val="22"/>
+              </w:rPr>
+            </w:pPr>
+            <w:r>
+              <w:rPr>
+                <w:rFonts w:ascii="Arial" w:hAnsi="Arial" w:cs="Arial"/>
+                <w:sz w:val="22"/>
+                <w:szCs w:val="22"/>
+              </w:rPr>
+              <w:t>13 sept</w:t>
+            </w:r>
+          </w:p>
+        </w:tc>
+      </w:tr>
+      <w:tr>
+        <w:trPr>
+          <w:trHeight w:val="300"/>
+        </w:trPr>
+        <w:tc>
+          <w:tcPr>
+            <w:tcW w:w="3050" w:type="dxa"/>
+          </w:tcPr>
+          <w:p>
+            <w:pPr>
+              <w:spacing w:line="480" w:lineRule="auto"/>
+              <w:rPr>
+                <w:rFonts w:ascii="Arial" w:hAnsi="Arial" w:cs="Arial"/>
+                <w:sz w:val="22"/>
+                <w:szCs w:val="22"/>
+              </w:rPr>
+            </w:pPr>
+            <w:r>
+              <w:rPr>
+                <w:rFonts w:ascii="Arial" w:hAnsi="Arial" w:cs="Arial"/>
+                <w:sz w:val="22"/>
+                <w:szCs w:val="22"/>
+              </w:rPr>
+              <w:t>Implementar polimorfismo</w:t>
+            </w:r>
+          </w:p>
+        </w:tc>
+        <w:tc>
+          <w:tcPr>
+            <w:tcW w:w="2338" w:type="dxa"/>
+          </w:tcPr>
+          <w:p>
+            <w:pPr>
+              <w:spacing w:line="480" w:lineRule="auto"/>
+              <w:rPr>
+                <w:rFonts w:ascii="Arial" w:hAnsi="Arial" w:cs="Arial"/>
+                <w:sz w:val="22"/>
+                <w:szCs w:val="22"/>
+              </w:rPr>
+            </w:pPr>
+            <w:proofErr w:type="spellStart"/>
+            <w:r>
+              <w:rPr>
+                <w:rFonts w:ascii="Arial" w:hAnsi="Arial" w:cs="Arial"/>
+                <w:sz w:val="22"/>
+                <w:szCs w:val="22"/>
+              </w:rPr>
+              <w:t>Backend</w:t>
+            </w:r>
+            <w:proofErr w:type="spellEnd"/>
+          </w:p>
+        </w:tc>
+        <w:tc>
+          <w:tcPr>
+            <w:tcW w:w="2338" w:type="dxa"/>
+          </w:tcPr>
+          <w:p>
+            <w:pPr>
+              <w:spacing w:line="480" w:lineRule="auto"/>
+              <w:rPr>
+                <w:rFonts w:ascii="Arial" w:hAnsi="Arial" w:cs="Arial"/>
+                <w:sz w:val="22"/>
+                <w:szCs w:val="22"/>
+              </w:rPr>
+            </w:pPr>
+            <w:r>
+              <w:rPr>
+                <w:rFonts w:ascii="Arial" w:hAnsi="Arial" w:cs="Arial"/>
+                <w:sz w:val="22"/>
+                <w:szCs w:val="22"/>
+              </w:rPr>
+              <w:t>Franklin Martin Fuentes Chávez</w:t>
+            </w:r>
+          </w:p>
+        </w:tc>
+        <w:tc>
+          <w:tcPr>
+            <w:tcW w:w="1634" w:type="dxa"/>
+          </w:tcPr>
+          <w:p>
+            <w:pPr>
+              <w:spacing w:line="480" w:lineRule="auto"/>
+              <w:rPr>
+                <w:rFonts w:ascii="Arial" w:hAnsi="Arial" w:cs="Arial"/>
+                <w:sz w:val="22"/>
+                <w:szCs w:val="22"/>
+              </w:rPr>
+            </w:pPr>
+            <w:r>
+              <w:rPr>
+                <w:rFonts w:ascii="Arial" w:hAnsi="Arial" w:cs="Arial"/>
+                <w:sz w:val="22"/>
+                <w:szCs w:val="22"/>
+              </w:rPr>
+              <w:t>13 sept</w:t>
+            </w:r>
+          </w:p>
+        </w:tc>
+      </w:tr>
+      <w:tr>
+        <w:trPr>
+          <w:trHeight w:val="300"/>
+        </w:trPr>
+        <w:tc>
+          <w:tcPr>
+            <w:tcW w:w="3050" w:type="dxa"/>
+          </w:tcPr>
+          <w:p>
+            <w:pPr>
+              <w:spacing w:line="480" w:lineRule="auto"/>
+              <w:rPr>
+                <w:rFonts w:ascii="Arial" w:hAnsi="Arial" w:cs="Arial"/>
+                <w:sz w:val="22"/>
+                <w:szCs w:val="22"/>
+              </w:rPr>
+            </w:pPr>
+            <w:r>
+              <w:rPr>
+                <w:rFonts w:ascii="Arial" w:hAnsi="Arial" w:cs="Arial"/>
+                <w:sz w:val="22"/>
+                <w:szCs w:val="22"/>
+              </w:rPr>
+              <w:t>Implementar clases abstractas</w:t>
+            </w:r>
+          </w:p>
+        </w:tc>
+        <w:tc>
+          <w:tcPr>
+            <w:tcW w:w="2338" w:type="dxa"/>
+          </w:tcPr>
+          <w:p>
+            <w:pPr>
+              <w:spacing w:line="480" w:lineRule="auto"/>
+              <w:rPr>
+                <w:rFonts w:ascii="Arial" w:hAnsi="Arial" w:cs="Arial"/>
+                <w:sz w:val="22"/>
+                <w:szCs w:val="22"/>
+              </w:rPr>
+            </w:pPr>
+            <w:proofErr w:type="spellStart"/>
+            <w:r>
+              <w:rPr>
+                <w:rFonts w:ascii="Arial" w:hAnsi="Arial" w:cs="Arial"/>
+                <w:sz w:val="22"/>
+                <w:szCs w:val="22"/>
+              </w:rPr>
+              <w:t>Backend</w:t>
+            </w:r>
+            <w:proofErr w:type="spellEnd"/>
+          </w:p>
+        </w:tc>
+        <w:tc>
+          <w:tcPr>
+            <w:tcW w:w="2338" w:type="dxa"/>
+          </w:tcPr>
+          <w:p>
+            <w:pPr>
+              <w:spacing w:line="480" w:lineRule="auto"/>
+              <w:rPr>
+                <w:rFonts w:ascii="Arial" w:hAnsi="Arial" w:cs="Arial"/>
+                <w:sz w:val="22"/>
+                <w:szCs w:val="22"/>
+              </w:rPr>
+            </w:pPr>
+            <w:r>
+              <w:rPr>
+                <w:rFonts w:ascii="Arial" w:hAnsi="Arial" w:cs="Arial"/>
+                <w:sz w:val="22"/>
+                <w:szCs w:val="22"/>
+              </w:rPr>
+              <w:t>Franklin Martin Fuentes Chávez</w:t>
+            </w:r>
+          </w:p>
+        </w:tc>
+        <w:tc>
+          <w:tcPr>
+            <w:tcW w:w="1634" w:type="dxa"/>
+          </w:tcPr>
+          <w:p>
+            <w:pPr>
+              <w:spacing w:line="480" w:lineRule="auto"/>
+              <w:rPr>
+                <w:rFonts w:ascii="Arial" w:hAnsi="Arial" w:cs="Arial"/>
+                <w:sz w:val="22"/>
+                <w:szCs w:val="22"/>
+              </w:rPr>
+            </w:pPr>
+            <w:r>
+              <w:rPr>
+                <w:rFonts w:ascii="Arial" w:hAnsi="Arial" w:cs="Arial"/>
+                <w:sz w:val="22"/>
+                <w:szCs w:val="22"/>
+              </w:rPr>
+              <w:t>13 sept</w:t>
+            </w:r>
+          </w:p>
+        </w:tc>
+      </w:tr>
+      <w:tr>
+        <w:trPr>
+          <w:trHeight w:val="300"/>
+        </w:trPr>
+        <w:tc>
+          <w:tcPr>
+            <w:tcW w:w="3050" w:type="dxa"/>
+          </w:tcPr>
+          <w:p>
+            <w:pPr>
+              <w:spacing w:line="480" w:lineRule="auto"/>
+              <w:rPr>
+                <w:rFonts w:ascii="Arial" w:hAnsi="Arial" w:cs="Arial"/>
+                <w:sz w:val="22"/>
+                <w:szCs w:val="22"/>
+              </w:rPr>
+            </w:pPr>
+            <w:r>
+              <w:rPr>
+                <w:rFonts w:ascii="Arial" w:hAnsi="Arial" w:cs="Arial"/>
+                <w:sz w:val="22"/>
+                <w:szCs w:val="22"/>
+              </w:rPr>
+              <w:t>Actualizar definición de clases del sistema</w:t>
+            </w:r>
+          </w:p>
+        </w:tc>
+        <w:tc>
+          <w:tcPr>
+            <w:tcW w:w="2338" w:type="dxa"/>
+          </w:tcPr>
+          <w:p>
+            <w:pPr>
+              <w:spacing w:line="480" w:lineRule="auto"/>
+              <w:rPr>
+                <w:rFonts w:ascii="Arial" w:hAnsi="Arial" w:cs="Arial"/>
+                <w:sz w:val="22"/>
+                <w:szCs w:val="22"/>
+              </w:rPr>
+            </w:pPr>
+            <w:proofErr w:type="spellStart"/>
+            <w:r>
+              <w:rPr>
+                <w:rFonts w:ascii="Arial" w:hAnsi="Arial" w:cs="Arial"/>
+                <w:sz w:val="22"/>
+                <w:szCs w:val="22"/>
+              </w:rPr>
+              <w:t>Architect</w:t>
+            </w:r>
+            <w:proofErr w:type="spellEnd"/>
+          </w:p>
+        </w:tc>
+        <w:tc>
+          <w:tcPr>
+            <w:tcW w:w="2338" w:type="dxa"/>
+          </w:tcPr>
+          <w:p>
+            <w:pPr>
+              <w:spacing w:line="480" w:lineRule="auto"/>
+              <w:rPr>
+                <w:rFonts w:ascii="Arial" w:hAnsi="Arial" w:cs="Arial"/>
+                <w:sz w:val="22"/>
+                <w:szCs w:val="22"/>
+              </w:rPr>
+            </w:pPr>
+            <w:r>
+              <w:rPr>
+                <w:rFonts w:ascii="Arial" w:hAnsi="Arial" w:cs="Arial"/>
+                <w:sz w:val="22"/>
+                <w:szCs w:val="22"/>
+              </w:rPr>
+              <w:t>Jesús Roberto Sánchez Orellana</w:t>
+            </w:r>
+          </w:p>
+        </w:tc>
+        <w:tc>
+          <w:tcPr>
+            <w:tcW w:w="1634" w:type="dxa"/>
+          </w:tcPr>
+          <w:p>
+            <w:pPr>
+              <w:spacing w:line="480" w:lineRule="auto"/>
+              <w:rPr>
+                <w:rFonts w:ascii="Arial" w:hAnsi="Arial" w:cs="Arial"/>
+                <w:sz w:val="22"/>
+                <w:szCs w:val="22"/>
+              </w:rPr>
+            </w:pPr>
+            <w:r>
+              <w:rPr>
+                <w:rFonts w:ascii="Arial" w:hAnsi="Arial" w:cs="Arial"/>
+                <w:sz w:val="22"/>
+                <w:szCs w:val="22"/>
+              </w:rPr>
+              <w:t>13 sept</w:t>
+            </w:r>
+          </w:p>
+        </w:tc>
+      </w:tr>
+      <w:tr>
+        <w:trPr>
+          <w:trHeight w:val="300"/>
+        </w:trPr>
+        <w:tc>
+          <w:tcPr>
+            <w:tcW w:w="3050" w:type="dxa"/>
+          </w:tcPr>
+          <w:p>
+            <w:pPr>
+              <w:spacing w:line="480" w:lineRule="auto"/>
+              <w:rPr>
+                <w:rFonts w:ascii="Arial" w:hAnsi="Arial" w:cs="Arial"/>
+                <w:sz w:val="22"/>
+                <w:szCs w:val="22"/>
+              </w:rPr>
+            </w:pPr>
+            <w:r>
+              <w:rPr>
+                <w:rFonts w:ascii="Arial" w:hAnsi="Arial" w:cs="Arial"/>
+                <w:sz w:val="22"/>
+                <w:szCs w:val="22"/>
+              </w:rPr>
+              <w:t>Diseñar e implementar arquitectura por capas (UI, Controller, Service, DAO, DTO)</w:t>
+            </w:r>
+          </w:p>
+        </w:tc>
+        <w:tc>
+          <w:tcPr>
+            <w:tcW w:w="2338" w:type="dxa"/>
+          </w:tcPr>
+          <w:p>
+            <w:pPr>
+              <w:spacing w:line="480" w:lineRule="auto"/>
+              <w:rPr>
+                <w:rFonts w:ascii="Arial" w:hAnsi="Arial" w:cs="Arial"/>
+                <w:sz w:val="22"/>
+                <w:szCs w:val="22"/>
+              </w:rPr>
+            </w:pPr>
+            <w:proofErr w:type="spellStart"/>
+            <w:r>
+              <w:rPr>
+                <w:rFonts w:ascii="Arial" w:hAnsi="Arial" w:cs="Arial"/>
+                <w:sz w:val="22"/>
+                <w:szCs w:val="22"/>
+              </w:rPr>
+              <w:t>Architect</w:t>
+            </w:r>
+            <w:proofErr w:type="spellEnd"/>
+          </w:p>
+        </w:tc>
+        <w:tc>
+          <w:tcPr>
+            <w:tcW w:w="2338" w:type="dxa"/>
+          </w:tcPr>
+          <w:p>
+            <w:pPr>
+              <w:spacing w:line="480" w:lineRule="auto"/>
+              <w:rPr>
+                <w:rFonts w:ascii="Arial" w:hAnsi="Arial" w:cs="Arial"/>
+                <w:sz w:val="22"/>
+                <w:szCs w:val="22"/>
+              </w:rPr>
+            </w:pPr>
+            <w:r>
+              <w:rPr>
+                <w:rFonts w:ascii="Arial" w:hAnsi="Arial" w:cs="Arial"/>
+                <w:sz w:val="22"/>
+                <w:szCs w:val="22"/>
+              </w:rPr>
+              <w:t>Jesús Roberto Sánchez Orellana</w:t>
+            </w:r>
+          </w:p>
+        </w:tc>
+        <w:tc>
+          <w:tcPr>
+            <w:tcW w:w="1634" w:type="dxa"/>
+          </w:tcPr>
+          <w:p>
+            <w:pPr>
+              <w:spacing w:line="480" w:lineRule="auto"/>
+              <w:rPr>
+                <w:rFonts w:ascii="Arial" w:hAnsi="Arial" w:cs="Arial"/>
+                <w:sz w:val="22"/>
+                <w:szCs w:val="22"/>
+              </w:rPr>
+            </w:pPr>
+            <w:r>
+              <w:rPr>
+                <w:rFonts w:ascii="Arial" w:hAnsi="Arial" w:cs="Arial"/>
+                <w:sz w:val="22"/>
+                <w:szCs w:val="22"/>
+              </w:rPr>
+              <w:t>13 sept</w:t>
+            </w:r>
+          </w:p>
+        </w:tc>
+      </w:tr>
+      <w:tr>
+        <w:trPr>
+          <w:trHeight w:val="300"/>
+        </w:trPr>
+        <w:tc>
+          <w:tcPr>
+            <w:tcW w:w="3050" w:type="dxa"/>
+          </w:tcPr>
+          <w:p>
+            <w:pPr>
+              <w:spacing w:line="480" w:lineRule="auto"/>
+              <w:rPr>
+                <w:rFonts w:ascii="Arial" w:hAnsi="Arial" w:cs="Arial"/>
+                <w:sz w:val="22"/>
+                <w:szCs w:val="22"/>
+              </w:rPr>
+            </w:pPr>
+            <w:r>
+              <w:rPr>
+                <w:rFonts w:ascii="Arial" w:hAnsi="Arial" w:cs="Arial"/>
+                <w:sz w:val="22"/>
+                <w:szCs w:val="22"/>
+              </w:rPr>
+              <w:t>Justificar el uso de colecciones en el documento</w:t>
+            </w:r>
+          </w:p>
+        </w:tc>
+        <w:tc>
+          <w:tcPr>
+            <w:tcW w:w="2338" w:type="dxa"/>
+          </w:tcPr>
+          <w:p>
+            <w:pPr>
+              <w:spacing w:line="480" w:lineRule="auto"/>
+              <w:rPr>
+                <w:rFonts w:ascii="Arial" w:hAnsi="Arial" w:cs="Arial"/>
+                <w:sz w:val="22"/>
+                <w:szCs w:val="22"/>
+              </w:rPr>
+            </w:pPr>
+          </w:p>
+        </w:tc>
+        <w:tc>
+          <w:tcPr>
+            <w:tcW w:w="2338" w:type="dxa"/>
+          </w:tcPr>
+          <w:p>
+            <w:pPr>
+              <w:spacing w:line="480" w:lineRule="auto"/>
+              <w:rPr>
+                <w:rFonts w:ascii="Arial" w:hAnsi="Arial" w:cs="Arial"/>
+                <w:sz w:val="22"/>
+                <w:szCs w:val="22"/>
+              </w:rPr>
+            </w:pPr>
+          </w:p>
+        </w:tc>
+        <w:tc>
+          <w:tcPr>
+            <w:tcW w:w="1634" w:type="dxa"/>
+          </w:tcPr>
+          <w:p>
+            <w:pPr>
+              <w:spacing w:line="480" w:lineRule="auto"/>
+              <w:rPr>
+                <w:rFonts w:ascii="Arial" w:hAnsi="Arial" w:cs="Arial"/>
+                <w:sz w:val="22"/>
+                <w:szCs w:val="22"/>
+              </w:rPr>
+            </w:pPr>
+          </w:p>
+        </w:tc>
+      </w:tr>
+      <w:tr>
+        <w:trPr>
+          <w:trHeight w:val="300"/>
+        </w:trPr>
+        <w:tc>
+          <w:tcPr>
+            <w:tcW w:w="3050" w:type="dxa"/>
+          </w:tcPr>
+          <w:p>
+            <w:pPr>
+              <w:spacing w:line="480" w:lineRule="auto"/>
+              <w:rPr>
+                <w:rFonts w:ascii="Arial" w:hAnsi="Arial" w:cs="Arial"/>
+                <w:sz w:val="22"/>
+                <w:szCs w:val="22"/>
+              </w:rPr>
+            </w:pPr>
+            <w:r>
+              <w:rPr>
+                <w:rFonts w:ascii="Arial" w:hAnsi="Arial" w:cs="Arial"/>
+                <w:sz w:val="22"/>
+                <w:szCs w:val="22"/>
+              </w:rPr>
+              <w:t>Redactar objetivo del Avance 2 en el documento</w:t>
+            </w:r>
+          </w:p>
+        </w:tc>
+        <w:tc>
+          <w:tcPr>
+            <w:tcW w:w="2338" w:type="dxa"/>
+          </w:tcPr>
+          <w:p>
+            <w:pPr>
+              <w:spacing w:line="480" w:lineRule="auto"/>
+              <w:rPr>
+                <w:rFonts w:ascii="Arial" w:hAnsi="Arial" w:cs="Arial"/>
+                <w:sz w:val="22"/>
+                <w:szCs w:val="22"/>
+              </w:rPr>
+            </w:pPr>
+            <w:proofErr w:type="spellStart"/>
+            <w:r>
+              <w:rPr>
+                <w:rFonts w:ascii="Arial" w:hAnsi="Arial" w:cs="Arial"/>
+                <w:sz w:val="22"/>
+                <w:szCs w:val="22"/>
+              </w:rPr>
+              <w:t>Product</w:t>
+            </w:r>
+            <w:proofErr w:type="spellEnd"/>
+            <w:r>
+              <w:rPr>
+                <w:rFonts w:ascii="Arial" w:hAnsi="Arial" w:cs="Arial"/>
+                <w:sz w:val="22"/>
+                <w:szCs w:val="22"/>
+              </w:rPr>
+              <w:t xml:space="preserve"> Owner</w:t>
+            </w:r>
+          </w:p>
+        </w:tc>
+        <w:tc>
+          <w:tcPr>
+            <w:tcW w:w="2338" w:type="dxa"/>
+          </w:tcPr>
+          <w:p>
+            <w:pPr>
+              <w:spacing w:line="480" w:lineRule="auto"/>
+              <w:rPr>
+                <w:rFonts w:ascii="Arial" w:hAnsi="Arial" w:cs="Arial"/>
+                <w:sz w:val="22"/>
+                <w:szCs w:val="22"/>
+              </w:rPr>
+            </w:pPr>
+            <w:r>
+              <w:rPr>
+                <w:rFonts w:ascii="Arial" w:hAnsi="Arial" w:cs="Arial"/>
+                <w:sz w:val="22"/>
+                <w:szCs w:val="22"/>
+              </w:rPr>
+              <w:t>Jireh Alexander Trigueros Pérez</w:t>
+            </w:r>
+          </w:p>
+        </w:tc>
+        <w:tc>
+          <w:tcPr>
+            <w:tcW w:w="1634" w:type="dxa"/>
+          </w:tcPr>
+          <w:p>
+            <w:pPr>
+              <w:spacing w:line="480" w:lineRule="auto"/>
+              <w:rPr>
+                <w:rFonts w:ascii="Arial" w:hAnsi="Arial" w:cs="Arial"/>
+                <w:sz w:val="22"/>
+                <w:szCs w:val="22"/>
+              </w:rPr>
+            </w:pPr>
+            <w:r>
+              <w:rPr>
+                <w:rFonts w:ascii="Arial" w:hAnsi="Arial" w:cs="Arial"/>
+                <w:sz w:val="22"/>
+                <w:szCs w:val="22"/>
+              </w:rPr>
+              <w:t>20 sept</w:t>
+            </w:r>
+          </w:p>
+        </w:tc>
+      </w:tr>
+      <w:tr>
+        <w:trPr>
+          <w:trHeight w:val="300"/>
+        </w:trPr>
+        <w:tc>
+          <w:tcPr>
+            <w:tcW w:w="3050" w:type="dxa"/>
+          </w:tcPr>
+          <w:p>
+            <w:pPr>
+              <w:spacing w:line="480" w:lineRule="auto"/>
+              <w:rPr>
+                <w:rFonts w:ascii="Arial" w:hAnsi="Arial" w:cs="Arial"/>
+                <w:sz w:val="22"/>
+                <w:szCs w:val="22"/>
+              </w:rPr>
+            </w:pPr>
+            <w:r>
+              <w:rPr>
+                <w:rFonts w:ascii="Arial" w:hAnsi="Arial" w:cs="Arial"/>
+                <w:sz w:val="22"/>
+                <w:szCs w:val="22"/>
+              </w:rPr>
+              <w:t>Actualizar y consolidar documento del avance</w:t>
+            </w:r>
+          </w:p>
+        </w:tc>
+        <w:tc>
+          <w:tcPr>
+            <w:tcW w:w="2338" w:type="dxa"/>
+          </w:tcPr>
+          <w:p>
+            <w:pPr>
+              <w:spacing w:line="480" w:lineRule="auto"/>
+              <w:rPr>
+                <w:rFonts w:ascii="Arial" w:hAnsi="Arial" w:cs="Arial"/>
+                <w:sz w:val="22"/>
+                <w:szCs w:val="22"/>
+              </w:rPr>
+            </w:pPr>
+            <w:r>
+              <w:rPr>
+                <w:rFonts w:ascii="Arial" w:hAnsi="Arial" w:cs="Arial"/>
+                <w:sz w:val="22"/>
+                <w:szCs w:val="22"/>
+              </w:rPr>
+              <w:t xml:space="preserve">Scrum </w:t>
+            </w:r>
+            <w:proofErr w:type="gramStart"/>
+            <w:r>
+              <w:rPr>
+                <w:rFonts w:ascii="Arial" w:hAnsi="Arial" w:cs="Arial"/>
+                <w:sz w:val="22"/>
+                <w:szCs w:val="22"/>
+              </w:rPr>
+              <w:t>Master</w:t>
+            </w:r>
+            <w:proofErr w:type="gramEnd"/>
+          </w:p>
+        </w:tc>
+        <w:tc>
+          <w:tcPr>
+            <w:tcW w:w="2338" w:type="dxa"/>
+          </w:tcPr>
+          <w:p>
+            <w:pPr>
+              <w:spacing w:line="480" w:lineRule="auto"/>
+              <w:rPr>
+                <w:rFonts w:ascii="Arial" w:hAnsi="Arial" w:cs="Arial"/>
+                <w:sz w:val="22"/>
+                <w:szCs w:val="22"/>
+              </w:rPr>
+            </w:pPr>
+            <w:r>
+              <w:rPr>
+                <w:rFonts w:ascii="Arial" w:hAnsi="Arial" w:cs="Arial"/>
+                <w:sz w:val="22"/>
+                <w:szCs w:val="22"/>
+              </w:rPr>
+              <w:t>Carla Vanesa Franco Avelar</w:t>
+            </w:r>
+          </w:p>
+        </w:tc>
+        <w:tc>
+          <w:tcPr>
+            <w:tcW w:w="1634" w:type="dxa"/>
+          </w:tcPr>
+          <w:p>
+            <w:pPr>
+              <w:spacing w:line="480" w:lineRule="auto"/>
+              <w:rPr>
+                <w:rFonts w:ascii="Arial" w:hAnsi="Arial" w:cs="Arial"/>
+                <w:sz w:val="22"/>
+                <w:szCs w:val="22"/>
+              </w:rPr>
+            </w:pPr>
+            <w:r>
+              <w:rPr>
+                <w:rFonts w:ascii="Arial" w:hAnsi="Arial" w:cs="Arial"/>
+                <w:sz w:val="22"/>
+                <w:szCs w:val="22"/>
+              </w:rPr>
+              <w:t>27 sept</w:t>
+            </w:r>
+          </w:p>
+        </w:tc>
+      </w:tr>
+      <w:tr>
+        <w:trPr>
+          <w:trHeight w:val="300"/>
+        </w:trPr>
+        <w:tc>
+          <w:tcPr>
+            <w:tcW w:w="3050" w:type="dxa"/>
+          </w:tcPr>
+          <w:p>
+            <w:pPr>
+              <w:spacing w:line="480" w:lineRule="auto"/>
+              <w:rPr>
+                <w:rFonts w:ascii="Arial" w:hAnsi="Arial" w:cs="Arial"/>
+                <w:sz w:val="22"/>
+                <w:szCs w:val="22"/>
+              </w:rPr>
+            </w:pPr>
+            <w:r>
+              <w:rPr>
+                <w:rFonts w:ascii="Arial" w:hAnsi="Arial" w:cs="Arial"/>
+                <w:sz w:val="22"/>
+                <w:szCs w:val="22"/>
+              </w:rPr>
+              <w:t>Probar flujo completo de reservas y validar código</w:t>
+            </w:r>
+          </w:p>
+        </w:tc>
+        <w:tc>
+          <w:tcPr>
+            <w:tcW w:w="2338" w:type="dxa"/>
+          </w:tcPr>
+          <w:p>
+            <w:pPr>
+              <w:spacing w:line="480" w:lineRule="auto"/>
+              <w:rPr>
+                <w:rFonts w:ascii="Arial" w:hAnsi="Arial" w:cs="Arial"/>
+                <w:sz w:val="22"/>
+                <w:szCs w:val="22"/>
+              </w:rPr>
+            </w:pPr>
+            <w:r>
+              <w:rPr>
+                <w:rFonts w:ascii="Arial" w:hAnsi="Arial" w:cs="Arial"/>
+                <w:sz w:val="22"/>
+                <w:szCs w:val="22"/>
+              </w:rPr>
+              <w:t>QA</w:t>
+            </w:r>
+          </w:p>
+        </w:tc>
+        <w:tc>
+          <w:tcPr>
+            <w:tcW w:w="2338" w:type="dxa"/>
+          </w:tcPr>
+          <w:p>
+            <w:pPr>
+              <w:spacing w:line="480" w:lineRule="auto"/>
+              <w:rPr>
+                <w:rFonts w:ascii="Arial" w:hAnsi="Arial" w:cs="Arial"/>
+                <w:sz w:val="22"/>
+                <w:szCs w:val="22"/>
+              </w:rPr>
+            </w:pPr>
+            <w:r>
+              <w:rPr>
+                <w:rFonts w:ascii="Arial" w:hAnsi="Arial" w:cs="Arial"/>
+                <w:sz w:val="22"/>
+                <w:szCs w:val="22"/>
+              </w:rPr>
+              <w:t>Gabriel Alejandro Fuentes Chavarría, Emerson Eduardo Candido Joya</w:t>
+            </w:r>
+          </w:p>
+        </w:tc>
+        <w:tc>
+          <w:tcPr>
+            <w:tcW w:w="1634" w:type="dxa"/>
+          </w:tcPr>
+          <w:p>
+            <w:pPr>
+              <w:spacing w:line="480" w:lineRule="auto"/>
+              <w:rPr>
+                <w:rFonts w:ascii="Arial" w:hAnsi="Arial" w:cs="Arial"/>
+                <w:sz w:val="22"/>
+                <w:szCs w:val="22"/>
+              </w:rPr>
+            </w:pPr>
+            <w:r>
+              <w:rPr>
+                <w:rFonts w:ascii="Arial" w:hAnsi="Arial" w:cs="Arial"/>
+                <w:sz w:val="22"/>
+                <w:szCs w:val="22"/>
+              </w:rPr>
+              <w:t>20 sept</w:t>
+            </w:r>
+          </w:p>
+        </w:tc>
+      </w:tr>
+      <w:tr>
+        <w:trPr>
+          <w:trHeight w:val="300"/>
+        </w:trPr>
+        <w:tc>
+          <w:tcPr>
+            <w:tcW w:w="3050" w:type="dxa"/>
+          </w:tcPr>
+          <w:p>
+            <w:pPr>
+              <w:spacing w:line="480" w:lineRule="auto"/>
+              <w:rPr>
+                <w:rFonts w:ascii="Arial" w:hAnsi="Arial" w:cs="Arial"/>
+                <w:sz w:val="22"/>
+                <w:szCs w:val="22"/>
+              </w:rPr>
+            </w:pPr>
+            <w:r>
+              <w:rPr>
+                <w:rFonts w:ascii="Arial" w:hAnsi="Arial" w:cs="Arial"/>
+                <w:sz w:val="22"/>
+                <w:szCs w:val="22"/>
+              </w:rPr>
+              <w:lastRenderedPageBreak/>
+              <w:t xml:space="preserve">Revisar </w:t>
+            </w:r>
+            <w:proofErr w:type="spellStart"/>
+            <w:r>
+              <w:rPr>
+                <w:rFonts w:ascii="Arial" w:hAnsi="Arial" w:cs="Arial"/>
+                <w:sz w:val="22"/>
+                <w:szCs w:val="22"/>
+              </w:rPr>
+              <w:t>pull</w:t>
+            </w:r>
+            <w:proofErr w:type="spellEnd"/>
+            <w:r>
+              <w:rPr>
+                <w:rFonts w:ascii="Arial" w:hAnsi="Arial" w:cs="Arial"/>
+                <w:sz w:val="22"/>
+                <w:szCs w:val="22"/>
+              </w:rPr>
+              <w:t xml:space="preserve"> </w:t>
+            </w:r>
+            <w:proofErr w:type="spellStart"/>
+            <w:r>
+              <w:rPr>
+                <w:rFonts w:ascii="Arial" w:hAnsi="Arial" w:cs="Arial"/>
+                <w:sz w:val="22"/>
+                <w:szCs w:val="22"/>
+              </w:rPr>
+              <w:t>requests</w:t>
+            </w:r>
+            <w:proofErr w:type="spellEnd"/>
+            <w:r>
+              <w:rPr>
+                <w:rFonts w:ascii="Arial" w:hAnsi="Arial" w:cs="Arial"/>
+                <w:sz w:val="22"/>
+                <w:szCs w:val="22"/>
+              </w:rPr>
+              <w:t xml:space="preserve"> antes de integrarlos</w:t>
+            </w:r>
+          </w:p>
+        </w:tc>
+        <w:tc>
+          <w:tcPr>
+            <w:tcW w:w="2338" w:type="dxa"/>
+          </w:tcPr>
+          <w:p>
+            <w:pPr>
+              <w:spacing w:line="480" w:lineRule="auto"/>
+              <w:rPr>
+                <w:rFonts w:ascii="Arial" w:hAnsi="Arial" w:cs="Arial"/>
+                <w:sz w:val="22"/>
+                <w:szCs w:val="22"/>
+              </w:rPr>
+            </w:pPr>
+            <w:r>
+              <w:rPr>
+                <w:rFonts w:ascii="Arial" w:hAnsi="Arial" w:cs="Arial"/>
+                <w:sz w:val="22"/>
+                <w:szCs w:val="22"/>
+              </w:rPr>
+              <w:t>QA</w:t>
+            </w:r>
+          </w:p>
+        </w:tc>
+        <w:tc>
+          <w:tcPr>
+            <w:tcW w:w="2338" w:type="dxa"/>
+          </w:tcPr>
+          <w:p>
+            <w:pPr>
+              <w:spacing w:line="480" w:lineRule="auto"/>
+              <w:rPr>
+                <w:rFonts w:ascii="Arial" w:hAnsi="Arial" w:cs="Arial"/>
+                <w:sz w:val="22"/>
+                <w:szCs w:val="22"/>
+              </w:rPr>
+            </w:pPr>
+            <w:r>
+              <w:rPr>
+                <w:rFonts w:ascii="Arial" w:hAnsi="Arial" w:cs="Arial"/>
+                <w:sz w:val="22"/>
+                <w:szCs w:val="22"/>
+              </w:rPr>
+              <w:t>Gabriel Alejandro Fuentes Chavarría</w:t>
+            </w:r>
+          </w:p>
+        </w:tc>
+        <w:tc>
+          <w:tcPr>
+            <w:tcW w:w="1634" w:type="dxa"/>
+          </w:tcPr>
+          <w:p>
+            <w:pPr>
+              <w:spacing w:line="480" w:lineRule="auto"/>
+              <w:rPr>
+                <w:rFonts w:ascii="Arial" w:hAnsi="Arial" w:cs="Arial"/>
+                <w:sz w:val="22"/>
+                <w:szCs w:val="22"/>
+              </w:rPr>
+            </w:pPr>
+            <w:r>
+              <w:rPr>
+                <w:rFonts w:ascii="Arial" w:hAnsi="Arial" w:cs="Arial"/>
+                <w:sz w:val="22"/>
+                <w:szCs w:val="22"/>
+              </w:rPr>
+              <w:t>27 sept</w:t>
+            </w:r>
+          </w:p>
+        </w:tc>
+      </w:tr>
+      <w:tr>
+        <w:trPr>
+          <w:trHeight w:val="300"/>
+        </w:trPr>
+        <w:tc>
+          <w:tcPr>
+            <w:tcW w:w="3050" w:type="dxa"/>
+          </w:tcPr>
+          <w:p>
+            <w:pPr>
+              <w:spacing w:line="480" w:lineRule="auto"/>
+              <w:rPr>
+                <w:rFonts w:ascii="Arial" w:hAnsi="Arial" w:cs="Arial"/>
+                <w:sz w:val="22"/>
+                <w:szCs w:val="22"/>
+              </w:rPr>
+            </w:pPr>
+            <w:r>
+              <w:rPr>
+                <w:rFonts w:ascii="Arial" w:hAnsi="Arial" w:cs="Arial"/>
+                <w:sz w:val="22"/>
+                <w:szCs w:val="22"/>
+              </w:rPr>
+              <w:t>Integrar (</w:t>
+            </w:r>
+            <w:proofErr w:type="spellStart"/>
+            <w:r>
+              <w:rPr>
+                <w:rFonts w:ascii="Arial" w:hAnsi="Arial" w:cs="Arial"/>
+                <w:sz w:val="22"/>
+                <w:szCs w:val="22"/>
+              </w:rPr>
+              <w:t>merge</w:t>
+            </w:r>
+            <w:proofErr w:type="spellEnd"/>
+            <w:r>
+              <w:rPr>
+                <w:rFonts w:ascii="Arial" w:hAnsi="Arial" w:cs="Arial"/>
+                <w:sz w:val="22"/>
+                <w:szCs w:val="22"/>
+              </w:rPr>
+              <w:t>) las ramas del equipo</w:t>
+            </w:r>
+          </w:p>
+        </w:tc>
+        <w:tc>
+          <w:tcPr>
+            <w:tcW w:w="2338" w:type="dxa"/>
+          </w:tcPr>
+          <w:p>
+            <w:pPr>
+              <w:spacing w:line="480" w:lineRule="auto"/>
+              <w:rPr>
+                <w:rFonts w:ascii="Arial" w:hAnsi="Arial" w:cs="Arial"/>
+                <w:sz w:val="22"/>
+                <w:szCs w:val="22"/>
+              </w:rPr>
+            </w:pPr>
+            <w:proofErr w:type="spellStart"/>
+            <w:r>
+              <w:rPr>
+                <w:rFonts w:ascii="Arial" w:hAnsi="Arial" w:cs="Arial"/>
+                <w:sz w:val="22"/>
+                <w:szCs w:val="22"/>
+              </w:rPr>
+              <w:t>Backend</w:t>
+            </w:r>
+            <w:proofErr w:type="spellEnd"/>
+          </w:p>
+        </w:tc>
+        <w:tc>
+          <w:tcPr>
+            <w:tcW w:w="2338" w:type="dxa"/>
+          </w:tcPr>
+          <w:p>
+            <w:pPr>
+              <w:spacing w:line="480" w:lineRule="auto"/>
+              <w:rPr>
+                <w:rFonts w:ascii="Arial" w:hAnsi="Arial" w:cs="Arial"/>
+                <w:sz w:val="22"/>
+                <w:szCs w:val="22"/>
+              </w:rPr>
+            </w:pPr>
+            <w:r>
+              <w:rPr>
+                <w:rFonts w:ascii="Arial" w:hAnsi="Arial" w:cs="Arial"/>
+                <w:sz w:val="22"/>
+                <w:szCs w:val="22"/>
+              </w:rPr>
+              <w:t>Franklin Martin Fuentes Chávez</w:t>
+            </w:r>
+          </w:p>
+        </w:tc>
+        <w:tc>
+          <w:tcPr>
+            <w:tcW w:w="1634" w:type="dxa"/>
+          </w:tcPr>
+          <w:p>
+            <w:pPr>
+              <w:spacing w:line="480" w:lineRule="auto"/>
+              <w:rPr>
+                <w:rFonts w:ascii="Arial" w:hAnsi="Arial" w:cs="Arial"/>
+                <w:sz w:val="22"/>
+                <w:szCs w:val="22"/>
+              </w:rPr>
+            </w:pPr>
+            <w:r>
+              <w:rPr>
+                <w:rFonts w:ascii="Arial" w:hAnsi="Arial" w:cs="Arial"/>
+                <w:sz w:val="22"/>
+                <w:szCs w:val="22"/>
+              </w:rPr>
+              <w:t>27 sept</w:t>
+            </w:r>
+          </w:p>
+        </w:tc>
+      </w:tr>
+      <w:tr>
+        <w:trPr>
+          <w:trHeight w:val="300"/>
+        </w:trPr>
+        <w:tc>
+          <w:tcPr>
+            <w:tcW w:w="3050" w:type="dxa"/>
+          </w:tcPr>
+          <w:p>
+            <w:pPr>
+              <w:spacing w:line="480" w:lineRule="auto"/>
+              <w:rPr>
+                <w:rFonts w:ascii="Arial" w:hAnsi="Arial" w:cs="Arial"/>
+                <w:sz w:val="22"/>
+                <w:szCs w:val="22"/>
+              </w:rPr>
+            </w:pPr>
+            <w:r>
+              <w:rPr>
+                <w:rFonts w:ascii="Arial" w:hAnsi="Arial" w:cs="Arial"/>
+                <w:sz w:val="22"/>
+                <w:szCs w:val="22"/>
+              </w:rPr>
+              <w:t>Grabar video explicativo del proyecto (participación de todo el equipo)</w:t>
+            </w:r>
+          </w:p>
+        </w:tc>
+        <w:tc>
+          <w:tcPr>
+            <w:tcW w:w="2338" w:type="dxa"/>
+          </w:tcPr>
+          <w:p>
+            <w:pPr>
+              <w:spacing w:line="480" w:lineRule="auto"/>
+              <w:rPr>
+                <w:rFonts w:ascii="Arial" w:hAnsi="Arial" w:cs="Arial"/>
+                <w:sz w:val="22"/>
+                <w:szCs w:val="22"/>
+              </w:rPr>
+            </w:pPr>
+            <w:r>
+              <w:rPr>
+                <w:rFonts w:ascii="Arial" w:hAnsi="Arial" w:cs="Arial"/>
+                <w:sz w:val="22"/>
+                <w:szCs w:val="22"/>
+              </w:rPr>
+              <w:t>Todos</w:t>
+            </w:r>
+          </w:p>
+        </w:tc>
+        <w:tc>
+          <w:tcPr>
+            <w:tcW w:w="2338" w:type="dxa"/>
+          </w:tcPr>
+          <w:p>
+            <w:pPr>
+              <w:spacing w:line="480" w:lineRule="auto"/>
+              <w:rPr>
+                <w:rFonts w:ascii="Arial" w:hAnsi="Arial" w:cs="Arial"/>
+                <w:sz w:val="22"/>
+                <w:szCs w:val="22"/>
+              </w:rPr>
+            </w:pPr>
+            <w:r>
+              <w:rPr>
+                <w:rFonts w:ascii="Arial" w:hAnsi="Arial" w:cs="Arial"/>
+                <w:sz w:val="22"/>
+                <w:szCs w:val="22"/>
+              </w:rPr>
+              <w:t>Todos los integrantes</w:t>
+            </w:r>
+          </w:p>
+        </w:tc>
+        <w:tc>
+          <w:tcPr>
+            <w:tcW w:w="1634" w:type="dxa"/>
+          </w:tcPr>
+          <w:p>
+            <w:pPr>
+              <w:spacing w:line="480" w:lineRule="auto"/>
+              <w:rPr>
+                <w:rFonts w:ascii="Arial" w:hAnsi="Arial" w:cs="Arial"/>
+                <w:sz w:val="22"/>
+                <w:szCs w:val="22"/>
+              </w:rPr>
+            </w:pPr>
+            <w:r>
+              <w:rPr>
+                <w:rFonts w:ascii="Arial" w:hAnsi="Arial" w:cs="Arial"/>
+                <w:sz w:val="22"/>
+                <w:szCs w:val="22"/>
+              </w:rPr>
+              <w:t>27 sept</w:t>
+            </w:r>
+          </w:p>
+        </w:tc>
+      </w:tr>
+      <w:tr>
+        <w:trPr>
+          <w:trHeight w:val="300"/>
+        </w:trPr>
+        <w:tc>
+          <w:tcPr>
+            <w:tcW w:w="3050" w:type="dxa"/>
+          </w:tcPr>
+          <w:p>
+            <w:pPr>
+              <w:spacing w:line="480" w:lineRule="auto"/>
+              <w:rPr>
+                <w:rFonts w:ascii="Arial" w:hAnsi="Arial" w:cs="Arial"/>
+                <w:sz w:val="22"/>
+                <w:szCs w:val="22"/>
+              </w:rPr>
+            </w:pPr>
+            <w:r>
+              <w:rPr>
+                <w:rFonts w:ascii="Arial" w:hAnsi="Arial" w:cs="Arial"/>
+                <w:sz w:val="22"/>
+                <w:szCs w:val="22"/>
+              </w:rPr>
+              <w:t>Editar y subir el video a YouTube</w:t>
+            </w:r>
+          </w:p>
+        </w:tc>
+        <w:tc>
+          <w:tcPr>
+            <w:tcW w:w="2338" w:type="dxa"/>
+          </w:tcPr>
+          <w:p>
+            <w:pPr>
+              <w:spacing w:line="480" w:lineRule="auto"/>
+              <w:rPr>
+                <w:rFonts w:ascii="Arial" w:hAnsi="Arial" w:cs="Arial"/>
+                <w:sz w:val="22"/>
+                <w:szCs w:val="22"/>
+              </w:rPr>
+            </w:pPr>
+            <w:r>
+              <w:rPr>
+                <w:rFonts w:ascii="Arial" w:hAnsi="Arial" w:cs="Arial"/>
+                <w:sz w:val="22"/>
+                <w:szCs w:val="22"/>
+              </w:rPr>
+              <w:t>Base de datos</w:t>
+            </w:r>
+          </w:p>
+        </w:tc>
+        <w:tc>
+          <w:tcPr>
+            <w:tcW w:w="2338" w:type="dxa"/>
+          </w:tcPr>
+          <w:p>
+            <w:pPr>
+              <w:spacing w:line="480" w:lineRule="auto"/>
+              <w:rPr>
+                <w:rFonts w:ascii="Arial" w:hAnsi="Arial" w:cs="Arial"/>
+                <w:sz w:val="22"/>
+                <w:szCs w:val="22"/>
+              </w:rPr>
+            </w:pPr>
+            <w:r>
+              <w:rPr>
+                <w:rFonts w:ascii="Arial" w:hAnsi="Arial" w:cs="Arial"/>
+                <w:sz w:val="22"/>
+                <w:szCs w:val="22"/>
+              </w:rPr>
+              <w:t>Salvador Ernesto Rodríguez Galdamez</w:t>
+            </w:r>
+          </w:p>
+        </w:tc>
+        <w:tc>
+          <w:tcPr>
+            <w:tcW w:w="1634" w:type="dxa"/>
+          </w:tcPr>
+          <w:p>
+            <w:pPr>
+              <w:spacing w:line="480" w:lineRule="auto"/>
+              <w:rPr>
+                <w:rFonts w:ascii="Arial" w:hAnsi="Arial" w:cs="Arial"/>
+                <w:sz w:val="22"/>
+                <w:szCs w:val="22"/>
+              </w:rPr>
+            </w:pPr>
+            <w:r>
+              <w:rPr>
+                <w:rFonts w:ascii="Arial" w:hAnsi="Arial" w:cs="Arial"/>
+                <w:sz w:val="22"/>
+                <w:szCs w:val="22"/>
+              </w:rPr>
+              <w:t>25 sept</w:t>
+            </w:r>
+          </w:p>
+        </w:tc>
+      </w:tr>
+      <w:tr>
+        <w:trPr>
+          <w:trHeight w:val="300"/>
+        </w:trPr>
+        <w:tc>
+          <w:tcPr>
+            <w:tcW w:w="3050" w:type="dxa"/>
+          </w:tcPr>
+          <w:p>
+            <w:pPr>
+              <w:spacing w:line="480" w:lineRule="auto"/>
+              <w:rPr>
+                <w:rFonts w:ascii="Arial" w:hAnsi="Arial" w:cs="Arial"/>
+                <w:sz w:val="22"/>
+                <w:szCs w:val="22"/>
+              </w:rPr>
+            </w:pPr>
+            <w:r>
+              <w:rPr>
+                <w:rFonts w:ascii="Arial" w:hAnsi="Arial" w:cs="Arial"/>
+                <w:sz w:val="22"/>
+                <w:szCs w:val="22"/>
+              </w:rPr>
+              <w:t xml:space="preserve">Avanzar en </w:t>
+            </w:r>
+            <w:proofErr w:type="spellStart"/>
+            <w:r>
+              <w:rPr>
+                <w:rFonts w:ascii="Arial" w:hAnsi="Arial" w:cs="Arial"/>
+                <w:sz w:val="22"/>
+                <w:szCs w:val="22"/>
+              </w:rPr>
+              <w:t>Frontend</w:t>
+            </w:r>
+            <w:proofErr w:type="spellEnd"/>
+            <w:r>
+              <w:rPr>
+                <w:rFonts w:ascii="Arial" w:hAnsi="Arial" w:cs="Arial"/>
+                <w:sz w:val="22"/>
+                <w:szCs w:val="22"/>
+              </w:rPr>
+              <w:t xml:space="preserve"> / Full Stack</w:t>
+            </w:r>
+          </w:p>
+        </w:tc>
+        <w:tc>
+          <w:tcPr>
+            <w:tcW w:w="2338" w:type="dxa"/>
+          </w:tcPr>
+          <w:p>
+            <w:pPr>
+              <w:spacing w:line="480" w:lineRule="auto"/>
+              <w:rPr>
+                <w:rFonts w:ascii="Arial" w:hAnsi="Arial" w:cs="Arial"/>
+                <w:sz w:val="22"/>
+                <w:szCs w:val="22"/>
+              </w:rPr>
+            </w:pPr>
+            <w:proofErr w:type="spellStart"/>
+            <w:r>
+              <w:rPr>
+                <w:rFonts w:ascii="Arial" w:hAnsi="Arial" w:cs="Arial"/>
+                <w:sz w:val="22"/>
+                <w:szCs w:val="22"/>
+              </w:rPr>
+              <w:t>Frontend</w:t>
+            </w:r>
+            <w:proofErr w:type="spellEnd"/>
+            <w:r>
+              <w:rPr>
+                <w:rFonts w:ascii="Arial" w:hAnsi="Arial" w:cs="Arial"/>
+                <w:sz w:val="22"/>
+                <w:szCs w:val="22"/>
+              </w:rPr>
+              <w:t xml:space="preserve"> / Full Stack</w:t>
+            </w:r>
+          </w:p>
+        </w:tc>
+        <w:tc>
+          <w:tcPr>
+            <w:tcW w:w="2338" w:type="dxa"/>
+          </w:tcPr>
+          <w:p>
+            <w:pPr>
+              <w:spacing w:line="480" w:lineRule="auto"/>
+              <w:rPr>
+                <w:rFonts w:ascii="Arial" w:hAnsi="Arial" w:cs="Arial"/>
+                <w:sz w:val="22"/>
+                <w:szCs w:val="22"/>
+              </w:rPr>
+            </w:pPr>
+            <w:r>
+              <w:rPr>
+                <w:rFonts w:ascii="Arial" w:hAnsi="Arial" w:cs="Arial"/>
+                <w:sz w:val="22"/>
+                <w:szCs w:val="22"/>
+              </w:rPr>
+              <w:t xml:space="preserve">Christian Alessandro Marín Sandoval, Alessandro Imanol Ramírez </w:t>
+            </w:r>
+            <w:proofErr w:type="spellStart"/>
+            <w:r>
+              <w:rPr>
+                <w:rFonts w:ascii="Arial" w:hAnsi="Arial" w:cs="Arial"/>
+                <w:sz w:val="22"/>
+                <w:szCs w:val="22"/>
+              </w:rPr>
+              <w:t>Moran</w:t>
+            </w:r>
+            <w:proofErr w:type="spellEnd"/>
+            <w:r>
+              <w:rPr>
+                <w:rFonts w:ascii="Arial" w:hAnsi="Arial" w:cs="Arial"/>
+                <w:sz w:val="22"/>
+                <w:szCs w:val="22"/>
+              </w:rPr>
+              <w:t>, Gabriela Michelle Pérez Portillo</w:t>
+            </w:r>
+          </w:p>
+        </w:tc>
+        <w:tc>
+          <w:tcPr>
+            <w:tcW w:w="1634" w:type="dxa"/>
+          </w:tcPr>
+          <w:p>
+            <w:pPr>
+              <w:spacing w:line="480" w:lineRule="auto"/>
+              <w:rPr>
+                <w:rFonts w:ascii="Arial" w:hAnsi="Arial" w:cs="Arial"/>
+                <w:sz w:val="22"/>
+                <w:szCs w:val="22"/>
+              </w:rPr>
+            </w:pPr>
+            <w:r>
+              <w:rPr>
+                <w:rFonts w:ascii="Arial" w:hAnsi="Arial" w:cs="Arial"/>
+                <w:sz w:val="22"/>
+                <w:szCs w:val="22"/>
+              </w:rPr>
+              <w:t>27 sept</w:t>
+            </w:r>
+          </w:p>
+        </w:tc>
+      </w:tr>
+      <w:tr>
+        <w:trPr>
+          <w:trHeight w:val="300"/>
+        </w:trPr>
+        <w:tc>
+          <w:tcPr>
+            <w:tcW w:w="3050" w:type="dxa"/>
+          </w:tcPr>
+          <w:p>
+            <w:pPr>
+              <w:spacing w:line="480" w:lineRule="auto"/>
+              <w:rPr>
+                <w:rFonts w:ascii="Arial" w:hAnsi="Arial" w:cs="Arial"/>
+                <w:sz w:val="22"/>
+                <w:szCs w:val="22"/>
+              </w:rPr>
+            </w:pPr>
+            <w:r>
+              <w:rPr>
+                <w:rFonts w:ascii="Arial" w:hAnsi="Arial" w:cs="Arial"/>
+                <w:sz w:val="22"/>
+                <w:szCs w:val="22"/>
+              </w:rPr>
+              <w:t>Entrega final del Avance 2</w:t>
+            </w:r>
+          </w:p>
+        </w:tc>
+        <w:tc>
+          <w:tcPr>
+            <w:tcW w:w="2338" w:type="dxa"/>
+          </w:tcPr>
+          <w:p>
+            <w:pPr>
+              <w:spacing w:line="480" w:lineRule="auto"/>
+              <w:rPr>
+                <w:rFonts w:ascii="Arial" w:hAnsi="Arial" w:cs="Arial"/>
+                <w:sz w:val="22"/>
+                <w:szCs w:val="22"/>
+              </w:rPr>
+            </w:pPr>
+            <w:r>
+              <w:rPr>
+                <w:rFonts w:ascii="Arial" w:hAnsi="Arial" w:cs="Arial"/>
+                <w:sz w:val="22"/>
+                <w:szCs w:val="22"/>
+              </w:rPr>
+              <w:t xml:space="preserve">Scrum </w:t>
+            </w:r>
+            <w:proofErr w:type="gramStart"/>
+            <w:r>
+              <w:rPr>
+                <w:rFonts w:ascii="Arial" w:hAnsi="Arial" w:cs="Arial"/>
+                <w:sz w:val="22"/>
+                <w:szCs w:val="22"/>
+              </w:rPr>
+              <w:t>Master</w:t>
+            </w:r>
+            <w:proofErr w:type="gramEnd"/>
+          </w:p>
+        </w:tc>
+        <w:tc>
+          <w:tcPr>
+            <w:tcW w:w="2338" w:type="dxa"/>
+          </w:tcPr>
+          <w:p>
+            <w:pPr>
+              <w:spacing w:line="480" w:lineRule="auto"/>
+              <w:rPr>
+                <w:rFonts w:ascii="Arial" w:hAnsi="Arial" w:cs="Arial"/>
+                <w:sz w:val="22"/>
+                <w:szCs w:val="22"/>
+              </w:rPr>
+            </w:pPr>
+            <w:r>
+              <w:rPr>
+                <w:rFonts w:ascii="Arial" w:hAnsi="Arial" w:cs="Arial"/>
+                <w:sz w:val="22"/>
+                <w:szCs w:val="22"/>
+              </w:rPr>
+              <w:t>Carla Vanesa Franco Avelar</w:t>
+            </w:r>
+          </w:p>
+        </w:tc>
+        <w:tc>
+          <w:tcPr>
+            <w:tcW w:w="1634" w:type="dxa"/>
+          </w:tcPr>
+          <w:p>
+            <w:pPr>
+              <w:spacing w:line="480" w:lineRule="auto"/>
+              <w:rPr>
+                <w:rFonts w:ascii="Arial" w:hAnsi="Arial" w:cs="Arial"/>
+                <w:sz w:val="22"/>
+                <w:szCs w:val="22"/>
+              </w:rPr>
+            </w:pPr>
+            <w:r>
+              <w:rPr>
+                <w:rFonts w:ascii="Arial" w:hAnsi="Arial" w:cs="Arial"/>
+                <w:sz w:val="22"/>
+                <w:szCs w:val="22"/>
+              </w:rPr>
+              <w:t>27 sept</w:t>
+            </w:r>
+          </w:p>
+        </w:tc>
+      </w:tr>
     </w:tbl>
     <w:p>
       <w:pPr>
@@ -8495,6 +10822,7 @@
           <w:sz w:val="22"/>
           <w:szCs w:val="22"/>
         </w:rPr>
+        <w:lastRenderedPageBreak/>
         <w:br/>
       </w:r>
     </w:p>
@@ -14631,6 +16959,15 @@
                 <w:szCs w:val="22"/>
               </w:rPr>
               <w:t>Entregar avance</w:t>
+            </w:r>
+            <w:r>
+              <w:rPr>
+                <w:rFonts w:ascii="Arial" w:eastAsia="Arial" w:hAnsi="Arial" w:cs="Arial"/>
+                <w:color w:val="000000" w:themeColor="text1"/>
+                <w:sz w:val="22"/>
+                <w:szCs w:val="22"/>
+              </w:rPr>
+              <w:t xml:space="preserve"> 1</w:t>
             </w:r>
           </w:p>
         </w:tc>
@@ -19642,7 +21979,6 @@
         <w:docPartUnique/>
       </w:docPartObj>
     </w:sdtPr>
-    <w:sdtEndPr/>
     <w:sdtContent>
       <w:p>
         <w:pPr>
@@ -21482,7 +23818,6 @@
   <w:style w:type="character" w:default="1" w:styleId="Fuentedeprrafopredeter">
     <w:name w:val="Default Paragraph Font"/>
     <w:uiPriority w:val="1"/>
-    <w:semiHidden/>
     <w:unhideWhenUsed/>
   </w:style>
   <w:style w:type="table" w:default="1" w:styleId="Tablanormal">
@@ -22244,11 +24579,12 @@
 </file>
 
 <file path=customXml/item1.xml><?xml version="1.0" encoding="utf-8"?>
-<p:properties xmlns:p="http://schemas.microsoft.com/office/2006/metadata/properties" xmlns:xsi="http://www.w3.org/2001/XMLSchema-instance" xmlns:pc="http://schemas.microsoft.com/office/infopath/2007/PartnerControls">
-  <documentManagement>
-    <_activity xmlns="2d14f65b-dbd3-4b9e-8303-48eebe409733" xsi:nil="true"/>
-  </documentManagement>
-</p:properties>
+<?mso-contentType ?>
+<FormTemplates xmlns="http://schemas.microsoft.com/sharepoint/v3/contenttype/forms">
+  <Display>DocumentLibraryForm</Display>
+  <Edit>DocumentLibraryForm</Edit>
+  <New>DocumentLibraryForm</New>
+</FormTemplates>
 </file>
 
 <file path=customXml/item2.xml><?xml version="1.0" encoding="utf-8"?>
@@ -22432,20 +24768,17 @@
 </file>
 
 <file path=customXml/item3.xml><?xml version="1.0" encoding="utf-8"?>
-<?mso-contentType ?>
-<FormTemplates xmlns="http://schemas.microsoft.com/sharepoint/v3/contenttype/forms">
-  <Display>DocumentLibraryForm</Display>
-  <Edit>DocumentLibraryForm</Edit>
-  <New>DocumentLibraryForm</New>
-</FormTemplates>
+<p:properties xmlns:p="http://schemas.microsoft.com/office/2006/metadata/properties" xmlns:xsi="http://www.w3.org/2001/XMLSchema-instance" xmlns:pc="http://schemas.microsoft.com/office/infopath/2007/PartnerControls">
+  <documentManagement>
+    <_activity xmlns="2d14f65b-dbd3-4b9e-8303-48eebe409733" xsi:nil="true"/>
+  </documentManagement>
+</p:properties>
 </file>
 
 <file path=customXml/itemProps1.xml><?xml version="1.0" encoding="utf-8"?>
-<ds:datastoreItem xmlns:ds="http://schemas.openxmlformats.org/officeDocument/2006/customXml" ds:itemID="{7A03EBF7-18F6-4A1B-8837-FABCC598EF4B}">
+<ds:datastoreItem xmlns:ds="http://schemas.openxmlformats.org/officeDocument/2006/customXml" ds:itemID="{822FDB6B-95BE-4B5C-AC35-77DE7E91BE8B}">
   <ds:schemaRefs>
-    <ds:schemaRef ds:uri="http://schemas.microsoft.com/office/2006/metadata/properties"/>
-    <ds:schemaRef ds:uri="http://schemas.microsoft.com/office/infopath/2007/PartnerControls"/>
-    <ds:schemaRef ds:uri="2d14f65b-dbd3-4b9e-8303-48eebe409733"/>
+    <ds:schemaRef ds:uri="http://schemas.microsoft.com/sharepoint/v3/contenttype/forms"/>
   </ds:schemaRefs>
 </ds:datastoreItem>
 </file>
@@ -22469,9 +24802,11 @@
 </file>
 
 <file path=customXml/itemProps3.xml><?xml version="1.0" encoding="utf-8"?>
-<ds:datastoreItem xmlns:ds="http://schemas.openxmlformats.org/officeDocument/2006/customXml" ds:itemID="{822FDB6B-95BE-4B5C-AC35-77DE7E91BE8B}">
+<ds:datastoreItem xmlns:ds="http://schemas.openxmlformats.org/officeDocument/2006/customXml" ds:itemID="{7A03EBF7-18F6-4A1B-8837-FABCC598EF4B}">
   <ds:schemaRefs>
-    <ds:schemaRef ds:uri="http://schemas.microsoft.com/sharepoint/v3/contenttype/forms"/>
+    <ds:schemaRef ds:uri="http://schemas.microsoft.com/office/2006/metadata/properties"/>
+    <ds:schemaRef ds:uri="http://schemas.microsoft.com/office/infopath/2007/PartnerControls"/>
+    <ds:schemaRef ds:uri="2d14f65b-dbd3-4b9e-8303-48eebe409733"/>
   </ds:schemaRefs>
 </ds:datastoreItem>
 </file>
</xml_diff>

<commit_message>
"Agrega segundo objetivo específico"
Actualización del documento con el segundo objetivo específico solicitado
</commit_message>
<xml_diff>
--- a/docs/Proyecto de Gestión de Reservas para Hoteles.docx
+++ b/docs/Proyecto de Gestión de Reservas para Hoteles.docx
@@ -1497,8 +1497,49 @@
     </w:p>
     <w:p>
       <w:pPr>
+        <w:spacing w:line="480" w:lineRule="auto"/>
+        <w:rPr>
+          <w:rFonts w:ascii="Arial" w:hAnsi="Arial" w:cs="Arial"/>
+          <w:sz w:val="22"/>
+          <w:szCs w:val="22"/>
+        </w:rPr>
+      </w:pPr>
+      <w:r>
+        <w:rPr>
+          <w:rFonts w:ascii="Arial" w:hAnsi="Arial" w:cs="Arial"/>
+          <w:sz w:val="22"/>
+          <w:szCs w:val="22"/>
+        </w:rPr>
+        <w:t>Segundo avance</w:t>
+      </w:r>
+    </w:p>
+    <w:p>
+      <w:pPr>
         <w:pStyle w:val="Prrafodelista"/>
+        <w:numPr>
+          <w:ilvl w:val="0"/>
+          <w:numId w:val="5"/>
+        </w:numPr>
         <w:spacing w:line="480" w:lineRule="auto"/>
+        <w:rPr>
+          <w:rFonts w:ascii="Arial" w:hAnsi="Arial" w:cs="Arial"/>
+          <w:sz w:val="22"/>
+          <w:szCs w:val="22"/>
+        </w:rPr>
+      </w:pPr>
+      <w:r>
+        <w:rPr>
+          <w:rFonts w:ascii="Arial" w:hAnsi="Arial" w:cs="Arial"/>
+          <w:sz w:val="22"/>
+          <w:szCs w:val="22"/>
+        </w:rPr>
+        <w:t>Diseñar e implementar una capa de persistencia y reportes administrativos que permita registrar el historial de los huéspedes, el control de cobros y la generación de reportes de ocupación del hotel.</w:t>
+      </w:r>
+    </w:p>
+    <w:p>
+      <w:pPr>
+        <w:spacing w:line="480" w:lineRule="auto"/>
+        <w:ind w:left="360"/>
         <w:rPr>
           <w:rFonts w:ascii="Arial" w:hAnsi="Arial" w:cs="Arial"/>
           <w:sz w:val="22"/>
@@ -1911,7 +1952,6 @@
                 <w:szCs w:val="22"/>
               </w:rPr>
             </w:pPr>
-            <w:proofErr w:type="spellStart"/>
             <w:r>
               <w:rPr>
                 <w:rFonts w:ascii="Arial" w:hAnsi="Arial" w:cs="Arial"/>
@@ -1919,17 +1959,7 @@
                 <w:sz w:val="22"/>
                 <w:szCs w:val="22"/>
               </w:rPr>
-              <w:t>Product</w:t>
-            </w:r>
-            <w:proofErr w:type="spellEnd"/>
-            <w:r>
-              <w:rPr>
-                <w:rFonts w:ascii="Arial" w:hAnsi="Arial" w:cs="Arial"/>
-                <w:color w:val="000000"/>
-                <w:sz w:val="22"/>
-                <w:szCs w:val="22"/>
-              </w:rPr>
-              <w:t xml:space="preserve"> Owner</w:t>
+              <w:t>Product Owner</w:t>
             </w:r>
           </w:p>
         </w:tc>
@@ -3413,7 +3443,6 @@
                 <w:szCs w:val="22"/>
               </w:rPr>
             </w:pPr>
-            <w:proofErr w:type="spellStart"/>
             <w:r>
               <w:rPr>
                 <w:rFonts w:ascii="Arial" w:hAnsi="Arial" w:cs="Arial"/>
@@ -3423,7 +3452,6 @@
               </w:rPr>
               <w:t>Architect</w:t>
             </w:r>
-            <w:proofErr w:type="spellEnd"/>
           </w:p>
         </w:tc>
         <w:tc>
@@ -6192,25 +6220,7 @@
                 <w:sz w:val="22"/>
                 <w:szCs w:val="22"/>
               </w:rPr>
-              <w:t xml:space="preserve">Compartir el </w:t>
-            </w:r>
-            <w:proofErr w:type="spellStart"/>
-            <w:r>
-              <w:rPr>
-                <w:rFonts w:ascii="Arial" w:hAnsi="Arial" w:cs="Arial"/>
-                <w:sz w:val="22"/>
-                <w:szCs w:val="22"/>
-              </w:rPr>
-              <w:t>Product</w:t>
-            </w:r>
-            <w:proofErr w:type="spellEnd"/>
-            <w:r>
-              <w:rPr>
-                <w:rFonts w:ascii="Arial" w:hAnsi="Arial" w:cs="Arial"/>
-                <w:sz w:val="22"/>
-                <w:szCs w:val="22"/>
-              </w:rPr>
-              <w:t xml:space="preserve"> Backlog inicial</w:t>
+              <w:t>Compartir el Product Backlog inicial</w:t>
             </w:r>
           </w:p>
         </w:tc>
@@ -6227,23 +6237,13 @@
                 <w:szCs w:val="22"/>
               </w:rPr>
             </w:pPr>
-            <w:proofErr w:type="spellStart"/>
-            <w:r>
-              <w:rPr>
-                <w:rFonts w:ascii="Arial" w:hAnsi="Arial" w:cs="Arial"/>
-                <w:sz w:val="22"/>
-                <w:szCs w:val="22"/>
-              </w:rPr>
-              <w:t>Product</w:t>
-            </w:r>
-            <w:proofErr w:type="spellEnd"/>
-            <w:r>
-              <w:rPr>
-                <w:rFonts w:ascii="Arial" w:hAnsi="Arial" w:cs="Arial"/>
-                <w:sz w:val="22"/>
-                <w:szCs w:val="22"/>
-              </w:rPr>
-              <w:t xml:space="preserve"> </w:t>
+            <w:r>
+              <w:rPr>
+                <w:rFonts w:ascii="Arial" w:hAnsi="Arial" w:cs="Arial"/>
+                <w:sz w:val="22"/>
+                <w:szCs w:val="22"/>
+              </w:rPr>
+              <w:t xml:space="preserve">Product </w:t>
             </w:r>
             <w:proofErr w:type="spellStart"/>
             <w:r>
@@ -6459,23 +6459,13 @@
                 <w:szCs w:val="22"/>
               </w:rPr>
             </w:pPr>
-            <w:proofErr w:type="spellStart"/>
-            <w:r>
-              <w:rPr>
-                <w:rFonts w:ascii="Arial" w:hAnsi="Arial" w:cs="Arial"/>
-                <w:sz w:val="22"/>
-                <w:szCs w:val="22"/>
-              </w:rPr>
-              <w:t>Product</w:t>
-            </w:r>
-            <w:proofErr w:type="spellEnd"/>
-            <w:r>
-              <w:rPr>
-                <w:rFonts w:ascii="Arial" w:hAnsi="Arial" w:cs="Arial"/>
-                <w:sz w:val="22"/>
-                <w:szCs w:val="22"/>
-              </w:rPr>
-              <w:t xml:space="preserve"> </w:t>
+            <w:r>
+              <w:rPr>
+                <w:rFonts w:ascii="Arial" w:hAnsi="Arial" w:cs="Arial"/>
+                <w:sz w:val="22"/>
+                <w:szCs w:val="22"/>
+              </w:rPr>
+              <w:t xml:space="preserve">Product </w:t>
             </w:r>
             <w:proofErr w:type="spellStart"/>
             <w:r>
@@ -6683,7 +6673,6 @@
                 <w:szCs w:val="22"/>
               </w:rPr>
             </w:pPr>
-            <w:proofErr w:type="spellStart"/>
             <w:r>
               <w:rPr>
                 <w:rFonts w:ascii="Arial" w:hAnsi="Arial" w:cs="Arial"/>
@@ -6692,7 +6681,6 @@
               </w:rPr>
               <w:t>Architect</w:t>
             </w:r>
-            <w:proofErr w:type="spellEnd"/>
           </w:p>
         </w:tc>
         <w:tc>
@@ -7589,23 +7577,13 @@
                 <w:szCs w:val="22"/>
               </w:rPr>
             </w:pPr>
-            <w:proofErr w:type="spellStart"/>
-            <w:r>
-              <w:rPr>
-                <w:rFonts w:ascii="Arial" w:hAnsi="Arial" w:cs="Arial"/>
-                <w:sz w:val="22"/>
-                <w:szCs w:val="22"/>
-              </w:rPr>
-              <w:t>Product</w:t>
-            </w:r>
-            <w:proofErr w:type="spellEnd"/>
-            <w:r>
-              <w:rPr>
-                <w:rFonts w:ascii="Arial" w:hAnsi="Arial" w:cs="Arial"/>
-                <w:sz w:val="22"/>
-                <w:szCs w:val="22"/>
-              </w:rPr>
-              <w:t xml:space="preserve"> </w:t>
+            <w:r>
+              <w:rPr>
+                <w:rFonts w:ascii="Arial" w:hAnsi="Arial" w:cs="Arial"/>
+                <w:sz w:val="22"/>
+                <w:szCs w:val="22"/>
+              </w:rPr>
+              <w:t xml:space="preserve">Product </w:t>
             </w:r>
             <w:proofErr w:type="spellStart"/>
             <w:r>
@@ -7753,23 +7731,13 @@
                 <w:szCs w:val="22"/>
               </w:rPr>
             </w:pPr>
-            <w:proofErr w:type="spellStart"/>
-            <w:r>
-              <w:rPr>
-                <w:rFonts w:ascii="Arial" w:hAnsi="Arial" w:cs="Arial"/>
-                <w:sz w:val="22"/>
-                <w:szCs w:val="22"/>
-              </w:rPr>
-              <w:t>Product</w:t>
-            </w:r>
-            <w:proofErr w:type="spellEnd"/>
-            <w:r>
-              <w:rPr>
-                <w:rFonts w:ascii="Arial" w:hAnsi="Arial" w:cs="Arial"/>
-                <w:sz w:val="22"/>
-                <w:szCs w:val="22"/>
-              </w:rPr>
-              <w:t xml:space="preserve"> </w:t>
+            <w:r>
+              <w:rPr>
+                <w:rFonts w:ascii="Arial" w:hAnsi="Arial" w:cs="Arial"/>
+                <w:sz w:val="22"/>
+                <w:szCs w:val="22"/>
+              </w:rPr>
+              <w:t xml:space="preserve">Product </w:t>
             </w:r>
             <w:proofErr w:type="spellStart"/>
             <w:r>
@@ -21482,7 +21450,6 @@
   <w:style w:type="character" w:default="1" w:styleId="Fuentedeprrafopredeter">
     <w:name w:val="Default Paragraph Font"/>
     <w:uiPriority w:val="1"/>
-    <w:semiHidden/>
     <w:unhideWhenUsed/>
   </w:style>
   <w:style w:type="table" w:default="1" w:styleId="Tablanormal">
@@ -22244,14 +22211,6 @@
 </file>
 
 <file path=customXml/item1.xml><?xml version="1.0" encoding="utf-8"?>
-<p:properties xmlns:p="http://schemas.microsoft.com/office/2006/metadata/properties" xmlns:xsi="http://www.w3.org/2001/XMLSchema-instance" xmlns:pc="http://schemas.microsoft.com/office/infopath/2007/PartnerControls">
-  <documentManagement>
-    <_activity xmlns="2d14f65b-dbd3-4b9e-8303-48eebe409733" xsi:nil="true"/>
-  </documentManagement>
-</p:properties>
-</file>
-
-<file path=customXml/item2.xml><?xml version="1.0" encoding="utf-8"?>
 <ct:contentTypeSchema xmlns:ct="http://schemas.microsoft.com/office/2006/metadata/contentType" xmlns:ma="http://schemas.microsoft.com/office/2006/metadata/properties/metaAttributes" ct:_="" ma:_="" ma:contentTypeName="Documento" ma:contentTypeID="0x0101003AF49DDEF441504A9AC76EA29892912D" ma:contentTypeVersion="10" ma:contentTypeDescription="Crear nuevo documento." ma:contentTypeScope="" ma:versionID="3a9b1abba21c2f4c9de24f68e7e68b8e">
   <xsd:schema xmlns:xsd="http://www.w3.org/2001/XMLSchema" xmlns:xs="http://www.w3.org/2001/XMLSchema" xmlns:p="http://schemas.microsoft.com/office/2006/metadata/properties" xmlns:ns3="2d14f65b-dbd3-4b9e-8303-48eebe409733" targetNamespace="http://schemas.microsoft.com/office/2006/metadata/properties" ma:root="true" ma:fieldsID="ac178463c80ba25e562b98e3f0c366a2" ns3:_="">
     <xsd:import namespace="2d14f65b-dbd3-4b9e-8303-48eebe409733"/>
@@ -22431,6 +22390,14 @@
 </ct:contentTypeSchema>
 </file>
 
+<file path=customXml/item2.xml><?xml version="1.0" encoding="utf-8"?>
+<p:properties xmlns:p="http://schemas.microsoft.com/office/2006/metadata/properties" xmlns:xsi="http://www.w3.org/2001/XMLSchema-instance" xmlns:pc="http://schemas.microsoft.com/office/infopath/2007/PartnerControls">
+  <documentManagement>
+    <_activity xmlns="2d14f65b-dbd3-4b9e-8303-48eebe409733" xsi:nil="true"/>
+  </documentManagement>
+</p:properties>
+</file>
+
 <file path=customXml/item3.xml><?xml version="1.0" encoding="utf-8"?>
 <?mso-contentType ?>
 <FormTemplates xmlns="http://schemas.microsoft.com/sharepoint/v3/contenttype/forms">
@@ -22441,16 +22408,6 @@
 </file>
 
 <file path=customXml/itemProps1.xml><?xml version="1.0" encoding="utf-8"?>
-<ds:datastoreItem xmlns:ds="http://schemas.openxmlformats.org/officeDocument/2006/customXml" ds:itemID="{7A03EBF7-18F6-4A1B-8837-FABCC598EF4B}">
-  <ds:schemaRefs>
-    <ds:schemaRef ds:uri="http://schemas.microsoft.com/office/2006/metadata/properties"/>
-    <ds:schemaRef ds:uri="http://schemas.microsoft.com/office/infopath/2007/PartnerControls"/>
-    <ds:schemaRef ds:uri="2d14f65b-dbd3-4b9e-8303-48eebe409733"/>
-  </ds:schemaRefs>
-</ds:datastoreItem>
-</file>
-
-<file path=customXml/itemProps2.xml><?xml version="1.0" encoding="utf-8"?>
 <ds:datastoreItem xmlns:ds="http://schemas.openxmlformats.org/officeDocument/2006/customXml" ds:itemID="{F411C895-2ABD-4A22-A82C-5EA52C010223}">
   <ds:schemaRefs>
     <ds:schemaRef ds:uri="http://schemas.microsoft.com/office/2006/metadata/contentType"/>
@@ -22468,6 +22425,16 @@
 </ds:datastoreItem>
 </file>
 
+<file path=customXml/itemProps2.xml><?xml version="1.0" encoding="utf-8"?>
+<ds:datastoreItem xmlns:ds="http://schemas.openxmlformats.org/officeDocument/2006/customXml" ds:itemID="{7A03EBF7-18F6-4A1B-8837-FABCC598EF4B}">
+  <ds:schemaRefs>
+    <ds:schemaRef ds:uri="http://schemas.microsoft.com/office/2006/metadata/properties"/>
+    <ds:schemaRef ds:uri="http://schemas.microsoft.com/office/infopath/2007/PartnerControls"/>
+    <ds:schemaRef ds:uri="2d14f65b-dbd3-4b9e-8303-48eebe409733"/>
+  </ds:schemaRefs>
+</ds:datastoreItem>
+</file>
+
 <file path=customXml/itemProps3.xml><?xml version="1.0" encoding="utf-8"?>
 <ds:datastoreItem xmlns:ds="http://schemas.openxmlformats.org/officeDocument/2006/customXml" ds:itemID="{822FDB6B-95BE-4B5C-AC35-77DE7E91BE8B}">
   <ds:schemaRefs>

</xml_diff>

<commit_message>
Agrega fotos del equipo a la portada y completa la planificacion del Avance 2
</commit_message>
<xml_diff>
--- a/docs/Proyecto de Gestión de Reservas para Hoteles.docx
+++ b/docs/Proyecto de Gestión de Reservas para Hoteles.docx
@@ -341,17 +341,6 @@
         </w:rPr>
         <w:t xml:space="preserve">Docente: </w:t>
       </w:r>
-    </w:p>
-    <w:p>
-      <w:pPr>
-        <w:spacing w:line="257" w:lineRule="auto"/>
-        <w:jc w:val="center"/>
-        <w:rPr>
-          <w:rFonts w:ascii="Arial" w:hAnsi="Arial" w:cs="Arial"/>
-          <w:sz w:val="22"/>
-          <w:szCs w:val="22"/>
-        </w:rPr>
-      </w:pPr>
       <w:r>
         <w:rPr>
           <w:rFonts w:ascii="Arial" w:hAnsi="Arial" w:cs="Arial"/>
@@ -389,6 +378,10 @@
         <w:tblStyle w:val="Tablaconcuadrcula"/>
         <w:tblW w:w="0" w:type="auto"/>
         <w:tblInd w:w="-5" w:type="dxa"/>
+        <w:tblBorders>
+          <w:insideH w:val="none" w:sz="0" w:space="0" w:color="auto"/>
+          <w:insideV w:val="none" w:sz="0" w:space="0" w:color="auto"/>
+        </w:tblBorders>
         <w:tblLook w:val="04A0" w:firstRow="1" w:lastRow="0" w:firstColumn="1" w:lastColumn="0" w:noHBand="0" w:noVBand="1"/>
       </w:tblPr>
       <w:tblGrid>
@@ -403,6 +396,12 @@
         <w:tc>
           <w:tcPr>
             <w:tcW w:w="4816" w:type="dxa"/>
+            <w:tcBorders>
+              <w:top w:val="single" w:sz="4" w:space="0" w:color="auto"/>
+              <w:bottom w:val="single" w:sz="4" w:space="0" w:color="auto"/>
+              <w:right w:val="single" w:sz="4" w:space="0" w:color="auto"/>
+            </w:tcBorders>
+            <w:vAlign w:val="bottom"/>
           </w:tcPr>
           <w:p>
             <w:pPr>
@@ -430,6 +429,13 @@
         <w:tc>
           <w:tcPr>
             <w:tcW w:w="2267" w:type="dxa"/>
+            <w:tcBorders>
+              <w:top w:val="single" w:sz="4" w:space="0" w:color="auto"/>
+              <w:left w:val="single" w:sz="4" w:space="0" w:color="auto"/>
+              <w:bottom w:val="single" w:sz="4" w:space="0" w:color="auto"/>
+              <w:right w:val="single" w:sz="4" w:space="0" w:color="auto"/>
+            </w:tcBorders>
+            <w:vAlign w:val="bottom"/>
           </w:tcPr>
           <w:p>
             <w:pPr>
@@ -457,6 +463,12 @@
         <w:tc>
           <w:tcPr>
             <w:tcW w:w="2272" w:type="dxa"/>
+            <w:tcBorders>
+              <w:top w:val="single" w:sz="4" w:space="0" w:color="auto"/>
+              <w:left w:val="single" w:sz="4" w:space="0" w:color="auto"/>
+              <w:bottom w:val="single" w:sz="4" w:space="0" w:color="auto"/>
+            </w:tcBorders>
+            <w:vAlign w:val="bottom"/>
           </w:tcPr>
           <w:p>
             <w:pPr>
@@ -489,7 +501,11 @@
         <w:tc>
           <w:tcPr>
             <w:tcW w:w="4816" w:type="dxa"/>
-            <w:vAlign w:val="center"/>
+            <w:tcBorders>
+              <w:top w:val="single" w:sz="4" w:space="0" w:color="auto"/>
+              <w:bottom w:val="nil"/>
+            </w:tcBorders>
+            <w:vAlign w:val="bottom"/>
           </w:tcPr>
           <w:p>
             <w:pPr>
@@ -514,6 +530,11 @@
         <w:tc>
           <w:tcPr>
             <w:tcW w:w="2267" w:type="dxa"/>
+            <w:tcBorders>
+              <w:top w:val="single" w:sz="4" w:space="0" w:color="auto"/>
+              <w:bottom w:val="nil"/>
+            </w:tcBorders>
+            <w:vAlign w:val="bottom"/>
           </w:tcPr>
           <w:p>
             <w:pPr>
@@ -537,6 +558,11 @@
         <w:tc>
           <w:tcPr>
             <w:tcW w:w="2272" w:type="dxa"/>
+            <w:tcBorders>
+              <w:top w:val="single" w:sz="4" w:space="0" w:color="auto"/>
+              <w:bottom w:val="nil"/>
+            </w:tcBorders>
+            <w:vAlign w:val="bottom"/>
           </w:tcPr>
           <w:p>
             <w:pPr>
@@ -564,73 +590,593 @@
         </w:trPr>
         <w:tc>
           <w:tcPr>
-            <w:tcW w:w="4816" w:type="dxa"/>
+            <w:tcW w:w="9355" w:type="dxa"/>
+            <w:gridSpan w:val="3"/>
+            <w:tcBorders>
+              <w:top w:val="nil"/>
+              <w:bottom w:val="single" w:sz="4" w:space="0" w:color="auto"/>
+            </w:tcBorders>
             <w:vAlign w:val="center"/>
           </w:tcPr>
           <w:p>
             <w:pPr>
               <w:spacing w:line="480" w:lineRule="auto"/>
-              <w:rPr>
-                <w:rFonts w:ascii="Arial" w:hAnsi="Arial" w:cs="Arial"/>
-                <w:sz w:val="22"/>
-                <w:szCs w:val="22"/>
-              </w:rPr>
-            </w:pPr>
-            <w:r>
-              <w:rPr>
-                <w:rFonts w:ascii="Arial" w:hAnsi="Arial" w:cs="Arial"/>
-                <w:color w:val="000000" w:themeColor="text1"/>
-                <w:sz w:val="22"/>
-                <w:szCs w:val="22"/>
-              </w:rPr>
-              <w:t>Carla Vanesa Franco Avelar</w:t>
-            </w:r>
-          </w:p>
-        </w:tc>
-        <w:tc>
-          <w:tcPr>
-            <w:tcW w:w="2267" w:type="dxa"/>
-          </w:tcPr>
-          <w:p>
-            <w:pPr>
-              <w:spacing w:line="480" w:lineRule="auto"/>
-              <w:rPr>
-                <w:rFonts w:ascii="Arial" w:hAnsi="Arial" w:cs="Arial"/>
-                <w:sz w:val="22"/>
-                <w:szCs w:val="22"/>
-              </w:rPr>
-            </w:pPr>
-            <w:r>
-              <w:rPr>
-                <w:rFonts w:ascii="Arial" w:hAnsi="Arial" w:cs="Arial"/>
-                <w:sz w:val="22"/>
-                <w:szCs w:val="22"/>
-              </w:rPr>
-              <w:t>2025011012</w:t>
-            </w:r>
-          </w:p>
-        </w:tc>
-        <w:tc>
-          <w:tcPr>
-            <w:tcW w:w="2272" w:type="dxa"/>
-          </w:tcPr>
-          <w:p>
-            <w:pPr>
-              <w:spacing w:line="480" w:lineRule="auto"/>
-              <w:rPr>
-                <w:rFonts w:ascii="Arial" w:hAnsi="Arial" w:cs="Arial"/>
-                <w:sz w:val="22"/>
-                <w:szCs w:val="22"/>
-              </w:rPr>
-            </w:pPr>
-            <w:r>
-              <w:rPr>
-                <w:rFonts w:ascii="Arial" w:hAnsi="Arial" w:cs="Arial"/>
-                <w:sz w:val="22"/>
-                <w:szCs w:val="22"/>
-              </w:rPr>
-              <w:t>Sí</w:t>
-            </w:r>
+              <w:jc w:val="center"/>
+              <w:rPr>
+                <w:noProof/>
+                <w:sz w:val="2"/>
+                <w:szCs w:val="2"/>
+              </w:rPr>
+            </w:pPr>
+          </w:p>
+          <w:p>
+            <w:pPr>
+              <w:spacing w:line="480" w:lineRule="auto"/>
+              <w:jc w:val="center"/>
+              <w:rPr>
+                <w:rFonts w:ascii="Arial" w:hAnsi="Arial" w:cs="Arial"/>
+                <w:sz w:val="2"/>
+                <w:szCs w:val="2"/>
+              </w:rPr>
+            </w:pPr>
+            <w:r>
+              <w:rPr>
+                <w:noProof/>
+                <w:sz w:val="2"/>
+                <w:szCs w:val="2"/>
+              </w:rPr>
+              <w:drawing>
+                <wp:inline distT="0" distB="0" distL="0" distR="0" wp14:anchorId="34AD09A8" wp14:editId="12406DE9">
+                  <wp:extent cx="1990976" cy="2095500"/>
+                  <wp:effectExtent l="152400" t="171450" r="371475" b="361950"/>
+                  <wp:docPr id="7" name="Imagen 1"/>
+                  <wp:cNvGraphicFramePr>
+                    <a:graphicFrameLocks xmlns:a="http://schemas.openxmlformats.org/drawingml/2006/main" noChangeAspect="1"/>
+                  </wp:cNvGraphicFramePr>
+                  <a:graphic xmlns:a="http://schemas.openxmlformats.org/drawingml/2006/main">
+                    <a:graphicData uri="http://schemas.openxmlformats.org/drawingml/2006/picture">
+                      <pic:pic xmlns:pic="http://schemas.openxmlformats.org/drawingml/2006/picture">
+                        <pic:nvPicPr>
+                          <pic:cNvPr id="7" name="Imagen 7"/>
+                          <pic:cNvPicPr>
+                            <a:picLocks noChangeAspect="1"/>
+                          </pic:cNvPicPr>
+                        </pic:nvPicPr>
+                        <pic:blipFill rotWithShape="1">
+                          <a:blip r:embed="rId11" cstate="print">
+                            <a:extLst>
+                              <a:ext uri="{28A0092B-C50C-407E-A947-70E740481C1C}">
+                                <a14:useLocalDpi xmlns:a14="http://schemas.microsoft.com/office/drawing/2010/main" val="0"/>
+                              </a:ext>
+                            </a:extLst>
+                          </a:blip>
+                          <a:srcRect t="4826" b="17662"/>
+                          <a:stretch>
+                            <a:fillRect/>
+                          </a:stretch>
+                        </pic:blipFill>
+                        <pic:spPr bwMode="auto">
+                          <a:xfrm>
+                            <a:off x="0" y="0"/>
+                            <a:ext cx="2006937" cy="2112299"/>
+                          </a:xfrm>
+                          <a:prstGeom prst="rect">
+                            <a:avLst/>
+                          </a:prstGeom>
+                          <a:ln>
+                            <a:noFill/>
+                          </a:ln>
+                          <a:effectLst>
+                            <a:outerShdw blurRad="292100" dist="139700" dir="2700000" algn="tl" rotWithShape="0">
+                              <a:srgbClr val="333333">
+                                <a:alpha val="65000"/>
+                              </a:srgbClr>
+                            </a:outerShdw>
+                          </a:effectLst>
+                          <a:extLst>
+                            <a:ext uri="{53640926-AAD7-44D8-BBD7-CCE9431645EC}">
+                              <a14:shadowObscured xmlns:a14="http://schemas.microsoft.com/office/drawing/2010/main"/>
+                            </a:ext>
+                          </a:extLst>
+                        </pic:spPr>
+                      </pic:pic>
+                    </a:graphicData>
+                  </a:graphic>
+                </wp:inline>
+              </w:drawing>
+            </w:r>
+          </w:p>
+          <w:p>
+            <w:pPr>
+              <w:spacing w:line="480" w:lineRule="auto"/>
+              <w:jc w:val="center"/>
+              <w:rPr>
+                <w:rFonts w:ascii="Arial" w:hAnsi="Arial" w:cs="Arial"/>
+                <w:sz w:val="2"/>
+                <w:szCs w:val="2"/>
+              </w:rPr>
+            </w:pPr>
+          </w:p>
+          <w:p>
+            <w:pPr>
+              <w:spacing w:line="480" w:lineRule="auto"/>
+              <w:jc w:val="center"/>
+              <w:rPr>
+                <w:rFonts w:ascii="Arial" w:hAnsi="Arial" w:cs="Arial"/>
+                <w:sz w:val="2"/>
+                <w:szCs w:val="2"/>
+              </w:rPr>
+            </w:pPr>
+          </w:p>
+          <w:p>
+            <w:pPr>
+              <w:spacing w:line="480" w:lineRule="auto"/>
+              <w:jc w:val="center"/>
+              <w:rPr>
+                <w:rFonts w:ascii="Arial" w:hAnsi="Arial" w:cs="Arial"/>
+                <w:sz w:val="2"/>
+                <w:szCs w:val="2"/>
+              </w:rPr>
+            </w:pPr>
+          </w:p>
+          <w:p>
+            <w:pPr>
+              <w:spacing w:line="480" w:lineRule="auto"/>
+              <w:jc w:val="center"/>
+              <w:rPr>
+                <w:rFonts w:ascii="Arial" w:hAnsi="Arial" w:cs="Arial"/>
+                <w:sz w:val="2"/>
+                <w:szCs w:val="2"/>
+              </w:rPr>
+            </w:pPr>
+          </w:p>
+          <w:p>
+            <w:pPr>
+              <w:spacing w:line="480" w:lineRule="auto"/>
+              <w:jc w:val="center"/>
+              <w:rPr>
+                <w:rFonts w:ascii="Arial" w:hAnsi="Arial" w:cs="Arial"/>
+                <w:sz w:val="2"/>
+                <w:szCs w:val="2"/>
+              </w:rPr>
+            </w:pPr>
+          </w:p>
+          <w:p>
+            <w:pPr>
+              <w:spacing w:line="480" w:lineRule="auto"/>
+              <w:jc w:val="center"/>
+              <w:rPr>
+                <w:rFonts w:ascii="Arial" w:hAnsi="Arial" w:cs="Arial"/>
+                <w:sz w:val="2"/>
+                <w:szCs w:val="2"/>
+              </w:rPr>
+            </w:pPr>
+          </w:p>
+          <w:p>
+            <w:pPr>
+              <w:spacing w:line="480" w:lineRule="auto"/>
+              <w:jc w:val="center"/>
+              <w:rPr>
+                <w:rFonts w:ascii="Arial" w:hAnsi="Arial" w:cs="Arial"/>
+                <w:sz w:val="2"/>
+                <w:szCs w:val="2"/>
+              </w:rPr>
+            </w:pPr>
+          </w:p>
+          <w:p>
+            <w:pPr>
+              <w:spacing w:line="480" w:lineRule="auto"/>
+              <w:jc w:val="center"/>
+              <w:rPr>
+                <w:rFonts w:ascii="Arial" w:hAnsi="Arial" w:cs="Arial"/>
+                <w:sz w:val="2"/>
+                <w:szCs w:val="2"/>
+              </w:rPr>
+            </w:pPr>
+          </w:p>
+          <w:p>
+            <w:pPr>
+              <w:spacing w:line="480" w:lineRule="auto"/>
+              <w:jc w:val="center"/>
+              <w:rPr>
+                <w:rFonts w:ascii="Arial" w:hAnsi="Arial" w:cs="Arial"/>
+                <w:sz w:val="2"/>
+                <w:szCs w:val="2"/>
+              </w:rPr>
+            </w:pPr>
+          </w:p>
+          <w:p>
+            <w:pPr>
+              <w:spacing w:line="480" w:lineRule="auto"/>
+              <w:jc w:val="center"/>
+              <w:rPr>
+                <w:rFonts w:ascii="Arial" w:hAnsi="Arial" w:cs="Arial"/>
+                <w:sz w:val="2"/>
+                <w:szCs w:val="2"/>
+              </w:rPr>
+            </w:pPr>
+          </w:p>
+          <w:p>
+            <w:pPr>
+              <w:spacing w:line="480" w:lineRule="auto"/>
+              <w:jc w:val="center"/>
+              <w:rPr>
+                <w:rFonts w:ascii="Arial" w:hAnsi="Arial" w:cs="Arial"/>
+                <w:sz w:val="2"/>
+                <w:szCs w:val="2"/>
+              </w:rPr>
+            </w:pPr>
+          </w:p>
+          <w:p>
+            <w:pPr>
+              <w:spacing w:line="480" w:lineRule="auto"/>
+              <w:jc w:val="center"/>
+              <w:rPr>
+                <w:rFonts w:ascii="Arial" w:hAnsi="Arial" w:cs="Arial"/>
+                <w:sz w:val="2"/>
+                <w:szCs w:val="2"/>
+              </w:rPr>
+            </w:pPr>
+          </w:p>
+          <w:p>
+            <w:pPr>
+              <w:spacing w:line="480" w:lineRule="auto"/>
+              <w:jc w:val="center"/>
+              <w:rPr>
+                <w:rFonts w:ascii="Arial" w:hAnsi="Arial" w:cs="Arial"/>
+                <w:sz w:val="2"/>
+                <w:szCs w:val="2"/>
+              </w:rPr>
+            </w:pPr>
+          </w:p>
+          <w:p>
+            <w:pPr>
+              <w:spacing w:line="480" w:lineRule="auto"/>
+              <w:jc w:val="center"/>
+              <w:rPr>
+                <w:rFonts w:ascii="Arial" w:hAnsi="Arial" w:cs="Arial"/>
+                <w:sz w:val="2"/>
+                <w:szCs w:val="2"/>
+              </w:rPr>
+            </w:pPr>
+          </w:p>
+          <w:p>
+            <w:pPr>
+              <w:spacing w:line="480" w:lineRule="auto"/>
+              <w:jc w:val="center"/>
+              <w:rPr>
+                <w:rFonts w:ascii="Arial" w:hAnsi="Arial" w:cs="Arial"/>
+                <w:sz w:val="2"/>
+                <w:szCs w:val="2"/>
+              </w:rPr>
+            </w:pPr>
+          </w:p>
+          <w:p>
+            <w:pPr>
+              <w:spacing w:line="480" w:lineRule="auto"/>
+              <w:jc w:val="center"/>
+              <w:rPr>
+                <w:rFonts w:ascii="Arial" w:hAnsi="Arial" w:cs="Arial"/>
+                <w:sz w:val="2"/>
+                <w:szCs w:val="2"/>
+              </w:rPr>
+            </w:pPr>
+          </w:p>
+          <w:p>
+            <w:pPr>
+              <w:spacing w:line="480" w:lineRule="auto"/>
+              <w:jc w:val="center"/>
+              <w:rPr>
+                <w:rFonts w:ascii="Arial" w:hAnsi="Arial" w:cs="Arial"/>
+                <w:sz w:val="2"/>
+                <w:szCs w:val="2"/>
+              </w:rPr>
+            </w:pPr>
+          </w:p>
+          <w:p>
+            <w:pPr>
+              <w:spacing w:line="480" w:lineRule="auto"/>
+              <w:jc w:val="center"/>
+              <w:rPr>
+                <w:rFonts w:ascii="Arial" w:hAnsi="Arial" w:cs="Arial"/>
+                <w:sz w:val="2"/>
+                <w:szCs w:val="2"/>
+              </w:rPr>
+            </w:pPr>
+          </w:p>
+          <w:p>
+            <w:pPr>
+              <w:spacing w:line="480" w:lineRule="auto"/>
+              <w:jc w:val="center"/>
+              <w:rPr>
+                <w:rFonts w:ascii="Arial" w:hAnsi="Arial" w:cs="Arial"/>
+                <w:sz w:val="2"/>
+                <w:szCs w:val="2"/>
+              </w:rPr>
+            </w:pPr>
+          </w:p>
+          <w:p>
+            <w:pPr>
+              <w:spacing w:line="480" w:lineRule="auto"/>
+              <w:jc w:val="center"/>
+              <w:rPr>
+                <w:rFonts w:ascii="Arial" w:hAnsi="Arial" w:cs="Arial"/>
+                <w:sz w:val="2"/>
+                <w:szCs w:val="2"/>
+              </w:rPr>
+            </w:pPr>
+          </w:p>
+          <w:p>
+            <w:pPr>
+              <w:spacing w:line="480" w:lineRule="auto"/>
+              <w:jc w:val="center"/>
+              <w:rPr>
+                <w:rFonts w:ascii="Arial" w:hAnsi="Arial" w:cs="Arial"/>
+                <w:sz w:val="2"/>
+                <w:szCs w:val="2"/>
+              </w:rPr>
+            </w:pPr>
+          </w:p>
+          <w:p>
+            <w:pPr>
+              <w:spacing w:line="480" w:lineRule="auto"/>
+              <w:jc w:val="center"/>
+              <w:rPr>
+                <w:rFonts w:ascii="Arial" w:hAnsi="Arial" w:cs="Arial"/>
+                <w:sz w:val="2"/>
+                <w:szCs w:val="2"/>
+              </w:rPr>
+            </w:pPr>
+          </w:p>
+          <w:p>
+            <w:pPr>
+              <w:spacing w:line="480" w:lineRule="auto"/>
+              <w:jc w:val="center"/>
+              <w:rPr>
+                <w:rFonts w:ascii="Arial" w:hAnsi="Arial" w:cs="Arial"/>
+                <w:sz w:val="2"/>
+                <w:szCs w:val="2"/>
+              </w:rPr>
+            </w:pPr>
+          </w:p>
+          <w:p>
+            <w:pPr>
+              <w:spacing w:line="480" w:lineRule="auto"/>
+              <w:jc w:val="center"/>
+              <w:rPr>
+                <w:rFonts w:ascii="Arial" w:hAnsi="Arial" w:cs="Arial"/>
+                <w:sz w:val="2"/>
+                <w:szCs w:val="2"/>
+              </w:rPr>
+            </w:pPr>
+          </w:p>
+          <w:p>
+            <w:pPr>
+              <w:spacing w:line="480" w:lineRule="auto"/>
+              <w:jc w:val="center"/>
+              <w:rPr>
+                <w:rFonts w:ascii="Arial" w:hAnsi="Arial" w:cs="Arial"/>
+                <w:sz w:val="2"/>
+                <w:szCs w:val="2"/>
+              </w:rPr>
+            </w:pPr>
+          </w:p>
+          <w:p>
+            <w:pPr>
+              <w:spacing w:line="480" w:lineRule="auto"/>
+              <w:jc w:val="center"/>
+              <w:rPr>
+                <w:rFonts w:ascii="Arial" w:hAnsi="Arial" w:cs="Arial"/>
+                <w:sz w:val="2"/>
+                <w:szCs w:val="2"/>
+              </w:rPr>
+            </w:pPr>
+          </w:p>
+          <w:p>
+            <w:pPr>
+              <w:spacing w:line="480" w:lineRule="auto"/>
+              <w:jc w:val="center"/>
+              <w:rPr>
+                <w:rFonts w:ascii="Arial" w:hAnsi="Arial" w:cs="Arial"/>
+                <w:sz w:val="2"/>
+                <w:szCs w:val="2"/>
+              </w:rPr>
+            </w:pPr>
+          </w:p>
+          <w:p>
+            <w:pPr>
+              <w:spacing w:line="480" w:lineRule="auto"/>
+              <w:jc w:val="center"/>
+              <w:rPr>
+                <w:rFonts w:ascii="Arial" w:hAnsi="Arial" w:cs="Arial"/>
+                <w:sz w:val="2"/>
+                <w:szCs w:val="2"/>
+              </w:rPr>
+            </w:pPr>
+          </w:p>
+          <w:p>
+            <w:pPr>
+              <w:spacing w:line="480" w:lineRule="auto"/>
+              <w:jc w:val="center"/>
+              <w:rPr>
+                <w:rFonts w:ascii="Arial" w:hAnsi="Arial" w:cs="Arial"/>
+                <w:sz w:val="2"/>
+                <w:szCs w:val="2"/>
+              </w:rPr>
+            </w:pPr>
+          </w:p>
+          <w:p>
+            <w:pPr>
+              <w:spacing w:line="480" w:lineRule="auto"/>
+              <w:jc w:val="center"/>
+              <w:rPr>
+                <w:rFonts w:ascii="Arial" w:hAnsi="Arial" w:cs="Arial"/>
+                <w:sz w:val="2"/>
+                <w:szCs w:val="2"/>
+              </w:rPr>
+            </w:pPr>
+          </w:p>
+          <w:p>
+            <w:pPr>
+              <w:spacing w:line="480" w:lineRule="auto"/>
+              <w:jc w:val="center"/>
+              <w:rPr>
+                <w:rFonts w:ascii="Arial" w:hAnsi="Arial" w:cs="Arial"/>
+                <w:sz w:val="2"/>
+                <w:szCs w:val="2"/>
+              </w:rPr>
+            </w:pPr>
+          </w:p>
+          <w:p>
+            <w:pPr>
+              <w:spacing w:line="480" w:lineRule="auto"/>
+              <w:jc w:val="center"/>
+              <w:rPr>
+                <w:rFonts w:ascii="Arial" w:hAnsi="Arial" w:cs="Arial"/>
+                <w:sz w:val="2"/>
+                <w:szCs w:val="2"/>
+              </w:rPr>
+            </w:pPr>
+          </w:p>
+          <w:p>
+            <w:pPr>
+              <w:spacing w:line="480" w:lineRule="auto"/>
+              <w:jc w:val="center"/>
+              <w:rPr>
+                <w:rFonts w:ascii="Arial" w:hAnsi="Arial" w:cs="Arial"/>
+                <w:sz w:val="2"/>
+                <w:szCs w:val="2"/>
+              </w:rPr>
+            </w:pPr>
+          </w:p>
+          <w:p>
+            <w:pPr>
+              <w:spacing w:line="480" w:lineRule="auto"/>
+              <w:jc w:val="center"/>
+              <w:rPr>
+                <w:rFonts w:ascii="Arial" w:hAnsi="Arial" w:cs="Arial"/>
+                <w:sz w:val="2"/>
+                <w:szCs w:val="2"/>
+              </w:rPr>
+            </w:pPr>
+          </w:p>
+          <w:p>
+            <w:pPr>
+              <w:spacing w:line="480" w:lineRule="auto"/>
+              <w:jc w:val="center"/>
+              <w:rPr>
+                <w:rFonts w:ascii="Arial" w:hAnsi="Arial" w:cs="Arial"/>
+                <w:sz w:val="2"/>
+                <w:szCs w:val="2"/>
+              </w:rPr>
+            </w:pPr>
+          </w:p>
+          <w:p>
+            <w:pPr>
+              <w:spacing w:line="480" w:lineRule="auto"/>
+              <w:jc w:val="center"/>
+              <w:rPr>
+                <w:rFonts w:ascii="Arial" w:hAnsi="Arial" w:cs="Arial"/>
+                <w:sz w:val="2"/>
+                <w:szCs w:val="2"/>
+              </w:rPr>
+            </w:pPr>
+          </w:p>
+          <w:p>
+            <w:pPr>
+              <w:spacing w:line="480" w:lineRule="auto"/>
+              <w:jc w:val="center"/>
+              <w:rPr>
+                <w:rFonts w:ascii="Arial" w:hAnsi="Arial" w:cs="Arial"/>
+                <w:sz w:val="2"/>
+                <w:szCs w:val="2"/>
+              </w:rPr>
+            </w:pPr>
+          </w:p>
+          <w:p>
+            <w:pPr>
+              <w:spacing w:line="480" w:lineRule="auto"/>
+              <w:jc w:val="center"/>
+              <w:rPr>
+                <w:rFonts w:ascii="Arial" w:hAnsi="Arial" w:cs="Arial"/>
+                <w:sz w:val="2"/>
+                <w:szCs w:val="2"/>
+              </w:rPr>
+            </w:pPr>
+          </w:p>
+          <w:p>
+            <w:pPr>
+              <w:spacing w:line="480" w:lineRule="auto"/>
+              <w:jc w:val="center"/>
+              <w:rPr>
+                <w:rFonts w:ascii="Arial" w:hAnsi="Arial" w:cs="Arial"/>
+                <w:sz w:val="2"/>
+                <w:szCs w:val="2"/>
+              </w:rPr>
+            </w:pPr>
+          </w:p>
+          <w:p>
+            <w:pPr>
+              <w:spacing w:line="480" w:lineRule="auto"/>
+              <w:jc w:val="center"/>
+              <w:rPr>
+                <w:rFonts w:ascii="Arial" w:hAnsi="Arial" w:cs="Arial"/>
+                <w:sz w:val="2"/>
+                <w:szCs w:val="2"/>
+              </w:rPr>
+            </w:pPr>
+          </w:p>
+          <w:p>
+            <w:pPr>
+              <w:spacing w:line="480" w:lineRule="auto"/>
+              <w:jc w:val="center"/>
+              <w:rPr>
+                <w:rFonts w:ascii="Arial" w:hAnsi="Arial" w:cs="Arial"/>
+                <w:sz w:val="2"/>
+                <w:szCs w:val="2"/>
+              </w:rPr>
+            </w:pPr>
+          </w:p>
+          <w:p>
+            <w:pPr>
+              <w:spacing w:line="480" w:lineRule="auto"/>
+              <w:jc w:val="center"/>
+              <w:rPr>
+                <w:rFonts w:ascii="Arial" w:hAnsi="Arial" w:cs="Arial"/>
+                <w:sz w:val="2"/>
+                <w:szCs w:val="2"/>
+              </w:rPr>
+            </w:pPr>
+          </w:p>
+          <w:p>
+            <w:pPr>
+              <w:spacing w:line="480" w:lineRule="auto"/>
+              <w:rPr>
+                <w:rFonts w:ascii="Arial" w:hAnsi="Arial" w:cs="Arial"/>
+                <w:sz w:val="2"/>
+                <w:szCs w:val="2"/>
+              </w:rPr>
+            </w:pPr>
+          </w:p>
+          <w:p>
+            <w:pPr>
+              <w:spacing w:line="480" w:lineRule="auto"/>
+              <w:rPr>
+                <w:rFonts w:ascii="Arial" w:hAnsi="Arial" w:cs="Arial"/>
+                <w:sz w:val="2"/>
+                <w:szCs w:val="2"/>
+              </w:rPr>
+            </w:pPr>
+          </w:p>
+          <w:p>
+            <w:pPr>
+              <w:spacing w:line="480" w:lineRule="auto"/>
+              <w:rPr>
+                <w:rFonts w:ascii="Arial" w:hAnsi="Arial" w:cs="Arial"/>
+                <w:sz w:val="2"/>
+                <w:szCs w:val="2"/>
+              </w:rPr>
+            </w:pPr>
           </w:p>
         </w:tc>
       </w:tr>
@@ -641,6 +1187,9 @@
         <w:tc>
           <w:tcPr>
             <w:tcW w:w="4816" w:type="dxa"/>
+            <w:tcBorders>
+              <w:top w:val="single" w:sz="4" w:space="0" w:color="auto"/>
+            </w:tcBorders>
             <w:vAlign w:val="center"/>
           </w:tcPr>
           <w:p>
@@ -659,36 +1208,43 @@
                 <w:sz w:val="22"/>
                 <w:szCs w:val="22"/>
               </w:rPr>
-              <w:t>Christian Alessandro Marín Sandoval</w:t>
+              <w:lastRenderedPageBreak/>
+              <w:t>Carla Vanesa Franco Avelar</w:t>
             </w:r>
           </w:p>
         </w:tc>
         <w:tc>
           <w:tcPr>
             <w:tcW w:w="2267" w:type="dxa"/>
-          </w:tcPr>
-          <w:p>
-            <w:pPr>
-              <w:spacing w:line="480" w:lineRule="auto"/>
-              <w:rPr>
-                <w:rFonts w:ascii="Arial" w:hAnsi="Arial" w:cs="Arial"/>
-                <w:sz w:val="22"/>
-                <w:szCs w:val="22"/>
-              </w:rPr>
-            </w:pPr>
-            <w:r>
-              <w:rPr>
-                <w:rFonts w:ascii="Arial" w:hAnsi="Arial" w:cs="Arial"/>
-                <w:sz w:val="22"/>
-                <w:szCs w:val="22"/>
-              </w:rPr>
-              <w:t>2026011302</w:t>
+            <w:tcBorders>
+              <w:top w:val="single" w:sz="4" w:space="0" w:color="auto"/>
+            </w:tcBorders>
+          </w:tcPr>
+          <w:p>
+            <w:pPr>
+              <w:spacing w:line="480" w:lineRule="auto"/>
+              <w:rPr>
+                <w:rFonts w:ascii="Arial" w:hAnsi="Arial" w:cs="Arial"/>
+                <w:sz w:val="22"/>
+                <w:szCs w:val="22"/>
+              </w:rPr>
+            </w:pPr>
+            <w:r>
+              <w:rPr>
+                <w:rFonts w:ascii="Arial" w:hAnsi="Arial" w:cs="Arial"/>
+                <w:sz w:val="22"/>
+                <w:szCs w:val="22"/>
+              </w:rPr>
+              <w:t>2025011012</w:t>
             </w:r>
           </w:p>
         </w:tc>
         <w:tc>
           <w:tcPr>
             <w:tcW w:w="2272" w:type="dxa"/>
+            <w:tcBorders>
+              <w:top w:val="single" w:sz="4" w:space="0" w:color="auto"/>
+            </w:tcBorders>
           </w:tcPr>
           <w:p>
             <w:pPr>
@@ -716,72 +1272,107 @@
         </w:trPr>
         <w:tc>
           <w:tcPr>
-            <w:tcW w:w="4816" w:type="dxa"/>
+            <w:tcW w:w="9355" w:type="dxa"/>
+            <w:gridSpan w:val="3"/>
+            <w:tcBorders>
+              <w:bottom w:val="single" w:sz="4" w:space="0" w:color="auto"/>
+            </w:tcBorders>
             <w:vAlign w:val="center"/>
           </w:tcPr>
           <w:p>
             <w:pPr>
               <w:spacing w:line="480" w:lineRule="auto"/>
-              <w:rPr>
-                <w:rFonts w:ascii="Arial" w:hAnsi="Arial" w:cs="Arial"/>
-                <w:sz w:val="22"/>
-                <w:szCs w:val="22"/>
-              </w:rPr>
-            </w:pPr>
-            <w:r>
-              <w:rPr>
-                <w:rFonts w:ascii="Arial" w:hAnsi="Arial" w:cs="Arial"/>
-                <w:color w:val="000000" w:themeColor="text1"/>
-                <w:sz w:val="22"/>
-                <w:szCs w:val="22"/>
-              </w:rPr>
-              <w:t>Cindy Shaiel Canales Campos</w:t>
-            </w:r>
-          </w:p>
-        </w:tc>
-        <w:tc>
-          <w:tcPr>
-            <w:tcW w:w="2267" w:type="dxa"/>
-          </w:tcPr>
-          <w:p>
-            <w:pPr>
-              <w:spacing w:line="480" w:lineRule="auto"/>
-              <w:rPr>
-                <w:rFonts w:ascii="Arial" w:hAnsi="Arial" w:cs="Arial"/>
-                <w:sz w:val="22"/>
-                <w:szCs w:val="22"/>
-              </w:rPr>
-            </w:pPr>
-            <w:r>
-              <w:rPr>
-                <w:rFonts w:ascii="Arial" w:hAnsi="Arial" w:cs="Arial"/>
-                <w:sz w:val="22"/>
-                <w:szCs w:val="22"/>
-              </w:rPr>
-              <w:t>2026011285</w:t>
-            </w:r>
-          </w:p>
-        </w:tc>
-        <w:tc>
-          <w:tcPr>
-            <w:tcW w:w="2272" w:type="dxa"/>
-          </w:tcPr>
-          <w:p>
-            <w:pPr>
-              <w:spacing w:line="480" w:lineRule="auto"/>
-              <w:rPr>
-                <w:rFonts w:ascii="Arial" w:hAnsi="Arial" w:cs="Arial"/>
-                <w:sz w:val="22"/>
-                <w:szCs w:val="22"/>
-              </w:rPr>
-            </w:pPr>
-            <w:r>
-              <w:rPr>
-                <w:rFonts w:ascii="Arial" w:hAnsi="Arial" w:cs="Arial"/>
-                <w:sz w:val="22"/>
-                <w:szCs w:val="22"/>
-              </w:rPr>
-              <w:t>Sí</w:t>
+              <w:jc w:val="center"/>
+              <w:rPr>
+                <w:rFonts w:ascii="Arial" w:hAnsi="Arial" w:cs="Arial"/>
+                <w:sz w:val="22"/>
+                <w:szCs w:val="22"/>
+              </w:rPr>
+            </w:pPr>
+            <w:r>
+              <w:rPr>
+                <w:noProof/>
+                <w:sz w:val="22"/>
+                <w:szCs w:val="22"/>
+              </w:rPr>
+              <w:drawing>
+                <wp:anchor distT="0" distB="0" distL="114300" distR="114300" simplePos="0" relativeHeight="251659264" behindDoc="0" locked="0" layoutInCell="1" allowOverlap="1" wp14:anchorId="47F13286" wp14:editId="4E5E1DB6">
+                  <wp:simplePos x="0" y="0"/>
+                  <wp:positionH relativeFrom="column">
+                    <wp:posOffset>1853353</wp:posOffset>
+                  </wp:positionH>
+                  <wp:positionV relativeFrom="paragraph">
+                    <wp:posOffset>154517</wp:posOffset>
+                  </wp:positionV>
+                  <wp:extent cx="1890395" cy="1512570"/>
+                  <wp:effectExtent l="152400" t="152400" r="357505" b="354330"/>
+                  <wp:wrapThrough wrapText="bothSides">
+                    <wp:wrapPolygon edited="0">
+                      <wp:start x="871" y="-2176"/>
+                      <wp:lineTo x="-1741" y="-1632"/>
+                      <wp:lineTo x="-1741" y="22579"/>
+                      <wp:lineTo x="-653" y="24484"/>
+                      <wp:lineTo x="1959" y="25844"/>
+                      <wp:lineTo x="2177" y="26388"/>
+                      <wp:lineTo x="21549" y="26388"/>
+                      <wp:lineTo x="21767" y="25844"/>
+                      <wp:lineTo x="24379" y="24484"/>
+                      <wp:lineTo x="25467" y="20403"/>
+                      <wp:lineTo x="25467" y="2720"/>
+                      <wp:lineTo x="22855" y="-1360"/>
+                      <wp:lineTo x="22638" y="-2176"/>
+                      <wp:lineTo x="871" y="-2176"/>
+                    </wp:wrapPolygon>
+                  </wp:wrapThrough>
+                  <wp:docPr id="4" name="Imagen 1"/>
+                  <wp:cNvGraphicFramePr>
+                    <a:graphicFrameLocks xmlns:a="http://schemas.openxmlformats.org/drawingml/2006/main" noChangeAspect="1"/>
+                  </wp:cNvGraphicFramePr>
+                  <a:graphic xmlns:a="http://schemas.openxmlformats.org/drawingml/2006/main">
+                    <a:graphicData uri="http://schemas.openxmlformats.org/drawingml/2006/picture">
+                      <pic:pic xmlns:pic="http://schemas.openxmlformats.org/drawingml/2006/picture">
+                        <pic:nvPicPr>
+                          <pic:cNvPr id="4" name="Imagen 4"/>
+                          <pic:cNvPicPr>
+                            <a:picLocks noChangeAspect="1"/>
+                          </pic:cNvPicPr>
+                        </pic:nvPicPr>
+                        <pic:blipFill>
+                          <a:blip r:embed="rId12" cstate="print">
+                            <a:extLst>
+                              <a:ext uri="{28A0092B-C50C-407E-A947-70E740481C1C}">
+                                <a14:useLocalDpi xmlns:a14="http://schemas.microsoft.com/office/drawing/2010/main" val="0"/>
+                              </a:ext>
+                            </a:extLst>
+                          </a:blip>
+                          <a:stretch>
+                            <a:fillRect/>
+                          </a:stretch>
+                        </pic:blipFill>
+                        <pic:spPr>
+                          <a:xfrm>
+                            <a:off x="0" y="0"/>
+                            <a:ext cx="1890395" cy="1512570"/>
+                          </a:xfrm>
+                          <a:prstGeom prst="rect">
+                            <a:avLst/>
+                          </a:prstGeom>
+                          <a:ln>
+                            <a:noFill/>
+                          </a:ln>
+                          <a:effectLst>
+                            <a:outerShdw blurRad="292100" dist="139700" dir="2700000" algn="tl" rotWithShape="0">
+                              <a:srgbClr val="333333">
+                                <a:alpha val="65000"/>
+                              </a:srgbClr>
+                            </a:outerShdw>
+                          </a:effectLst>
+                        </pic:spPr>
+                      </pic:pic>
+                    </a:graphicData>
+                  </a:graphic>
+                </wp:anchor>
+              </w:drawing>
             </w:r>
           </w:p>
         </w:tc>
@@ -793,6 +1384,10 @@
         <w:tc>
           <w:tcPr>
             <w:tcW w:w="4816" w:type="dxa"/>
+            <w:tcBorders>
+              <w:top w:val="single" w:sz="4" w:space="0" w:color="auto"/>
+              <w:bottom w:val="nil"/>
+            </w:tcBorders>
             <w:vAlign w:val="center"/>
           </w:tcPr>
           <w:p>
@@ -811,36 +1406,44 @@
                 <w:sz w:val="22"/>
                 <w:szCs w:val="22"/>
               </w:rPr>
-              <w:t>Emerson Eduardo Candido Joya</w:t>
+              <w:t>Christian Alessandro Marín Sandoval</w:t>
             </w:r>
           </w:p>
         </w:tc>
         <w:tc>
           <w:tcPr>
             <w:tcW w:w="2267" w:type="dxa"/>
-          </w:tcPr>
-          <w:p>
-            <w:pPr>
-              <w:spacing w:line="480" w:lineRule="auto"/>
-              <w:rPr>
-                <w:rFonts w:ascii="Arial" w:hAnsi="Arial" w:cs="Arial"/>
-                <w:sz w:val="22"/>
-                <w:szCs w:val="22"/>
-              </w:rPr>
-            </w:pPr>
-            <w:r>
-              <w:rPr>
-                <w:rFonts w:ascii="Arial" w:hAnsi="Arial" w:cs="Arial"/>
-                <w:sz w:val="22"/>
-                <w:szCs w:val="22"/>
-              </w:rPr>
-              <w:t>2026010233</w:t>
+            <w:tcBorders>
+              <w:top w:val="single" w:sz="4" w:space="0" w:color="auto"/>
+              <w:bottom w:val="nil"/>
+            </w:tcBorders>
+          </w:tcPr>
+          <w:p>
+            <w:pPr>
+              <w:spacing w:line="480" w:lineRule="auto"/>
+              <w:rPr>
+                <w:rFonts w:ascii="Arial" w:hAnsi="Arial" w:cs="Arial"/>
+                <w:sz w:val="22"/>
+                <w:szCs w:val="22"/>
+              </w:rPr>
+            </w:pPr>
+            <w:r>
+              <w:rPr>
+                <w:rFonts w:ascii="Arial" w:hAnsi="Arial" w:cs="Arial"/>
+                <w:sz w:val="22"/>
+                <w:szCs w:val="22"/>
+              </w:rPr>
+              <w:t>2026011302</w:t>
             </w:r>
           </w:p>
         </w:tc>
         <w:tc>
           <w:tcPr>
             <w:tcW w:w="2272" w:type="dxa"/>
+            <w:tcBorders>
+              <w:top w:val="single" w:sz="4" w:space="0" w:color="auto"/>
+              <w:bottom w:val="nil"/>
+            </w:tcBorders>
           </w:tcPr>
           <w:p>
             <w:pPr>
@@ -868,72 +1471,87 @@
         </w:trPr>
         <w:tc>
           <w:tcPr>
-            <w:tcW w:w="4816" w:type="dxa"/>
+            <w:tcW w:w="9355" w:type="dxa"/>
+            <w:gridSpan w:val="3"/>
+            <w:tcBorders>
+              <w:top w:val="nil"/>
+              <w:bottom w:val="single" w:sz="4" w:space="0" w:color="auto"/>
+            </w:tcBorders>
             <w:vAlign w:val="center"/>
           </w:tcPr>
           <w:p>
             <w:pPr>
               <w:spacing w:line="480" w:lineRule="auto"/>
-              <w:rPr>
-                <w:rFonts w:ascii="Arial" w:hAnsi="Arial" w:cs="Arial"/>
-                <w:sz w:val="22"/>
-                <w:szCs w:val="22"/>
-              </w:rPr>
-            </w:pPr>
-            <w:r>
-              <w:rPr>
-                <w:rFonts w:ascii="Arial" w:hAnsi="Arial" w:cs="Arial"/>
-                <w:color w:val="000000" w:themeColor="text1"/>
-                <w:sz w:val="22"/>
-                <w:szCs w:val="22"/>
-              </w:rPr>
-              <w:t>Franklin Martin Fuentes Chávez</w:t>
-            </w:r>
-          </w:p>
-        </w:tc>
-        <w:tc>
-          <w:tcPr>
-            <w:tcW w:w="2267" w:type="dxa"/>
-          </w:tcPr>
-          <w:p>
-            <w:pPr>
-              <w:spacing w:line="480" w:lineRule="auto"/>
-              <w:rPr>
-                <w:rFonts w:ascii="Arial" w:hAnsi="Arial" w:cs="Arial"/>
-                <w:sz w:val="22"/>
-                <w:szCs w:val="22"/>
-              </w:rPr>
-            </w:pPr>
-            <w:r>
-              <w:rPr>
-                <w:rFonts w:ascii="Arial" w:hAnsi="Arial" w:cs="Arial"/>
-                <w:sz w:val="22"/>
-                <w:szCs w:val="22"/>
-              </w:rPr>
-              <w:t>2026011819</w:t>
-            </w:r>
-          </w:p>
-        </w:tc>
-        <w:tc>
-          <w:tcPr>
-            <w:tcW w:w="2272" w:type="dxa"/>
-          </w:tcPr>
-          <w:p>
-            <w:pPr>
-              <w:spacing w:line="480" w:lineRule="auto"/>
-              <w:rPr>
-                <w:rFonts w:ascii="Arial" w:hAnsi="Arial" w:cs="Arial"/>
-                <w:sz w:val="22"/>
-                <w:szCs w:val="22"/>
-              </w:rPr>
-            </w:pPr>
-            <w:r>
-              <w:rPr>
-                <w:rFonts w:ascii="Arial" w:hAnsi="Arial" w:cs="Arial"/>
-                <w:sz w:val="22"/>
-                <w:szCs w:val="22"/>
-              </w:rPr>
-              <w:t>Sí</w:t>
+              <w:jc w:val="center"/>
+              <w:rPr>
+                <w:rFonts w:ascii="Arial" w:hAnsi="Arial" w:cs="Arial"/>
+                <w:sz w:val="22"/>
+                <w:szCs w:val="22"/>
+              </w:rPr>
+            </w:pPr>
+            <w:r>
+              <w:rPr>
+                <w:noProof/>
+              </w:rPr>
+              <w:drawing>
+                <wp:inline distT="0" distB="0" distL="0" distR="0" wp14:anchorId="060DAA91" wp14:editId="1BC543C8">
+                  <wp:extent cx="1786466" cy="1782911"/>
+                  <wp:effectExtent l="152400" t="171450" r="366395" b="370205"/>
+                  <wp:docPr id="3" name="Imagen 1"/>
+                  <wp:cNvGraphicFramePr>
+                    <a:graphicFrameLocks xmlns:a="http://schemas.openxmlformats.org/drawingml/2006/main" noChangeAspect="1"/>
+                  </wp:cNvGraphicFramePr>
+                  <a:graphic xmlns:a="http://schemas.openxmlformats.org/drawingml/2006/main">
+                    <a:graphicData uri="http://schemas.openxmlformats.org/drawingml/2006/picture">
+                      <pic:pic xmlns:pic="http://schemas.openxmlformats.org/drawingml/2006/picture">
+                        <pic:nvPicPr>
+                          <pic:cNvPr id="3" name="Imagen 3"/>
+                          <pic:cNvPicPr>
+                            <a:picLocks noChangeAspect="1"/>
+                          </pic:cNvPicPr>
+                        </pic:nvPicPr>
+                        <pic:blipFill rotWithShape="1">
+                          <a:blip r:embed="rId13" cstate="print">
+                            <a:extLst>
+                              <a:ext uri="{28A0092B-C50C-407E-A947-70E740481C1C}">
+                                <a14:useLocalDpi xmlns:a14="http://schemas.microsoft.com/office/drawing/2010/main" val="0"/>
+                              </a:ext>
+                            </a:extLst>
+                          </a:blip>
+                          <a:srcRect t="31328" b="12548"/>
+                          <a:stretch>
+                            <a:fillRect/>
+                          </a:stretch>
+                        </pic:blipFill>
+                        <pic:spPr bwMode="auto">
+                          <a:xfrm>
+                            <a:off x="0" y="0"/>
+                            <a:ext cx="1798835" cy="1795255"/>
+                          </a:xfrm>
+                          <a:prstGeom prst="rect">
+                            <a:avLst/>
+                          </a:prstGeom>
+                          <a:ln>
+                            <a:noFill/>
+                          </a:ln>
+                          <a:effectLst>
+                            <a:outerShdw blurRad="292100" dist="139700" dir="2700000" algn="tl" rotWithShape="0">
+                              <a:srgbClr val="333333">
+                                <a:alpha val="65000"/>
+                              </a:srgbClr>
+                            </a:outerShdw>
+                          </a:effectLst>
+                          <a:extLst>
+                            <a:ext uri="{53640926-AAD7-44D8-BBD7-CCE9431645EC}">
+                              <a14:shadowObscured xmlns:a14="http://schemas.microsoft.com/office/drawing/2010/main"/>
+                            </a:ext>
+                          </a:extLst>
+                        </pic:spPr>
+                      </pic:pic>
+                    </a:graphicData>
+                  </a:graphic>
+                </wp:inline>
+              </w:drawing>
             </w:r>
           </w:p>
         </w:tc>
@@ -945,6 +1563,9 @@
         <w:tc>
           <w:tcPr>
             <w:tcW w:w="4816" w:type="dxa"/>
+            <w:tcBorders>
+              <w:top w:val="single" w:sz="4" w:space="0" w:color="auto"/>
+            </w:tcBorders>
             <w:vAlign w:val="center"/>
           </w:tcPr>
           <w:p>
@@ -963,36 +1584,42 @@
                 <w:sz w:val="22"/>
                 <w:szCs w:val="22"/>
               </w:rPr>
-              <w:t>Gabriel Alejandro Fuentes Chavarría</w:t>
+              <w:t>Cindy Shaiel Canales Campos</w:t>
             </w:r>
           </w:p>
         </w:tc>
         <w:tc>
           <w:tcPr>
             <w:tcW w:w="2267" w:type="dxa"/>
-          </w:tcPr>
-          <w:p>
-            <w:pPr>
-              <w:spacing w:line="480" w:lineRule="auto"/>
-              <w:rPr>
-                <w:rFonts w:ascii="Arial" w:hAnsi="Arial" w:cs="Arial"/>
-                <w:sz w:val="22"/>
-                <w:szCs w:val="22"/>
-              </w:rPr>
-            </w:pPr>
-            <w:r>
-              <w:rPr>
-                <w:rFonts w:ascii="Arial" w:hAnsi="Arial" w:cs="Arial"/>
-                <w:sz w:val="22"/>
-                <w:szCs w:val="22"/>
-              </w:rPr>
-              <w:t>2026010123</w:t>
+            <w:tcBorders>
+              <w:top w:val="single" w:sz="4" w:space="0" w:color="auto"/>
+            </w:tcBorders>
+          </w:tcPr>
+          <w:p>
+            <w:pPr>
+              <w:spacing w:line="480" w:lineRule="auto"/>
+              <w:rPr>
+                <w:rFonts w:ascii="Arial" w:hAnsi="Arial" w:cs="Arial"/>
+                <w:sz w:val="22"/>
+                <w:szCs w:val="22"/>
+              </w:rPr>
+            </w:pPr>
+            <w:r>
+              <w:rPr>
+                <w:rFonts w:ascii="Arial" w:hAnsi="Arial" w:cs="Arial"/>
+                <w:sz w:val="22"/>
+                <w:szCs w:val="22"/>
+              </w:rPr>
+              <w:t>2026011285</w:t>
             </w:r>
           </w:p>
         </w:tc>
         <w:tc>
           <w:tcPr>
             <w:tcW w:w="2272" w:type="dxa"/>
+            <w:tcBorders>
+              <w:top w:val="single" w:sz="4" w:space="0" w:color="auto"/>
+            </w:tcBorders>
           </w:tcPr>
           <w:p>
             <w:pPr>
@@ -1020,72 +1647,84 @@
         </w:trPr>
         <w:tc>
           <w:tcPr>
-            <w:tcW w:w="4816" w:type="dxa"/>
+            <w:tcW w:w="9355" w:type="dxa"/>
+            <w:gridSpan w:val="3"/>
+            <w:tcBorders>
+              <w:bottom w:val="single" w:sz="4" w:space="0" w:color="auto"/>
+            </w:tcBorders>
             <w:vAlign w:val="center"/>
           </w:tcPr>
           <w:p>
             <w:pPr>
               <w:spacing w:line="480" w:lineRule="auto"/>
-              <w:rPr>
-                <w:rFonts w:ascii="Arial" w:hAnsi="Arial" w:cs="Arial"/>
-                <w:sz w:val="22"/>
-                <w:szCs w:val="22"/>
-              </w:rPr>
-            </w:pPr>
-            <w:r>
-              <w:rPr>
-                <w:rFonts w:ascii="Arial" w:hAnsi="Arial" w:cs="Arial"/>
-                <w:color w:val="000000" w:themeColor="text1"/>
-                <w:sz w:val="22"/>
-                <w:szCs w:val="22"/>
-              </w:rPr>
-              <w:t>Gabriela Michelle Pérez Portillo</w:t>
-            </w:r>
-          </w:p>
-        </w:tc>
-        <w:tc>
-          <w:tcPr>
-            <w:tcW w:w="2267" w:type="dxa"/>
-          </w:tcPr>
-          <w:p>
-            <w:pPr>
-              <w:spacing w:line="480" w:lineRule="auto"/>
-              <w:rPr>
-                <w:rFonts w:ascii="Arial" w:hAnsi="Arial" w:cs="Arial"/>
-                <w:sz w:val="22"/>
-                <w:szCs w:val="22"/>
-              </w:rPr>
-            </w:pPr>
-            <w:r>
-              <w:rPr>
-                <w:rFonts w:ascii="Arial" w:hAnsi="Arial" w:cs="Arial"/>
-                <w:sz w:val="22"/>
-                <w:szCs w:val="22"/>
-              </w:rPr>
-              <w:t>2026010762</w:t>
-            </w:r>
-          </w:p>
-        </w:tc>
-        <w:tc>
-          <w:tcPr>
-            <w:tcW w:w="2272" w:type="dxa"/>
-          </w:tcPr>
-          <w:p>
-            <w:pPr>
-              <w:spacing w:line="480" w:lineRule="auto"/>
-              <w:rPr>
-                <w:rFonts w:ascii="Arial" w:hAnsi="Arial" w:cs="Arial"/>
-                <w:sz w:val="22"/>
-                <w:szCs w:val="22"/>
-              </w:rPr>
-            </w:pPr>
-            <w:r>
-              <w:rPr>
-                <w:rFonts w:ascii="Arial" w:hAnsi="Arial" w:cs="Arial"/>
-                <w:sz w:val="22"/>
-                <w:szCs w:val="22"/>
-              </w:rPr>
-              <w:t>Sí</w:t>
+              <w:jc w:val="center"/>
+              <w:rPr>
+                <w:rFonts w:ascii="Arial" w:hAnsi="Arial" w:cs="Arial"/>
+                <w:sz w:val="22"/>
+                <w:szCs w:val="22"/>
+              </w:rPr>
+            </w:pPr>
+            <w:r>
+              <w:rPr>
+                <w:noProof/>
+              </w:rPr>
+              <w:drawing>
+                <wp:inline distT="0" distB="0" distL="0" distR="0" wp14:anchorId="476865C7" wp14:editId="1EEFC9E3">
+                  <wp:extent cx="1913255" cy="1726043"/>
+                  <wp:effectExtent l="152400" t="171450" r="353695" b="369570"/>
+                  <wp:docPr id="11" name="Imagen 1"/>
+                  <wp:cNvGraphicFramePr>
+                    <a:graphicFrameLocks xmlns:a="http://schemas.openxmlformats.org/drawingml/2006/main" noChangeAspect="1"/>
+                  </wp:cNvGraphicFramePr>
+                  <a:graphic xmlns:a="http://schemas.openxmlformats.org/drawingml/2006/main">
+                    <a:graphicData uri="http://schemas.openxmlformats.org/drawingml/2006/picture">
+                      <pic:pic xmlns:pic="http://schemas.openxmlformats.org/drawingml/2006/picture">
+                        <pic:nvPicPr>
+                          <pic:cNvPr id="11" name="Imagen 11"/>
+                          <pic:cNvPicPr>
+                            <a:picLocks noChangeAspect="1"/>
+                          </pic:cNvPicPr>
+                        </pic:nvPicPr>
+                        <pic:blipFill rotWithShape="1">
+                          <a:blip r:embed="rId14" cstate="print">
+                            <a:extLst>
+                              <a:ext uri="{28A0092B-C50C-407E-A947-70E740481C1C}">
+                                <a14:useLocalDpi xmlns:a14="http://schemas.microsoft.com/office/drawing/2010/main" val="0"/>
+                              </a:ext>
+                            </a:extLst>
+                          </a:blip>
+                          <a:srcRect t="4560" r="21249"/>
+                          <a:stretch/>
+                        </pic:blipFill>
+                        <pic:spPr bwMode="auto">
+                          <a:xfrm>
+                            <a:off x="0" y="0"/>
+                            <a:ext cx="1914539" cy="1727201"/>
+                          </a:xfrm>
+                          <a:prstGeom prst="rect">
+                            <a:avLst/>
+                          </a:prstGeom>
+                          <a:ln>
+                            <a:noFill/>
+                          </a:ln>
+                          <a:effectLst>
+                            <a:outerShdw blurRad="292100" dist="139700" dir="2700000" algn="tl" rotWithShape="0">
+                              <a:srgbClr val="333333">
+                                <a:alpha val="65000"/>
+                              </a:srgbClr>
+                            </a:outerShdw>
+                          </a:effectLst>
+                          <a:extLst>
+                            <a:ext uri="{53640926-AAD7-44D8-BBD7-CCE9431645EC}">
+                              <a14:shadowObscured xmlns:a14="http://schemas.microsoft.com/office/drawing/2010/main"/>
+                            </a:ext>
+                          </a:extLst>
+                        </pic:spPr>
+                      </pic:pic>
+                    </a:graphicData>
+                  </a:graphic>
+                </wp:inline>
+              </w:drawing>
             </w:r>
           </w:p>
         </w:tc>
@@ -1097,6 +1736,10 @@
         <w:tc>
           <w:tcPr>
             <w:tcW w:w="4816" w:type="dxa"/>
+            <w:tcBorders>
+              <w:top w:val="single" w:sz="4" w:space="0" w:color="auto"/>
+              <w:bottom w:val="nil"/>
+            </w:tcBorders>
             <w:vAlign w:val="center"/>
           </w:tcPr>
           <w:p>
@@ -1115,36 +1758,45 @@
                 <w:sz w:val="22"/>
                 <w:szCs w:val="22"/>
               </w:rPr>
-              <w:t>Jesús Roberto Sánchez Orellana</w:t>
+              <w:lastRenderedPageBreak/>
+              <w:t>Emerson Eduardo Candido Joya</w:t>
             </w:r>
           </w:p>
         </w:tc>
         <w:tc>
           <w:tcPr>
             <w:tcW w:w="2267" w:type="dxa"/>
-          </w:tcPr>
-          <w:p>
-            <w:pPr>
-              <w:spacing w:line="480" w:lineRule="auto"/>
-              <w:rPr>
-                <w:rFonts w:ascii="Arial" w:hAnsi="Arial" w:cs="Arial"/>
-                <w:sz w:val="22"/>
-                <w:szCs w:val="22"/>
-              </w:rPr>
-            </w:pPr>
-            <w:r>
-              <w:rPr>
-                <w:rFonts w:ascii="Arial" w:hAnsi="Arial" w:cs="Arial"/>
-                <w:sz w:val="22"/>
-                <w:szCs w:val="22"/>
-              </w:rPr>
-              <w:t>2026010931</w:t>
+            <w:tcBorders>
+              <w:top w:val="single" w:sz="4" w:space="0" w:color="auto"/>
+              <w:bottom w:val="nil"/>
+            </w:tcBorders>
+          </w:tcPr>
+          <w:p>
+            <w:pPr>
+              <w:spacing w:line="480" w:lineRule="auto"/>
+              <w:rPr>
+                <w:rFonts w:ascii="Arial" w:hAnsi="Arial" w:cs="Arial"/>
+                <w:sz w:val="22"/>
+                <w:szCs w:val="22"/>
+              </w:rPr>
+            </w:pPr>
+            <w:r>
+              <w:rPr>
+                <w:rFonts w:ascii="Arial" w:hAnsi="Arial" w:cs="Arial"/>
+                <w:sz w:val="22"/>
+                <w:szCs w:val="22"/>
+              </w:rPr>
+              <w:t>2026010233</w:t>
             </w:r>
           </w:p>
         </w:tc>
         <w:tc>
           <w:tcPr>
             <w:tcW w:w="2272" w:type="dxa"/>
+            <w:tcBorders>
+              <w:top w:val="single" w:sz="4" w:space="0" w:color="auto"/>
+              <w:bottom w:val="nil"/>
+            </w:tcBorders>
           </w:tcPr>
           <w:p>
             <w:pPr>
@@ -1172,72 +1824,84 @@
         </w:trPr>
         <w:tc>
           <w:tcPr>
-            <w:tcW w:w="4816" w:type="dxa"/>
+            <w:tcW w:w="9355" w:type="dxa"/>
+            <w:gridSpan w:val="3"/>
+            <w:tcBorders>
+              <w:top w:val="nil"/>
+              <w:bottom w:val="single" w:sz="4" w:space="0" w:color="auto"/>
+            </w:tcBorders>
             <w:vAlign w:val="center"/>
           </w:tcPr>
           <w:p>
             <w:pPr>
               <w:spacing w:line="480" w:lineRule="auto"/>
-              <w:rPr>
-                <w:rFonts w:ascii="Arial" w:hAnsi="Arial" w:cs="Arial"/>
-                <w:sz w:val="22"/>
-                <w:szCs w:val="22"/>
-              </w:rPr>
-            </w:pPr>
-            <w:r>
-              <w:rPr>
-                <w:rFonts w:ascii="Arial" w:hAnsi="Arial" w:cs="Arial"/>
-                <w:color w:val="000000" w:themeColor="text1"/>
-                <w:sz w:val="22"/>
-                <w:szCs w:val="22"/>
-              </w:rPr>
-              <w:t>Jireh Alexander Trigueros Pérez</w:t>
-            </w:r>
-          </w:p>
-        </w:tc>
-        <w:tc>
-          <w:tcPr>
-            <w:tcW w:w="2267" w:type="dxa"/>
-          </w:tcPr>
-          <w:p>
-            <w:pPr>
-              <w:spacing w:line="480" w:lineRule="auto"/>
-              <w:rPr>
-                <w:rFonts w:ascii="Arial" w:hAnsi="Arial" w:cs="Arial"/>
-                <w:sz w:val="22"/>
-                <w:szCs w:val="22"/>
-              </w:rPr>
-            </w:pPr>
-            <w:r>
-              <w:rPr>
-                <w:rFonts w:ascii="Arial" w:hAnsi="Arial" w:cs="Arial"/>
-                <w:sz w:val="22"/>
-                <w:szCs w:val="22"/>
-              </w:rPr>
-              <w:t>2026010325</w:t>
-            </w:r>
-          </w:p>
-        </w:tc>
-        <w:tc>
-          <w:tcPr>
-            <w:tcW w:w="2272" w:type="dxa"/>
-          </w:tcPr>
-          <w:p>
-            <w:pPr>
-              <w:spacing w:line="480" w:lineRule="auto"/>
-              <w:rPr>
-                <w:rFonts w:ascii="Arial" w:hAnsi="Arial" w:cs="Arial"/>
-                <w:sz w:val="22"/>
-                <w:szCs w:val="22"/>
-              </w:rPr>
-            </w:pPr>
-            <w:r>
-              <w:rPr>
-                <w:rFonts w:ascii="Arial" w:hAnsi="Arial" w:cs="Arial"/>
-                <w:sz w:val="22"/>
-                <w:szCs w:val="22"/>
-              </w:rPr>
-              <w:t>Sí</w:t>
+              <w:jc w:val="center"/>
+              <w:rPr>
+                <w:rFonts w:ascii="Arial" w:hAnsi="Arial" w:cs="Arial"/>
+                <w:sz w:val="22"/>
+                <w:szCs w:val="22"/>
+              </w:rPr>
+            </w:pPr>
+            <w:r>
+              <w:rPr>
+                <w:rFonts w:ascii="Arial" w:hAnsi="Arial" w:cs="Arial"/>
+                <w:noProof/>
+                <w:sz w:val="22"/>
+                <w:szCs w:val="22"/>
+              </w:rPr>
+              <w:drawing>
+                <wp:inline distT="0" distB="0" distL="0" distR="0" wp14:anchorId="7EB58053" wp14:editId="32F292A0">
+                  <wp:extent cx="1642499" cy="1948543"/>
+                  <wp:effectExtent l="0" t="0" r="0" b="0"/>
+                  <wp:docPr id="872547852" name="Imagen 26"/>
+                  <wp:cNvGraphicFramePr>
+                    <a:graphicFrameLocks xmlns:a="http://schemas.openxmlformats.org/drawingml/2006/main" noChangeAspect="1"/>
+                  </wp:cNvGraphicFramePr>
+                  <a:graphic xmlns:a="http://schemas.openxmlformats.org/drawingml/2006/main">
+                    <a:graphicData uri="http://schemas.openxmlformats.org/drawingml/2006/picture">
+                      <pic:pic xmlns:pic="http://schemas.openxmlformats.org/drawingml/2006/picture">
+                        <pic:nvPicPr>
+                          <pic:cNvPr id="0" name="Picture 5"/>
+                          <pic:cNvPicPr>
+                            <a:picLocks noChangeAspect="1" noChangeArrowheads="1"/>
+                          </pic:cNvPicPr>
+                        </pic:nvPicPr>
+                        <pic:blipFill rotWithShape="1">
+                          <a:blip r:embed="rId15" cstate="print">
+                            <a:extLst>
+                              <a:ext uri="{28A0092B-C50C-407E-A947-70E740481C1C}">
+                                <a14:useLocalDpi xmlns:a14="http://schemas.microsoft.com/office/drawing/2010/main" val="0"/>
+                              </a:ext>
+                            </a:extLst>
+                          </a:blip>
+                          <a:srcRect t="11026"/>
+                          <a:stretch>
+                            <a:fillRect/>
+                          </a:stretch>
+                        </pic:blipFill>
+                        <pic:spPr bwMode="auto">
+                          <a:xfrm>
+                            <a:off x="0" y="0"/>
+                            <a:ext cx="1667992" cy="1978786"/>
+                          </a:xfrm>
+                          <a:prstGeom prst="rect">
+                            <a:avLst/>
+                          </a:prstGeom>
+                          <a:noFill/>
+                          <a:ln>
+                            <a:noFill/>
+                          </a:ln>
+                          <a:extLst>
+                            <a:ext uri="{53640926-AAD7-44D8-BBD7-CCE9431645EC}">
+                              <a14:shadowObscured xmlns:a14="http://schemas.microsoft.com/office/drawing/2010/main"/>
+                            </a:ext>
+                          </a:extLst>
+                        </pic:spPr>
+                      </pic:pic>
+                    </a:graphicData>
+                  </a:graphic>
+                </wp:inline>
+              </w:drawing>
             </w:r>
           </w:p>
         </w:tc>
@@ -1249,6 +1913,9 @@
         <w:tc>
           <w:tcPr>
             <w:tcW w:w="4816" w:type="dxa"/>
+            <w:tcBorders>
+              <w:top w:val="single" w:sz="4" w:space="0" w:color="auto"/>
+            </w:tcBorders>
             <w:vAlign w:val="center"/>
           </w:tcPr>
           <w:p>
@@ -1267,36 +1934,42 @@
                 <w:sz w:val="22"/>
                 <w:szCs w:val="22"/>
               </w:rPr>
-              <w:t>Julio Cesar Pérez Salazar</w:t>
+              <w:t>Franklin Martin Fuentes Chávez</w:t>
             </w:r>
           </w:p>
         </w:tc>
         <w:tc>
           <w:tcPr>
             <w:tcW w:w="2267" w:type="dxa"/>
-          </w:tcPr>
-          <w:p>
-            <w:pPr>
-              <w:spacing w:line="480" w:lineRule="auto"/>
-              <w:rPr>
-                <w:rFonts w:ascii="Arial" w:hAnsi="Arial" w:cs="Arial"/>
-                <w:sz w:val="22"/>
-                <w:szCs w:val="22"/>
-              </w:rPr>
-            </w:pPr>
-            <w:r>
-              <w:rPr>
-                <w:rFonts w:ascii="Arial" w:hAnsi="Arial" w:cs="Arial"/>
-                <w:sz w:val="22"/>
-                <w:szCs w:val="22"/>
-              </w:rPr>
-              <w:t>2026010236</w:t>
+            <w:tcBorders>
+              <w:top w:val="single" w:sz="4" w:space="0" w:color="auto"/>
+            </w:tcBorders>
+          </w:tcPr>
+          <w:p>
+            <w:pPr>
+              <w:spacing w:line="480" w:lineRule="auto"/>
+              <w:rPr>
+                <w:rFonts w:ascii="Arial" w:hAnsi="Arial" w:cs="Arial"/>
+                <w:sz w:val="22"/>
+                <w:szCs w:val="22"/>
+              </w:rPr>
+            </w:pPr>
+            <w:r>
+              <w:rPr>
+                <w:rFonts w:ascii="Arial" w:hAnsi="Arial" w:cs="Arial"/>
+                <w:sz w:val="22"/>
+                <w:szCs w:val="22"/>
+              </w:rPr>
+              <w:t>2026011819</w:t>
             </w:r>
           </w:p>
         </w:tc>
         <w:tc>
           <w:tcPr>
             <w:tcW w:w="2272" w:type="dxa"/>
+            <w:tcBorders>
+              <w:top w:val="single" w:sz="4" w:space="0" w:color="auto"/>
+            </w:tcBorders>
           </w:tcPr>
           <w:p>
             <w:pPr>
@@ -1324,7 +1997,101 @@
         </w:trPr>
         <w:tc>
           <w:tcPr>
+            <w:tcW w:w="9355" w:type="dxa"/>
+            <w:gridSpan w:val="3"/>
+            <w:tcBorders>
+              <w:bottom w:val="single" w:sz="4" w:space="0" w:color="auto"/>
+            </w:tcBorders>
+            <w:vAlign w:val="center"/>
+          </w:tcPr>
+          <w:p>
+            <w:pPr>
+              <w:spacing w:line="480" w:lineRule="auto"/>
+              <w:jc w:val="center"/>
+              <w:rPr>
+                <w:rFonts w:ascii="Arial" w:hAnsi="Arial" w:cs="Arial"/>
+                <w:sz w:val="22"/>
+                <w:szCs w:val="22"/>
+              </w:rPr>
+            </w:pPr>
+            <w:r>
+              <w:rPr>
+                <w:noProof/>
+              </w:rPr>
+              <w:drawing>
+                <wp:inline distT="0" distB="0" distL="0" distR="0" wp14:anchorId="1B27932F" wp14:editId="4096345D">
+                  <wp:extent cx="1580905" cy="1635578"/>
+                  <wp:effectExtent l="152400" t="171450" r="343535" b="365125"/>
+                  <wp:docPr id="5" name="Imagen 1"/>
+                  <wp:cNvGraphicFramePr>
+                    <a:graphicFrameLocks xmlns:a="http://schemas.openxmlformats.org/drawingml/2006/main" noChangeAspect="1"/>
+                  </wp:cNvGraphicFramePr>
+                  <a:graphic xmlns:a="http://schemas.openxmlformats.org/drawingml/2006/main">
+                    <a:graphicData uri="http://schemas.openxmlformats.org/drawingml/2006/picture">
+                      <pic:pic xmlns:pic="http://schemas.openxmlformats.org/drawingml/2006/picture">
+                        <pic:nvPicPr>
+                          <pic:cNvPr id="5" name="Imagen 5"/>
+                          <pic:cNvPicPr>
+                            <a:picLocks noChangeAspect="1"/>
+                          </pic:cNvPicPr>
+                        </pic:nvPicPr>
+                        <pic:blipFill rotWithShape="1">
+                          <a:blip r:embed="rId16" cstate="print">
+                            <a:extLst>
+                              <a:ext uri="{28A0092B-C50C-407E-A947-70E740481C1C}">
+                                <a14:useLocalDpi xmlns:a14="http://schemas.microsoft.com/office/drawing/2010/main" val="0"/>
+                              </a:ext>
+                            </a:extLst>
+                          </a:blip>
+                          <a:srcRect t="8715" b="13726"/>
+                          <a:stretch>
+                            <a:fillRect/>
+                          </a:stretch>
+                        </pic:blipFill>
+                        <pic:spPr bwMode="auto">
+                          <a:xfrm>
+                            <a:off x="0" y="0"/>
+                            <a:ext cx="1587177" cy="1642067"/>
+                          </a:xfrm>
+                          <a:prstGeom prst="rect">
+                            <a:avLst/>
+                          </a:prstGeom>
+                          <a:ln>
+                            <a:noFill/>
+                          </a:ln>
+                          <a:effectLst>
+                            <a:outerShdw blurRad="292100" dist="139700" dir="2700000" algn="tl" rotWithShape="0">
+                              <a:srgbClr val="333333">
+                                <a:alpha val="65000"/>
+                              </a:srgbClr>
+                            </a:outerShdw>
+                          </a:effectLst>
+                          <a:extLst>
+                            <a:ext uri="{53640926-AAD7-44D8-BBD7-CCE9431645EC}">
+                              <a14:shadowObscured xmlns:a14="http://schemas.microsoft.com/office/drawing/2010/main"/>
+                            </a:ext>
+                          </a:extLst>
+                        </pic:spPr>
+                      </pic:pic>
+                    </a:graphicData>
+                  </a:graphic>
+                </wp:inline>
+              </w:drawing>
+            </w:r>
+          </w:p>
+        </w:tc>
+      </w:tr>
+      <w:tr>
+        <w:trPr>
+          <w:trHeight w:val="300"/>
+        </w:trPr>
+        <w:tc>
+          <w:tcPr>
             <w:tcW w:w="4816" w:type="dxa"/>
+            <w:tcBorders>
+              <w:top w:val="single" w:sz="4" w:space="0" w:color="auto"/>
+              <w:bottom w:val="nil"/>
+            </w:tcBorders>
             <w:vAlign w:val="center"/>
           </w:tcPr>
           <w:p>
@@ -1343,6 +2110,889 @@
                 <w:sz w:val="22"/>
                 <w:szCs w:val="22"/>
               </w:rPr>
+              <w:t>Gabriel Alejandro Fuentes Chavarría</w:t>
+            </w:r>
+          </w:p>
+        </w:tc>
+        <w:tc>
+          <w:tcPr>
+            <w:tcW w:w="2267" w:type="dxa"/>
+            <w:tcBorders>
+              <w:top w:val="single" w:sz="4" w:space="0" w:color="auto"/>
+              <w:bottom w:val="nil"/>
+            </w:tcBorders>
+          </w:tcPr>
+          <w:p>
+            <w:pPr>
+              <w:spacing w:line="480" w:lineRule="auto"/>
+              <w:rPr>
+                <w:rFonts w:ascii="Arial" w:hAnsi="Arial" w:cs="Arial"/>
+                <w:sz w:val="22"/>
+                <w:szCs w:val="22"/>
+              </w:rPr>
+            </w:pPr>
+            <w:r>
+              <w:rPr>
+                <w:rFonts w:ascii="Arial" w:hAnsi="Arial" w:cs="Arial"/>
+                <w:sz w:val="22"/>
+                <w:szCs w:val="22"/>
+              </w:rPr>
+              <w:t>2026010123</w:t>
+            </w:r>
+          </w:p>
+        </w:tc>
+        <w:tc>
+          <w:tcPr>
+            <w:tcW w:w="2272" w:type="dxa"/>
+            <w:tcBorders>
+              <w:top w:val="single" w:sz="4" w:space="0" w:color="auto"/>
+              <w:bottom w:val="nil"/>
+            </w:tcBorders>
+          </w:tcPr>
+          <w:p>
+            <w:pPr>
+              <w:spacing w:line="480" w:lineRule="auto"/>
+              <w:rPr>
+                <w:rFonts w:ascii="Arial" w:hAnsi="Arial" w:cs="Arial"/>
+                <w:sz w:val="22"/>
+                <w:szCs w:val="22"/>
+              </w:rPr>
+            </w:pPr>
+            <w:r>
+              <w:rPr>
+                <w:rFonts w:ascii="Arial" w:hAnsi="Arial" w:cs="Arial"/>
+                <w:sz w:val="22"/>
+                <w:szCs w:val="22"/>
+              </w:rPr>
+              <w:t>Sí</w:t>
+            </w:r>
+          </w:p>
+        </w:tc>
+      </w:tr>
+      <w:tr>
+        <w:trPr>
+          <w:trHeight w:val="300"/>
+        </w:trPr>
+        <w:tc>
+          <w:tcPr>
+            <w:tcW w:w="9355" w:type="dxa"/>
+            <w:gridSpan w:val="3"/>
+            <w:tcBorders>
+              <w:top w:val="nil"/>
+              <w:bottom w:val="single" w:sz="4" w:space="0" w:color="auto"/>
+            </w:tcBorders>
+            <w:vAlign w:val="center"/>
+          </w:tcPr>
+          <w:p>
+            <w:pPr>
+              <w:spacing w:line="480" w:lineRule="auto"/>
+              <w:jc w:val="center"/>
+              <w:rPr>
+                <w:rFonts w:ascii="Arial" w:hAnsi="Arial" w:cs="Arial"/>
+                <w:sz w:val="22"/>
+                <w:szCs w:val="22"/>
+              </w:rPr>
+            </w:pPr>
+            <w:r>
+              <w:rPr>
+                <w:noProof/>
+              </w:rPr>
+              <w:drawing>
+                <wp:inline distT="0" distB="0" distL="0" distR="0" wp14:anchorId="5BEF32B5" wp14:editId="40AFCA59">
+                  <wp:extent cx="1638687" cy="1828800"/>
+                  <wp:effectExtent l="152400" t="152400" r="361950" b="361950"/>
+                  <wp:docPr id="2" name="Imagen 1"/>
+                  <wp:cNvGraphicFramePr>
+                    <a:graphicFrameLocks xmlns:a="http://schemas.openxmlformats.org/drawingml/2006/main" noChangeAspect="1"/>
+                  </wp:cNvGraphicFramePr>
+                  <a:graphic xmlns:a="http://schemas.openxmlformats.org/drawingml/2006/main">
+                    <a:graphicData uri="http://schemas.openxmlformats.org/drawingml/2006/picture">
+                      <pic:pic xmlns:pic="http://schemas.openxmlformats.org/drawingml/2006/picture">
+                        <pic:nvPicPr>
+                          <pic:cNvPr id="2" name="Imagen 2"/>
+                          <pic:cNvPicPr>
+                            <a:picLocks noChangeAspect="1"/>
+                          </pic:cNvPicPr>
+                        </pic:nvPicPr>
+                        <pic:blipFill rotWithShape="1">
+                          <a:blip r:embed="rId17" cstate="print">
+                            <a:extLst>
+                              <a:ext uri="{28A0092B-C50C-407E-A947-70E740481C1C}">
+                                <a14:useLocalDpi xmlns:a14="http://schemas.microsoft.com/office/drawing/2010/main" val="0"/>
+                              </a:ext>
+                            </a:extLst>
+                          </a:blip>
+                          <a:srcRect t="4871" b="11465"/>
+                          <a:stretch>
+                            <a:fillRect/>
+                          </a:stretch>
+                        </pic:blipFill>
+                        <pic:spPr bwMode="auto">
+                          <a:xfrm>
+                            <a:off x="0" y="0"/>
+                            <a:ext cx="1642854" cy="1833450"/>
+                          </a:xfrm>
+                          <a:prstGeom prst="rect">
+                            <a:avLst/>
+                          </a:prstGeom>
+                          <a:ln>
+                            <a:noFill/>
+                          </a:ln>
+                          <a:effectLst>
+                            <a:outerShdw blurRad="292100" dist="139700" dir="2700000" algn="tl" rotWithShape="0">
+                              <a:srgbClr val="333333">
+                                <a:alpha val="65000"/>
+                              </a:srgbClr>
+                            </a:outerShdw>
+                          </a:effectLst>
+                          <a:extLst>
+                            <a:ext uri="{53640926-AAD7-44D8-BBD7-CCE9431645EC}">
+                              <a14:shadowObscured xmlns:a14="http://schemas.microsoft.com/office/drawing/2010/main"/>
+                            </a:ext>
+                          </a:extLst>
+                        </pic:spPr>
+                      </pic:pic>
+                    </a:graphicData>
+                  </a:graphic>
+                </wp:inline>
+              </w:drawing>
+            </w:r>
+          </w:p>
+        </w:tc>
+      </w:tr>
+      <w:tr>
+        <w:trPr>
+          <w:trHeight w:val="300"/>
+        </w:trPr>
+        <w:tc>
+          <w:tcPr>
+            <w:tcW w:w="4816" w:type="dxa"/>
+            <w:tcBorders>
+              <w:top w:val="single" w:sz="4" w:space="0" w:color="auto"/>
+            </w:tcBorders>
+            <w:vAlign w:val="center"/>
+          </w:tcPr>
+          <w:p>
+            <w:pPr>
+              <w:spacing w:line="480" w:lineRule="auto"/>
+              <w:rPr>
+                <w:rFonts w:ascii="Arial" w:hAnsi="Arial" w:cs="Arial"/>
+                <w:sz w:val="22"/>
+                <w:szCs w:val="22"/>
+              </w:rPr>
+            </w:pPr>
+            <w:r>
+              <w:rPr>
+                <w:rFonts w:ascii="Arial" w:hAnsi="Arial" w:cs="Arial"/>
+                <w:color w:val="000000" w:themeColor="text1"/>
+                <w:sz w:val="22"/>
+                <w:szCs w:val="22"/>
+              </w:rPr>
+              <w:lastRenderedPageBreak/>
+              <w:t>Gabriela Michelle Pérez Portillo</w:t>
+            </w:r>
+          </w:p>
+        </w:tc>
+        <w:tc>
+          <w:tcPr>
+            <w:tcW w:w="2267" w:type="dxa"/>
+            <w:tcBorders>
+              <w:top w:val="single" w:sz="4" w:space="0" w:color="auto"/>
+            </w:tcBorders>
+          </w:tcPr>
+          <w:p>
+            <w:pPr>
+              <w:spacing w:line="480" w:lineRule="auto"/>
+              <w:rPr>
+                <w:rFonts w:ascii="Arial" w:hAnsi="Arial" w:cs="Arial"/>
+                <w:sz w:val="22"/>
+                <w:szCs w:val="22"/>
+              </w:rPr>
+            </w:pPr>
+            <w:r>
+              <w:rPr>
+                <w:rFonts w:ascii="Arial" w:hAnsi="Arial" w:cs="Arial"/>
+                <w:sz w:val="22"/>
+                <w:szCs w:val="22"/>
+              </w:rPr>
+              <w:t>2026010762</w:t>
+            </w:r>
+          </w:p>
+        </w:tc>
+        <w:tc>
+          <w:tcPr>
+            <w:tcW w:w="2272" w:type="dxa"/>
+            <w:tcBorders>
+              <w:top w:val="single" w:sz="4" w:space="0" w:color="auto"/>
+            </w:tcBorders>
+          </w:tcPr>
+          <w:p>
+            <w:pPr>
+              <w:spacing w:line="480" w:lineRule="auto"/>
+              <w:rPr>
+                <w:rFonts w:ascii="Arial" w:hAnsi="Arial" w:cs="Arial"/>
+                <w:sz w:val="22"/>
+                <w:szCs w:val="22"/>
+              </w:rPr>
+            </w:pPr>
+            <w:r>
+              <w:rPr>
+                <w:rFonts w:ascii="Arial" w:hAnsi="Arial" w:cs="Arial"/>
+                <w:sz w:val="22"/>
+                <w:szCs w:val="22"/>
+              </w:rPr>
+              <w:t>Sí</w:t>
+            </w:r>
+          </w:p>
+        </w:tc>
+      </w:tr>
+      <w:tr>
+        <w:trPr>
+          <w:trHeight w:val="300"/>
+        </w:trPr>
+        <w:tc>
+          <w:tcPr>
+            <w:tcW w:w="9355" w:type="dxa"/>
+            <w:gridSpan w:val="3"/>
+            <w:tcBorders>
+              <w:bottom w:val="single" w:sz="4" w:space="0" w:color="auto"/>
+            </w:tcBorders>
+            <w:vAlign w:val="center"/>
+          </w:tcPr>
+          <w:p>
+            <w:pPr>
+              <w:spacing w:line="480" w:lineRule="auto"/>
+              <w:jc w:val="center"/>
+              <w:rPr>
+                <w:rFonts w:ascii="Arial" w:hAnsi="Arial" w:cs="Arial"/>
+                <w:sz w:val="22"/>
+                <w:szCs w:val="22"/>
+              </w:rPr>
+            </w:pPr>
+            <w:r>
+              <w:rPr>
+                <w:noProof/>
+              </w:rPr>
+              <w:drawing>
+                <wp:inline distT="0" distB="0" distL="0" distR="0" wp14:anchorId="0007AC8C" wp14:editId="02A9A1C6">
+                  <wp:extent cx="1653997" cy="1524000"/>
+                  <wp:effectExtent l="171450" t="152400" r="365760" b="361950"/>
+                  <wp:docPr id="8" name="Imagen 1"/>
+                  <wp:cNvGraphicFramePr>
+                    <a:graphicFrameLocks xmlns:a="http://schemas.openxmlformats.org/drawingml/2006/main" noChangeAspect="1"/>
+                  </wp:cNvGraphicFramePr>
+                  <a:graphic xmlns:a="http://schemas.openxmlformats.org/drawingml/2006/main">
+                    <a:graphicData uri="http://schemas.openxmlformats.org/drawingml/2006/picture">
+                      <pic:pic xmlns:pic="http://schemas.openxmlformats.org/drawingml/2006/picture">
+                        <pic:nvPicPr>
+                          <pic:cNvPr id="8" name="Imagen 8"/>
+                          <pic:cNvPicPr>
+                            <a:picLocks noChangeAspect="1"/>
+                          </pic:cNvPicPr>
+                        </pic:nvPicPr>
+                        <pic:blipFill rotWithShape="1">
+                          <a:blip r:embed="rId18" cstate="print">
+                            <a:extLst>
+                              <a:ext uri="{28A0092B-C50C-407E-A947-70E740481C1C}">
+                                <a14:useLocalDpi xmlns:a14="http://schemas.microsoft.com/office/drawing/2010/main" val="0"/>
+                              </a:ext>
+                            </a:extLst>
+                          </a:blip>
+                          <a:srcRect l="11914" r="6680"/>
+                          <a:stretch>
+                            <a:fillRect/>
+                          </a:stretch>
+                        </pic:blipFill>
+                        <pic:spPr bwMode="auto">
+                          <a:xfrm>
+                            <a:off x="0" y="0"/>
+                            <a:ext cx="1658635" cy="1528274"/>
+                          </a:xfrm>
+                          <a:prstGeom prst="rect">
+                            <a:avLst/>
+                          </a:prstGeom>
+                          <a:ln>
+                            <a:noFill/>
+                          </a:ln>
+                          <a:effectLst>
+                            <a:outerShdw blurRad="292100" dist="139700" dir="2700000" algn="tl" rotWithShape="0">
+                              <a:srgbClr val="333333">
+                                <a:alpha val="65000"/>
+                              </a:srgbClr>
+                            </a:outerShdw>
+                          </a:effectLst>
+                          <a:extLst>
+                            <a:ext uri="{53640926-AAD7-44D8-BBD7-CCE9431645EC}">
+                              <a14:shadowObscured xmlns:a14="http://schemas.microsoft.com/office/drawing/2010/main"/>
+                            </a:ext>
+                          </a:extLst>
+                        </pic:spPr>
+                      </pic:pic>
+                    </a:graphicData>
+                  </a:graphic>
+                </wp:inline>
+              </w:drawing>
+            </w:r>
+          </w:p>
+        </w:tc>
+      </w:tr>
+      <w:tr>
+        <w:trPr>
+          <w:trHeight w:val="300"/>
+        </w:trPr>
+        <w:tc>
+          <w:tcPr>
+            <w:tcW w:w="4816" w:type="dxa"/>
+            <w:tcBorders>
+              <w:top w:val="single" w:sz="4" w:space="0" w:color="auto"/>
+              <w:bottom w:val="nil"/>
+            </w:tcBorders>
+            <w:vAlign w:val="center"/>
+          </w:tcPr>
+          <w:p>
+            <w:pPr>
+              <w:spacing w:line="480" w:lineRule="auto"/>
+              <w:rPr>
+                <w:rFonts w:ascii="Arial" w:hAnsi="Arial" w:cs="Arial"/>
+                <w:sz w:val="22"/>
+                <w:szCs w:val="22"/>
+              </w:rPr>
+            </w:pPr>
+            <w:r>
+              <w:rPr>
+                <w:rFonts w:ascii="Arial" w:hAnsi="Arial" w:cs="Arial"/>
+                <w:color w:val="000000" w:themeColor="text1"/>
+                <w:sz w:val="22"/>
+                <w:szCs w:val="22"/>
+              </w:rPr>
+              <w:t>Jesús Roberto Sánchez Orellana</w:t>
+            </w:r>
+          </w:p>
+        </w:tc>
+        <w:tc>
+          <w:tcPr>
+            <w:tcW w:w="2267" w:type="dxa"/>
+            <w:tcBorders>
+              <w:top w:val="single" w:sz="4" w:space="0" w:color="auto"/>
+              <w:bottom w:val="nil"/>
+            </w:tcBorders>
+          </w:tcPr>
+          <w:p>
+            <w:pPr>
+              <w:spacing w:line="480" w:lineRule="auto"/>
+              <w:rPr>
+                <w:rFonts w:ascii="Arial" w:hAnsi="Arial" w:cs="Arial"/>
+                <w:sz w:val="22"/>
+                <w:szCs w:val="22"/>
+              </w:rPr>
+            </w:pPr>
+            <w:r>
+              <w:rPr>
+                <w:rFonts w:ascii="Arial" w:hAnsi="Arial" w:cs="Arial"/>
+                <w:sz w:val="22"/>
+                <w:szCs w:val="22"/>
+              </w:rPr>
+              <w:t>2026010931</w:t>
+            </w:r>
+          </w:p>
+        </w:tc>
+        <w:tc>
+          <w:tcPr>
+            <w:tcW w:w="2272" w:type="dxa"/>
+            <w:tcBorders>
+              <w:top w:val="single" w:sz="4" w:space="0" w:color="auto"/>
+              <w:bottom w:val="nil"/>
+            </w:tcBorders>
+          </w:tcPr>
+          <w:p>
+            <w:pPr>
+              <w:spacing w:line="480" w:lineRule="auto"/>
+              <w:rPr>
+                <w:rFonts w:ascii="Arial" w:hAnsi="Arial" w:cs="Arial"/>
+                <w:sz w:val="22"/>
+                <w:szCs w:val="22"/>
+              </w:rPr>
+            </w:pPr>
+            <w:r>
+              <w:rPr>
+                <w:rFonts w:ascii="Arial" w:hAnsi="Arial" w:cs="Arial"/>
+                <w:sz w:val="22"/>
+                <w:szCs w:val="22"/>
+              </w:rPr>
+              <w:t>Sí</w:t>
+            </w:r>
+          </w:p>
+        </w:tc>
+      </w:tr>
+      <w:tr>
+        <w:trPr>
+          <w:trHeight w:val="300"/>
+        </w:trPr>
+        <w:tc>
+          <w:tcPr>
+            <w:tcW w:w="9355" w:type="dxa"/>
+            <w:gridSpan w:val="3"/>
+            <w:tcBorders>
+              <w:top w:val="nil"/>
+              <w:bottom w:val="single" w:sz="4" w:space="0" w:color="auto"/>
+            </w:tcBorders>
+            <w:vAlign w:val="center"/>
+          </w:tcPr>
+          <w:p>
+            <w:pPr>
+              <w:spacing w:line="480" w:lineRule="auto"/>
+              <w:jc w:val="center"/>
+              <w:rPr>
+                <w:rFonts w:ascii="Arial" w:hAnsi="Arial" w:cs="Arial"/>
+                <w:sz w:val="22"/>
+                <w:szCs w:val="22"/>
+              </w:rPr>
+            </w:pPr>
+            <w:r>
+              <w:rPr>
+                <w:noProof/>
+              </w:rPr>
+              <w:drawing>
+                <wp:inline distT="0" distB="0" distL="0" distR="0" wp14:anchorId="35FCB080" wp14:editId="5EAB0039">
+                  <wp:extent cx="1676400" cy="1695263"/>
+                  <wp:effectExtent l="152400" t="171450" r="342900" b="362585"/>
+                  <wp:docPr id="6" name="Imagen 1"/>
+                  <wp:cNvGraphicFramePr>
+                    <a:graphicFrameLocks xmlns:a="http://schemas.openxmlformats.org/drawingml/2006/main" noChangeAspect="1"/>
+                  </wp:cNvGraphicFramePr>
+                  <a:graphic xmlns:a="http://schemas.openxmlformats.org/drawingml/2006/main">
+                    <a:graphicData uri="http://schemas.openxmlformats.org/drawingml/2006/picture">
+                      <pic:pic xmlns:pic="http://schemas.openxmlformats.org/drawingml/2006/picture">
+                        <pic:nvPicPr>
+                          <pic:cNvPr id="6" name="Imagen 6"/>
+                          <pic:cNvPicPr>
+                            <a:picLocks noChangeAspect="1"/>
+                          </pic:cNvPicPr>
+                        </pic:nvPicPr>
+                        <pic:blipFill rotWithShape="1">
+                          <a:blip r:embed="rId19" cstate="print">
+                            <a:extLst>
+                              <a:ext uri="{28A0092B-C50C-407E-A947-70E740481C1C}">
+                                <a14:useLocalDpi xmlns:a14="http://schemas.microsoft.com/office/drawing/2010/main" val="0"/>
+                              </a:ext>
+                            </a:extLst>
+                          </a:blip>
+                          <a:srcRect t="10127" b="14030"/>
+                          <a:stretch>
+                            <a:fillRect/>
+                          </a:stretch>
+                        </pic:blipFill>
+                        <pic:spPr bwMode="auto">
+                          <a:xfrm>
+                            <a:off x="0" y="0"/>
+                            <a:ext cx="1688318" cy="1707315"/>
+                          </a:xfrm>
+                          <a:prstGeom prst="rect">
+                            <a:avLst/>
+                          </a:prstGeom>
+                          <a:ln>
+                            <a:noFill/>
+                          </a:ln>
+                          <a:effectLst>
+                            <a:outerShdw blurRad="292100" dist="139700" dir="2700000" algn="tl" rotWithShape="0">
+                              <a:srgbClr val="333333">
+                                <a:alpha val="65000"/>
+                              </a:srgbClr>
+                            </a:outerShdw>
+                          </a:effectLst>
+                          <a:extLst>
+                            <a:ext uri="{53640926-AAD7-44D8-BBD7-CCE9431645EC}">
+                              <a14:shadowObscured xmlns:a14="http://schemas.microsoft.com/office/drawing/2010/main"/>
+                            </a:ext>
+                          </a:extLst>
+                        </pic:spPr>
+                      </pic:pic>
+                    </a:graphicData>
+                  </a:graphic>
+                </wp:inline>
+              </w:drawing>
+            </w:r>
+          </w:p>
+        </w:tc>
+      </w:tr>
+      <w:tr>
+        <w:trPr>
+          <w:trHeight w:val="300"/>
+        </w:trPr>
+        <w:tc>
+          <w:tcPr>
+            <w:tcW w:w="4816" w:type="dxa"/>
+            <w:tcBorders>
+              <w:top w:val="single" w:sz="4" w:space="0" w:color="auto"/>
+            </w:tcBorders>
+            <w:vAlign w:val="center"/>
+          </w:tcPr>
+          <w:p>
+            <w:pPr>
+              <w:spacing w:line="480" w:lineRule="auto"/>
+              <w:rPr>
+                <w:rFonts w:ascii="Arial" w:hAnsi="Arial" w:cs="Arial"/>
+                <w:sz w:val="22"/>
+                <w:szCs w:val="22"/>
+              </w:rPr>
+            </w:pPr>
+            <w:r>
+              <w:rPr>
+                <w:rFonts w:ascii="Arial" w:hAnsi="Arial" w:cs="Arial"/>
+                <w:color w:val="000000" w:themeColor="text1"/>
+                <w:sz w:val="22"/>
+                <w:szCs w:val="22"/>
+              </w:rPr>
+              <w:t>Jireh Alexander Trigueros Pérez</w:t>
+            </w:r>
+          </w:p>
+        </w:tc>
+        <w:tc>
+          <w:tcPr>
+            <w:tcW w:w="2267" w:type="dxa"/>
+            <w:tcBorders>
+              <w:top w:val="single" w:sz="4" w:space="0" w:color="auto"/>
+            </w:tcBorders>
+          </w:tcPr>
+          <w:p>
+            <w:pPr>
+              <w:spacing w:line="480" w:lineRule="auto"/>
+              <w:rPr>
+                <w:rFonts w:ascii="Arial" w:hAnsi="Arial" w:cs="Arial"/>
+                <w:sz w:val="22"/>
+                <w:szCs w:val="22"/>
+              </w:rPr>
+            </w:pPr>
+            <w:r>
+              <w:rPr>
+                <w:rFonts w:ascii="Arial" w:hAnsi="Arial" w:cs="Arial"/>
+                <w:sz w:val="22"/>
+                <w:szCs w:val="22"/>
+              </w:rPr>
+              <w:t>2026010325</w:t>
+            </w:r>
+          </w:p>
+        </w:tc>
+        <w:tc>
+          <w:tcPr>
+            <w:tcW w:w="2272" w:type="dxa"/>
+            <w:tcBorders>
+              <w:top w:val="single" w:sz="4" w:space="0" w:color="auto"/>
+            </w:tcBorders>
+          </w:tcPr>
+          <w:p>
+            <w:pPr>
+              <w:spacing w:line="480" w:lineRule="auto"/>
+              <w:rPr>
+                <w:rFonts w:ascii="Arial" w:hAnsi="Arial" w:cs="Arial"/>
+                <w:sz w:val="22"/>
+                <w:szCs w:val="22"/>
+              </w:rPr>
+            </w:pPr>
+            <w:r>
+              <w:rPr>
+                <w:rFonts w:ascii="Arial" w:hAnsi="Arial" w:cs="Arial"/>
+                <w:sz w:val="22"/>
+                <w:szCs w:val="22"/>
+              </w:rPr>
+              <w:t>Sí</w:t>
+            </w:r>
+          </w:p>
+        </w:tc>
+      </w:tr>
+      <w:tr>
+        <w:trPr>
+          <w:trHeight w:val="300"/>
+        </w:trPr>
+        <w:tc>
+          <w:tcPr>
+            <w:tcW w:w="9355" w:type="dxa"/>
+            <w:gridSpan w:val="3"/>
+            <w:tcBorders>
+              <w:bottom w:val="single" w:sz="4" w:space="0" w:color="auto"/>
+            </w:tcBorders>
+            <w:vAlign w:val="center"/>
+          </w:tcPr>
+          <w:p>
+            <w:pPr>
+              <w:spacing w:line="480" w:lineRule="auto"/>
+              <w:jc w:val="center"/>
+              <w:rPr>
+                <w:rFonts w:ascii="Arial" w:hAnsi="Arial" w:cs="Arial"/>
+                <w:sz w:val="22"/>
+                <w:szCs w:val="22"/>
+              </w:rPr>
+            </w:pPr>
+            <w:r>
+              <w:rPr>
+                <w:noProof/>
+              </w:rPr>
+              <w:drawing>
+                <wp:inline distT="0" distB="0" distL="0" distR="0" wp14:anchorId="29F1F249" wp14:editId="2B586283">
+                  <wp:extent cx="1677208" cy="1755321"/>
+                  <wp:effectExtent l="152400" t="171450" r="361315" b="359410"/>
+                  <wp:docPr id="12" name="Imagen 1"/>
+                  <wp:cNvGraphicFramePr>
+                    <a:graphicFrameLocks xmlns:a="http://schemas.openxmlformats.org/drawingml/2006/main" noChangeAspect="1"/>
+                  </wp:cNvGraphicFramePr>
+                  <a:graphic xmlns:a="http://schemas.openxmlformats.org/drawingml/2006/main">
+                    <a:graphicData uri="http://schemas.openxmlformats.org/drawingml/2006/picture">
+                      <pic:pic xmlns:pic="http://schemas.openxmlformats.org/drawingml/2006/picture">
+                        <pic:nvPicPr>
+                          <pic:cNvPr id="12" name="Imagen 12"/>
+                          <pic:cNvPicPr>
+                            <a:picLocks noChangeAspect="1"/>
+                          </pic:cNvPicPr>
+                        </pic:nvPicPr>
+                        <pic:blipFill rotWithShape="1">
+                          <a:blip r:embed="rId20" cstate="print">
+                            <a:extLst>
+                              <a:ext uri="{28A0092B-C50C-407E-A947-70E740481C1C}">
+                                <a14:useLocalDpi xmlns:a14="http://schemas.microsoft.com/office/drawing/2010/main" val="0"/>
+                              </a:ext>
+                            </a:extLst>
+                          </a:blip>
+                          <a:srcRect t="6432" b="14956"/>
+                          <a:stretch>
+                            <a:fillRect/>
+                          </a:stretch>
+                        </pic:blipFill>
+                        <pic:spPr bwMode="auto">
+                          <a:xfrm>
+                            <a:off x="0" y="0"/>
+                            <a:ext cx="1683900" cy="1762325"/>
+                          </a:xfrm>
+                          <a:prstGeom prst="rect">
+                            <a:avLst/>
+                          </a:prstGeom>
+                          <a:ln>
+                            <a:noFill/>
+                          </a:ln>
+                          <a:effectLst>
+                            <a:outerShdw blurRad="292100" dist="139700" dir="2700000" algn="tl" rotWithShape="0">
+                              <a:srgbClr val="333333">
+                                <a:alpha val="65000"/>
+                              </a:srgbClr>
+                            </a:outerShdw>
+                          </a:effectLst>
+                          <a:extLst>
+                            <a:ext uri="{53640926-AAD7-44D8-BBD7-CCE9431645EC}">
+                              <a14:shadowObscured xmlns:a14="http://schemas.microsoft.com/office/drawing/2010/main"/>
+                            </a:ext>
+                          </a:extLst>
+                        </pic:spPr>
+                      </pic:pic>
+                    </a:graphicData>
+                  </a:graphic>
+                </wp:inline>
+              </w:drawing>
+            </w:r>
+          </w:p>
+        </w:tc>
+      </w:tr>
+      <w:tr>
+        <w:trPr>
+          <w:trHeight w:val="300"/>
+        </w:trPr>
+        <w:tc>
+          <w:tcPr>
+            <w:tcW w:w="4816" w:type="dxa"/>
+            <w:tcBorders>
+              <w:top w:val="single" w:sz="4" w:space="0" w:color="auto"/>
+              <w:bottom w:val="nil"/>
+            </w:tcBorders>
+            <w:vAlign w:val="center"/>
+          </w:tcPr>
+          <w:p>
+            <w:pPr>
+              <w:spacing w:line="480" w:lineRule="auto"/>
+              <w:rPr>
+                <w:rFonts w:ascii="Arial" w:hAnsi="Arial" w:cs="Arial"/>
+                <w:sz w:val="22"/>
+                <w:szCs w:val="22"/>
+              </w:rPr>
+            </w:pPr>
+            <w:r>
+              <w:rPr>
+                <w:rFonts w:ascii="Arial" w:hAnsi="Arial" w:cs="Arial"/>
+                <w:color w:val="000000" w:themeColor="text1"/>
+                <w:sz w:val="22"/>
+                <w:szCs w:val="22"/>
+              </w:rPr>
+              <w:lastRenderedPageBreak/>
+              <w:t>Julio Cesar Pérez Salazar</w:t>
+            </w:r>
+          </w:p>
+        </w:tc>
+        <w:tc>
+          <w:tcPr>
+            <w:tcW w:w="2267" w:type="dxa"/>
+            <w:tcBorders>
+              <w:top w:val="single" w:sz="4" w:space="0" w:color="auto"/>
+              <w:bottom w:val="nil"/>
+            </w:tcBorders>
+          </w:tcPr>
+          <w:p>
+            <w:pPr>
+              <w:spacing w:line="480" w:lineRule="auto"/>
+              <w:rPr>
+                <w:rFonts w:ascii="Arial" w:hAnsi="Arial" w:cs="Arial"/>
+                <w:sz w:val="22"/>
+                <w:szCs w:val="22"/>
+              </w:rPr>
+            </w:pPr>
+            <w:r>
+              <w:rPr>
+                <w:rFonts w:ascii="Arial" w:hAnsi="Arial" w:cs="Arial"/>
+                <w:sz w:val="22"/>
+                <w:szCs w:val="22"/>
+              </w:rPr>
+              <w:t>2026010236</w:t>
+            </w:r>
+          </w:p>
+        </w:tc>
+        <w:tc>
+          <w:tcPr>
+            <w:tcW w:w="2272" w:type="dxa"/>
+            <w:tcBorders>
+              <w:top w:val="single" w:sz="4" w:space="0" w:color="auto"/>
+              <w:bottom w:val="nil"/>
+            </w:tcBorders>
+          </w:tcPr>
+          <w:p>
+            <w:pPr>
+              <w:spacing w:line="480" w:lineRule="auto"/>
+              <w:rPr>
+                <w:rFonts w:ascii="Arial" w:hAnsi="Arial" w:cs="Arial"/>
+                <w:sz w:val="22"/>
+                <w:szCs w:val="22"/>
+              </w:rPr>
+            </w:pPr>
+            <w:r>
+              <w:rPr>
+                <w:rFonts w:ascii="Arial" w:hAnsi="Arial" w:cs="Arial"/>
+                <w:sz w:val="22"/>
+                <w:szCs w:val="22"/>
+              </w:rPr>
+              <w:t>Sí</w:t>
+            </w:r>
+          </w:p>
+        </w:tc>
+      </w:tr>
+      <w:tr>
+        <w:trPr>
+          <w:trHeight w:val="300"/>
+        </w:trPr>
+        <w:tc>
+          <w:tcPr>
+            <w:tcW w:w="9355" w:type="dxa"/>
+            <w:gridSpan w:val="3"/>
+            <w:tcBorders>
+              <w:top w:val="nil"/>
+              <w:bottom w:val="single" w:sz="4" w:space="0" w:color="auto"/>
+            </w:tcBorders>
+            <w:vAlign w:val="center"/>
+          </w:tcPr>
+          <w:p>
+            <w:pPr>
+              <w:spacing w:line="480" w:lineRule="auto"/>
+              <w:jc w:val="center"/>
+              <w:rPr>
+                <w:rFonts w:ascii="Arial" w:hAnsi="Arial" w:cs="Arial"/>
+                <w:sz w:val="22"/>
+                <w:szCs w:val="22"/>
+              </w:rPr>
+            </w:pPr>
+            <w:r>
+              <w:rPr>
+                <w:noProof/>
+              </w:rPr>
+              <w:drawing>
+                <wp:inline distT="0" distB="0" distL="0" distR="0" wp14:anchorId="24120E2A" wp14:editId="4231918D">
+                  <wp:extent cx="2025015" cy="1962150"/>
+                  <wp:effectExtent l="152400" t="152400" r="356235" b="361950"/>
+                  <wp:docPr id="9" name="Imagen 1"/>
+                  <wp:cNvGraphicFramePr>
+                    <a:graphicFrameLocks xmlns:a="http://schemas.openxmlformats.org/drawingml/2006/main" noChangeAspect="1"/>
+                  </wp:cNvGraphicFramePr>
+                  <a:graphic xmlns:a="http://schemas.openxmlformats.org/drawingml/2006/main">
+                    <a:graphicData uri="http://schemas.openxmlformats.org/drawingml/2006/picture">
+                      <pic:pic xmlns:pic="http://schemas.openxmlformats.org/drawingml/2006/picture">
+                        <pic:nvPicPr>
+                          <pic:cNvPr id="9" name="Imagen 9"/>
+                          <pic:cNvPicPr>
+                            <a:picLocks noChangeAspect="1"/>
+                          </pic:cNvPicPr>
+                        </pic:nvPicPr>
+                        <pic:blipFill>
+                          <a:blip r:embed="rId21" cstate="print">
+                            <a:extLst>
+                              <a:ext uri="{28A0092B-C50C-407E-A947-70E740481C1C}">
+                                <a14:useLocalDpi xmlns:a14="http://schemas.microsoft.com/office/drawing/2010/main" val="0"/>
+                              </a:ext>
+                            </a:extLst>
+                          </a:blip>
+                          <a:stretch>
+                            <a:fillRect/>
+                          </a:stretch>
+                        </pic:blipFill>
+                        <pic:spPr>
+                          <a:xfrm>
+                            <a:off x="0" y="0"/>
+                            <a:ext cx="2032723" cy="1969619"/>
+                          </a:xfrm>
+                          <a:prstGeom prst="rect">
+                            <a:avLst/>
+                          </a:prstGeom>
+                          <a:ln>
+                            <a:noFill/>
+                          </a:ln>
+                          <a:effectLst>
+                            <a:outerShdw blurRad="292100" dist="139700" dir="2700000" algn="tl" rotWithShape="0">
+                              <a:srgbClr val="333333">
+                                <a:alpha val="65000"/>
+                              </a:srgbClr>
+                            </a:outerShdw>
+                          </a:effectLst>
+                        </pic:spPr>
+                      </pic:pic>
+                    </a:graphicData>
+                  </a:graphic>
+                </wp:inline>
+              </w:drawing>
+            </w:r>
+          </w:p>
+        </w:tc>
+      </w:tr>
+      <w:tr>
+        <w:trPr>
+          <w:trHeight w:val="300"/>
+        </w:trPr>
+        <w:tc>
+          <w:tcPr>
+            <w:tcW w:w="4816" w:type="dxa"/>
+            <w:tcBorders>
+              <w:top w:val="single" w:sz="4" w:space="0" w:color="auto"/>
+              <w:bottom w:val="nil"/>
+            </w:tcBorders>
+            <w:vAlign w:val="center"/>
+          </w:tcPr>
+          <w:p>
+            <w:pPr>
+              <w:spacing w:line="480" w:lineRule="auto"/>
+              <w:rPr>
+                <w:rFonts w:ascii="Arial" w:hAnsi="Arial" w:cs="Arial"/>
+                <w:sz w:val="22"/>
+                <w:szCs w:val="22"/>
+              </w:rPr>
+            </w:pPr>
+            <w:r>
+              <w:rPr>
+                <w:rFonts w:ascii="Arial" w:hAnsi="Arial" w:cs="Arial"/>
+                <w:color w:val="000000" w:themeColor="text1"/>
+                <w:sz w:val="22"/>
+                <w:szCs w:val="22"/>
+              </w:rPr>
               <w:t>Salvador Ernesto Rodríguez Galdamez</w:t>
             </w:r>
           </w:p>
@@ -1350,6 +3000,10 @@
         <w:tc>
           <w:tcPr>
             <w:tcW w:w="2267" w:type="dxa"/>
+            <w:tcBorders>
+              <w:top w:val="single" w:sz="4" w:space="0" w:color="auto"/>
+              <w:bottom w:val="nil"/>
+            </w:tcBorders>
           </w:tcPr>
           <w:p>
             <w:pPr>
@@ -1373,6 +3027,10 @@
         <w:tc>
           <w:tcPr>
             <w:tcW w:w="2272" w:type="dxa"/>
+            <w:tcBorders>
+              <w:top w:val="single" w:sz="4" w:space="0" w:color="auto"/>
+              <w:bottom w:val="nil"/>
+            </w:tcBorders>
           </w:tcPr>
           <w:p>
             <w:pPr>
@@ -1390,6 +3048,99 @@
                 <w:szCs w:val="22"/>
               </w:rPr>
               <w:t>Sí</w:t>
+            </w:r>
+          </w:p>
+        </w:tc>
+      </w:tr>
+      <w:tr>
+        <w:trPr>
+          <w:trHeight w:val="300"/>
+        </w:trPr>
+        <w:tc>
+          <w:tcPr>
+            <w:tcW w:w="9355" w:type="dxa"/>
+            <w:gridSpan w:val="3"/>
+            <w:tcBorders>
+              <w:top w:val="nil"/>
+              <w:left w:val="single" w:sz="4" w:space="0" w:color="auto"/>
+              <w:bottom w:val="single" w:sz="4" w:space="0" w:color="auto"/>
+              <w:right w:val="single" w:sz="4" w:space="0" w:color="auto"/>
+            </w:tcBorders>
+            <w:vAlign w:val="center"/>
+          </w:tcPr>
+          <w:p>
+            <w:pPr>
+              <w:spacing w:line="480" w:lineRule="auto"/>
+              <w:jc w:val="center"/>
+              <w:rPr>
+                <w:rFonts w:ascii="Arial" w:hAnsi="Arial" w:cs="Arial"/>
+                <w:sz w:val="22"/>
+                <w:szCs w:val="22"/>
+              </w:rPr>
+            </w:pPr>
+            <w:r>
+              <w:rPr>
+                <w:noProof/>
+              </w:rPr>
+              <w:drawing>
+                <wp:inline distT="0" distB="0" distL="0" distR="0" wp14:anchorId="4F9C742C" wp14:editId="3ADC617E">
+                  <wp:extent cx="2326216" cy="2351617"/>
+                  <wp:effectExtent l="171450" t="171450" r="360045" b="353695"/>
+                  <wp:docPr id="10" name="Imagen 1"/>
+                  <wp:cNvGraphicFramePr>
+                    <a:graphicFrameLocks xmlns:a="http://schemas.openxmlformats.org/drawingml/2006/main" noChangeAspect="1"/>
+                  </wp:cNvGraphicFramePr>
+                  <a:graphic xmlns:a="http://schemas.openxmlformats.org/drawingml/2006/main">
+                    <a:graphicData uri="http://schemas.openxmlformats.org/drawingml/2006/picture">
+                      <pic:pic xmlns:pic="http://schemas.openxmlformats.org/drawingml/2006/picture">
+                        <pic:nvPicPr>
+                          <pic:cNvPr id="10" name="Imagen 10"/>
+                          <pic:cNvPicPr>
+                            <a:picLocks noChangeAspect="1"/>
+                          </pic:cNvPicPr>
+                        </pic:nvPicPr>
+                        <pic:blipFill rotWithShape="1">
+                          <a:blip r:embed="rId22" cstate="print">
+                            <a:extLst>
+                              <a:ext uri="{28A0092B-C50C-407E-A947-70E740481C1C}">
+                                <a14:useLocalDpi xmlns:a14="http://schemas.microsoft.com/office/drawing/2010/main" val="0"/>
+                              </a:ext>
+                            </a:extLst>
+                          </a:blip>
+                          <a:srcRect l="8480" t="6267" r="8286" b="2095"/>
+                          <a:stretch>
+                            <a:fillRect/>
+                          </a:stretch>
+                        </pic:blipFill>
+                        <pic:spPr bwMode="auto">
+                          <a:xfrm>
+                            <a:off x="0" y="0"/>
+                            <a:ext cx="2326625" cy="2352031"/>
+                          </a:xfrm>
+                          <a:prstGeom prst="rect">
+                            <a:avLst/>
+                          </a:prstGeom>
+                          <a:ln>
+                            <a:noFill/>
+                          </a:ln>
+                          <a:effectLst>
+                            <a:outerShdw blurRad="292100" dist="139700" dir="2700000" algn="tl" rotWithShape="0">
+                              <a:srgbClr val="333333">
+                                <a:alpha val="65000"/>
+                              </a:srgbClr>
+                            </a:outerShdw>
+                          </a:effectLst>
+                          <a:extLst>
+                            <a:ext uri="{53640926-AAD7-44D8-BBD7-CCE9431645EC}">
+                              <a14:shadowObscured xmlns:a14="http://schemas.microsoft.com/office/drawing/2010/main"/>
+                            </a:ext>
+                          </a:extLst>
+                        </pic:spPr>
+                      </pic:pic>
+                    </a:graphicData>
+                  </a:graphic>
+                </wp:inline>
+              </w:drawing>
             </w:r>
           </w:p>
         </w:tc>
@@ -1407,6 +3158,27 @@
           <w:szCs w:val="22"/>
         </w:rPr>
       </w:pPr>
+    </w:p>
+    <w:p>
+      <w:pPr>
+        <w:rPr>
+          <w:rFonts w:ascii="Arial" w:hAnsi="Arial" w:cs="Arial"/>
+          <w:b/>
+          <w:bCs/>
+          <w:sz w:val="22"/>
+          <w:szCs w:val="22"/>
+        </w:rPr>
+      </w:pPr>
+      <w:r>
+        <w:rPr>
+          <w:rFonts w:ascii="Arial" w:hAnsi="Arial" w:cs="Arial"/>
+          <w:b/>
+          <w:bCs/>
+          <w:sz w:val="22"/>
+          <w:szCs w:val="22"/>
+        </w:rPr>
+        <w:br w:type="page"/>
+      </w:r>
     </w:p>
     <w:p>
       <w:pPr>
@@ -2218,8 +3990,24 @@
                 <w:sz w:val="22"/>
                 <w:szCs w:val="22"/>
               </w:rPr>
-              <w:t xml:space="preserve">Nelly Arely </w:t>
-            </w:r>
+              <w:t>Franklin Martin Fuentes Chávez</w:t>
+            </w:r>
+          </w:p>
+        </w:tc>
+        <w:tc>
+          <w:tcPr>
+            <w:tcW w:w="1980" w:type="dxa"/>
+          </w:tcPr>
+          <w:p>
+            <w:pPr>
+              <w:spacing w:line="480" w:lineRule="auto"/>
+              <w:rPr>
+                <w:rFonts w:ascii="Arial" w:hAnsi="Arial" w:cs="Arial"/>
+                <w:sz w:val="22"/>
+                <w:szCs w:val="22"/>
+              </w:rPr>
+            </w:pPr>
+            <w:proofErr w:type="spellStart"/>
             <w:r>
               <w:rPr>
                 <w:rFonts w:ascii="Arial" w:hAnsi="Arial" w:cs="Arial"/>
@@ -2227,8 +4015,24 @@
                 <w:sz w:val="22"/>
                 <w:szCs w:val="22"/>
               </w:rPr>
-              <w:t>Pérez</w:t>
-            </w:r>
+              <w:t>Developer</w:t>
+            </w:r>
+            <w:proofErr w:type="spellEnd"/>
+          </w:p>
+        </w:tc>
+        <w:tc>
+          <w:tcPr>
+            <w:tcW w:w="2520" w:type="dxa"/>
+          </w:tcPr>
+          <w:p>
+            <w:pPr>
+              <w:spacing w:line="480" w:lineRule="auto"/>
+              <w:rPr>
+                <w:rFonts w:ascii="Arial" w:hAnsi="Arial" w:cs="Arial"/>
+                <w:sz w:val="22"/>
+                <w:szCs w:val="22"/>
+              </w:rPr>
+            </w:pPr>
             <w:r>
               <w:rPr>
                 <w:rFonts w:ascii="Arial" w:hAnsi="Arial" w:cs="Arial"/>
@@ -2236,23 +4040,8 @@
                 <w:sz w:val="22"/>
                 <w:szCs w:val="22"/>
               </w:rPr>
-              <w:t xml:space="preserve"> Melara</w:t>
-            </w:r>
-          </w:p>
-        </w:tc>
-        <w:tc>
-          <w:tcPr>
-            <w:tcW w:w="1980" w:type="dxa"/>
-          </w:tcPr>
-          <w:p>
-            <w:pPr>
-              <w:spacing w:line="480" w:lineRule="auto"/>
-              <w:rPr>
-                <w:rFonts w:ascii="Arial" w:hAnsi="Arial" w:cs="Arial"/>
-                <w:sz w:val="22"/>
-                <w:szCs w:val="22"/>
-              </w:rPr>
-            </w:pPr>
+              <w:t xml:space="preserve">Desarrollador </w:t>
+            </w:r>
             <w:proofErr w:type="spellStart"/>
             <w:r>
               <w:rPr>
@@ -2261,42 +4050,7 @@
                 <w:sz w:val="22"/>
                 <w:szCs w:val="22"/>
               </w:rPr>
-              <w:t>Developer</w:t>
-            </w:r>
-            <w:proofErr w:type="spellEnd"/>
-          </w:p>
-        </w:tc>
-        <w:tc>
-          <w:tcPr>
-            <w:tcW w:w="2520" w:type="dxa"/>
-          </w:tcPr>
-          <w:p>
-            <w:pPr>
-              <w:spacing w:line="480" w:lineRule="auto"/>
-              <w:rPr>
-                <w:rFonts w:ascii="Arial" w:hAnsi="Arial" w:cs="Arial"/>
-                <w:sz w:val="22"/>
-                <w:szCs w:val="22"/>
-              </w:rPr>
-            </w:pPr>
-            <w:r>
-              <w:rPr>
-                <w:rFonts w:ascii="Arial" w:hAnsi="Arial" w:cs="Arial"/>
-                <w:color w:val="000000"/>
-                <w:sz w:val="22"/>
-                <w:szCs w:val="22"/>
-              </w:rPr>
-              <w:t xml:space="preserve">Desarrollador </w:t>
-            </w:r>
-            <w:proofErr w:type="spellStart"/>
-            <w:r>
-              <w:rPr>
-                <w:rFonts w:ascii="Arial" w:hAnsi="Arial" w:cs="Arial"/>
-                <w:color w:val="000000"/>
-                <w:sz w:val="22"/>
-                <w:szCs w:val="22"/>
-              </w:rPr>
-              <w:t>Frontend</w:t>
+              <w:t>Backend</w:t>
             </w:r>
             <w:proofErr w:type="spellEnd"/>
           </w:p>
@@ -2346,8 +4100,24 @@
                 <w:sz w:val="22"/>
                 <w:szCs w:val="22"/>
               </w:rPr>
-              <w:t xml:space="preserve">Franklin Martin Fuentes </w:t>
-            </w:r>
+              <w:t>Alessandro Imanol Ramírez Moran</w:t>
+            </w:r>
+          </w:p>
+        </w:tc>
+        <w:tc>
+          <w:tcPr>
+            <w:tcW w:w="1980" w:type="dxa"/>
+          </w:tcPr>
+          <w:p>
+            <w:pPr>
+              <w:spacing w:line="480" w:lineRule="auto"/>
+              <w:rPr>
+                <w:rFonts w:ascii="Arial" w:hAnsi="Arial" w:cs="Arial"/>
+                <w:sz w:val="22"/>
+                <w:szCs w:val="22"/>
+              </w:rPr>
+            </w:pPr>
+            <w:proofErr w:type="spellStart"/>
             <w:r>
               <w:rPr>
                 <w:rFonts w:ascii="Arial" w:hAnsi="Arial" w:cs="Arial"/>
@@ -2355,23 +4125,33 @@
                 <w:sz w:val="22"/>
                 <w:szCs w:val="22"/>
               </w:rPr>
-              <w:t>Chávez</w:t>
-            </w:r>
-          </w:p>
-        </w:tc>
-        <w:tc>
-          <w:tcPr>
-            <w:tcW w:w="1980" w:type="dxa"/>
-          </w:tcPr>
-          <w:p>
-            <w:pPr>
-              <w:spacing w:line="480" w:lineRule="auto"/>
-              <w:rPr>
-                <w:rFonts w:ascii="Arial" w:hAnsi="Arial" w:cs="Arial"/>
-                <w:sz w:val="22"/>
-                <w:szCs w:val="22"/>
-              </w:rPr>
-            </w:pPr>
+              <w:t>Developer</w:t>
+            </w:r>
+            <w:proofErr w:type="spellEnd"/>
+          </w:p>
+        </w:tc>
+        <w:tc>
+          <w:tcPr>
+            <w:tcW w:w="2520" w:type="dxa"/>
+          </w:tcPr>
+          <w:p>
+            <w:pPr>
+              <w:spacing w:line="480" w:lineRule="auto"/>
+              <w:rPr>
+                <w:rFonts w:ascii="Arial" w:hAnsi="Arial" w:cs="Arial"/>
+                <w:sz w:val="22"/>
+                <w:szCs w:val="22"/>
+              </w:rPr>
+            </w:pPr>
+            <w:r>
+              <w:rPr>
+                <w:rFonts w:ascii="Arial" w:hAnsi="Arial" w:cs="Arial"/>
+                <w:color w:val="000000"/>
+                <w:sz w:val="22"/>
+                <w:szCs w:val="22"/>
+              </w:rPr>
+              <w:t xml:space="preserve">Desarrollador Full </w:t>
+            </w:r>
             <w:proofErr w:type="spellStart"/>
             <w:r>
               <w:rPr>
@@ -2380,24 +4160,9 @@
                 <w:sz w:val="22"/>
                 <w:szCs w:val="22"/>
               </w:rPr>
-              <w:t>Developer</w:t>
+              <w:t>stack</w:t>
             </w:r>
             <w:proofErr w:type="spellEnd"/>
-          </w:p>
-        </w:tc>
-        <w:tc>
-          <w:tcPr>
-            <w:tcW w:w="2520" w:type="dxa"/>
-          </w:tcPr>
-          <w:p>
-            <w:pPr>
-              <w:spacing w:line="480" w:lineRule="auto"/>
-              <w:rPr>
-                <w:rFonts w:ascii="Arial" w:hAnsi="Arial" w:cs="Arial"/>
-                <w:sz w:val="22"/>
-                <w:szCs w:val="22"/>
-              </w:rPr>
-            </w:pPr>
             <w:r>
               <w:rPr>
                 <w:rFonts w:ascii="Arial" w:hAnsi="Arial" w:cs="Arial"/>
@@ -2405,19 +4170,8 @@
                 <w:sz w:val="22"/>
                 <w:szCs w:val="22"/>
               </w:rPr>
-              <w:t xml:space="preserve">Desarrollador </w:t>
-            </w:r>
-            <w:proofErr w:type="spellStart"/>
-            <w:r>
-              <w:rPr>
-                <w:rFonts w:ascii="Arial" w:hAnsi="Arial" w:cs="Arial"/>
-                <w:color w:val="000000"/>
-                <w:sz w:val="22"/>
-                <w:szCs w:val="22"/>
-              </w:rPr>
-              <w:t>Backend</w:t>
-            </w:r>
-            <w:proofErr w:type="spellEnd"/>
+              <w:t> </w:t>
+            </w:r>
           </w:p>
         </w:tc>
       </w:tr>
@@ -2465,8 +4219,24 @@
                 <w:sz w:val="22"/>
                 <w:szCs w:val="22"/>
               </w:rPr>
-              <w:t xml:space="preserve">Alessandro Imanol </w:t>
-            </w:r>
+              <w:t>Gabriela Michelle Pérez Portillo</w:t>
+            </w:r>
+          </w:p>
+        </w:tc>
+        <w:tc>
+          <w:tcPr>
+            <w:tcW w:w="1980" w:type="dxa"/>
+          </w:tcPr>
+          <w:p>
+            <w:pPr>
+              <w:spacing w:line="480" w:lineRule="auto"/>
+              <w:rPr>
+                <w:rFonts w:ascii="Arial" w:hAnsi="Arial" w:cs="Arial"/>
+                <w:sz w:val="22"/>
+                <w:szCs w:val="22"/>
+              </w:rPr>
+            </w:pPr>
+            <w:proofErr w:type="spellStart"/>
             <w:r>
               <w:rPr>
                 <w:rFonts w:ascii="Arial" w:hAnsi="Arial" w:cs="Arial"/>
@@ -2474,8 +4244,24 @@
                 <w:sz w:val="22"/>
                 <w:szCs w:val="22"/>
               </w:rPr>
-              <w:t>Ramírez</w:t>
-            </w:r>
+              <w:t>Developer</w:t>
+            </w:r>
+            <w:proofErr w:type="spellEnd"/>
+          </w:p>
+        </w:tc>
+        <w:tc>
+          <w:tcPr>
+            <w:tcW w:w="2520" w:type="dxa"/>
+          </w:tcPr>
+          <w:p>
+            <w:pPr>
+              <w:spacing w:line="480" w:lineRule="auto"/>
+              <w:rPr>
+                <w:rFonts w:ascii="Arial" w:hAnsi="Arial" w:cs="Arial"/>
+                <w:sz w:val="22"/>
+                <w:szCs w:val="22"/>
+              </w:rPr>
+            </w:pPr>
             <w:r>
               <w:rPr>
                 <w:rFonts w:ascii="Arial" w:hAnsi="Arial" w:cs="Arial"/>
@@ -2483,23 +4269,8 @@
                 <w:sz w:val="22"/>
                 <w:szCs w:val="22"/>
               </w:rPr>
-              <w:t xml:space="preserve"> Moran</w:t>
-            </w:r>
-          </w:p>
-        </w:tc>
-        <w:tc>
-          <w:tcPr>
-            <w:tcW w:w="1980" w:type="dxa"/>
-          </w:tcPr>
-          <w:p>
-            <w:pPr>
-              <w:spacing w:line="480" w:lineRule="auto"/>
-              <w:rPr>
-                <w:rFonts w:ascii="Arial" w:hAnsi="Arial" w:cs="Arial"/>
-                <w:sz w:val="22"/>
-                <w:szCs w:val="22"/>
-              </w:rPr>
-            </w:pPr>
+              <w:t xml:space="preserve">Desarrollador Full </w:t>
+            </w:r>
             <w:proofErr w:type="spellStart"/>
             <w:r>
               <w:rPr>
@@ -2508,60 +4279,7 @@
                 <w:sz w:val="22"/>
                 <w:szCs w:val="22"/>
               </w:rPr>
-              <w:t>Developer</w:t>
-            </w:r>
-            <w:proofErr w:type="spellEnd"/>
-          </w:p>
-        </w:tc>
-        <w:tc>
-          <w:tcPr>
-            <w:tcW w:w="2520" w:type="dxa"/>
-          </w:tcPr>
-          <w:p>
-            <w:pPr>
-              <w:spacing w:line="480" w:lineRule="auto"/>
-              <w:rPr>
-                <w:rFonts w:ascii="Arial" w:hAnsi="Arial" w:cs="Arial"/>
-                <w:sz w:val="22"/>
-                <w:szCs w:val="22"/>
-              </w:rPr>
-            </w:pPr>
-            <w:r>
-              <w:rPr>
-                <w:rFonts w:ascii="Arial" w:hAnsi="Arial" w:cs="Arial"/>
-                <w:color w:val="000000"/>
-                <w:sz w:val="22"/>
-                <w:szCs w:val="22"/>
-              </w:rPr>
-              <w:t>Desarrollador Full</w:t>
-            </w:r>
-            <w:r>
-              <w:rPr>
-                <w:rFonts w:ascii="Arial" w:hAnsi="Arial" w:cs="Arial"/>
-                <w:color w:val="000000"/>
-                <w:sz w:val="22"/>
-                <w:szCs w:val="22"/>
-              </w:rPr>
-              <w:t xml:space="preserve"> </w:t>
-            </w:r>
-            <w:proofErr w:type="spellStart"/>
-            <w:r>
-              <w:rPr>
-                <w:rFonts w:ascii="Arial" w:hAnsi="Arial" w:cs="Arial"/>
-                <w:color w:val="000000"/>
-                <w:sz w:val="22"/>
-                <w:szCs w:val="22"/>
-              </w:rPr>
-              <w:t>s</w:t>
-            </w:r>
-            <w:r>
-              <w:rPr>
-                <w:rFonts w:ascii="Arial" w:hAnsi="Arial" w:cs="Arial"/>
-                <w:color w:val="000000"/>
-                <w:sz w:val="22"/>
-                <w:szCs w:val="22"/>
-              </w:rPr>
-              <w:t>tack</w:t>
+              <w:t>stack</w:t>
             </w:r>
             <w:proofErr w:type="spellEnd"/>
             <w:r>
@@ -2620,8 +4338,24 @@
                 <w:sz w:val="22"/>
                 <w:szCs w:val="22"/>
               </w:rPr>
-              <w:t xml:space="preserve">Gabriela Michelle </w:t>
-            </w:r>
+              <w:t>Salvador Ernesto Rodríguez Galdamez</w:t>
+            </w:r>
+          </w:p>
+        </w:tc>
+        <w:tc>
+          <w:tcPr>
+            <w:tcW w:w="1980" w:type="dxa"/>
+          </w:tcPr>
+          <w:p>
+            <w:pPr>
+              <w:spacing w:line="480" w:lineRule="auto"/>
+              <w:rPr>
+                <w:rFonts w:ascii="Arial" w:hAnsi="Arial" w:cs="Arial"/>
+                <w:sz w:val="22"/>
+                <w:szCs w:val="22"/>
+              </w:rPr>
+            </w:pPr>
+            <w:proofErr w:type="spellStart"/>
             <w:r>
               <w:rPr>
                 <w:rFonts w:ascii="Arial" w:hAnsi="Arial" w:cs="Arial"/>
@@ -2629,8 +4363,24 @@
                 <w:sz w:val="22"/>
                 <w:szCs w:val="22"/>
               </w:rPr>
-              <w:t>Pérez</w:t>
-            </w:r>
+              <w:t>Developer</w:t>
+            </w:r>
+            <w:proofErr w:type="spellEnd"/>
+          </w:p>
+        </w:tc>
+        <w:tc>
+          <w:tcPr>
+            <w:tcW w:w="2520" w:type="dxa"/>
+          </w:tcPr>
+          <w:p>
+            <w:pPr>
+              <w:spacing w:line="480" w:lineRule="auto"/>
+              <w:rPr>
+                <w:rFonts w:ascii="Arial" w:hAnsi="Arial" w:cs="Arial"/>
+                <w:sz w:val="22"/>
+                <w:szCs w:val="22"/>
+              </w:rPr>
+            </w:pPr>
             <w:r>
               <w:rPr>
                 <w:rFonts w:ascii="Arial" w:hAnsi="Arial" w:cs="Arial"/>
@@ -2638,95 +4388,7 @@
                 <w:sz w:val="22"/>
                 <w:szCs w:val="22"/>
               </w:rPr>
-              <w:t xml:space="preserve"> Portillo</w:t>
-            </w:r>
-          </w:p>
-        </w:tc>
-        <w:tc>
-          <w:tcPr>
-            <w:tcW w:w="1980" w:type="dxa"/>
-          </w:tcPr>
-          <w:p>
-            <w:pPr>
-              <w:spacing w:line="480" w:lineRule="auto"/>
-              <w:rPr>
-                <w:rFonts w:ascii="Arial" w:hAnsi="Arial" w:cs="Arial"/>
-                <w:sz w:val="22"/>
-                <w:szCs w:val="22"/>
-              </w:rPr>
-            </w:pPr>
-            <w:proofErr w:type="spellStart"/>
-            <w:r>
-              <w:rPr>
-                <w:rFonts w:ascii="Arial" w:hAnsi="Arial" w:cs="Arial"/>
-                <w:color w:val="000000"/>
-                <w:sz w:val="22"/>
-                <w:szCs w:val="22"/>
-              </w:rPr>
-              <w:t>Developer</w:t>
-            </w:r>
-            <w:proofErr w:type="spellEnd"/>
-          </w:p>
-        </w:tc>
-        <w:tc>
-          <w:tcPr>
-            <w:tcW w:w="2520" w:type="dxa"/>
-          </w:tcPr>
-          <w:p>
-            <w:pPr>
-              <w:spacing w:line="480" w:lineRule="auto"/>
-              <w:rPr>
-                <w:rFonts w:ascii="Arial" w:hAnsi="Arial" w:cs="Arial"/>
-                <w:sz w:val="22"/>
-                <w:szCs w:val="22"/>
-              </w:rPr>
-            </w:pPr>
-            <w:r>
-              <w:rPr>
-                <w:rFonts w:ascii="Arial" w:hAnsi="Arial" w:cs="Arial"/>
-                <w:color w:val="000000"/>
-                <w:sz w:val="22"/>
-                <w:szCs w:val="22"/>
-              </w:rPr>
-              <w:t>Desarrollador Full</w:t>
-            </w:r>
-            <w:r>
-              <w:rPr>
-                <w:rFonts w:ascii="Arial" w:hAnsi="Arial" w:cs="Arial"/>
-                <w:color w:val="000000"/>
-                <w:sz w:val="22"/>
-                <w:szCs w:val="22"/>
-              </w:rPr>
-              <w:t xml:space="preserve"> </w:t>
-            </w:r>
-            <w:proofErr w:type="spellStart"/>
-            <w:r>
-              <w:rPr>
-                <w:rFonts w:ascii="Arial" w:hAnsi="Arial" w:cs="Arial"/>
-                <w:color w:val="000000"/>
-                <w:sz w:val="22"/>
-                <w:szCs w:val="22"/>
-              </w:rPr>
-              <w:t>s</w:t>
-            </w:r>
-            <w:r>
-              <w:rPr>
-                <w:rFonts w:ascii="Arial" w:hAnsi="Arial" w:cs="Arial"/>
-                <w:color w:val="000000"/>
-                <w:sz w:val="22"/>
-                <w:szCs w:val="22"/>
-              </w:rPr>
-              <w:t>tack</w:t>
-            </w:r>
-            <w:proofErr w:type="spellEnd"/>
-            <w:r>
-              <w:rPr>
-                <w:rFonts w:ascii="Arial" w:hAnsi="Arial" w:cs="Arial"/>
-                <w:color w:val="000000"/>
-                <w:sz w:val="22"/>
-                <w:szCs w:val="22"/>
-              </w:rPr>
-              <w:t> </w:t>
+              <w:t>Base de datos</w:t>
             </w:r>
           </w:p>
         </w:tc>
@@ -2775,8 +4437,24 @@
                 <w:sz w:val="22"/>
                 <w:szCs w:val="22"/>
               </w:rPr>
-              <w:t xml:space="preserve">Salvador Ernesto </w:t>
-            </w:r>
+              <w:t>Gabriel Alejandro Fuentes Chavarría</w:t>
+            </w:r>
+          </w:p>
+        </w:tc>
+        <w:tc>
+          <w:tcPr>
+            <w:tcW w:w="1980" w:type="dxa"/>
+          </w:tcPr>
+          <w:p>
+            <w:pPr>
+              <w:spacing w:line="480" w:lineRule="auto"/>
+              <w:rPr>
+                <w:rFonts w:ascii="Arial" w:hAnsi="Arial" w:cs="Arial"/>
+                <w:sz w:val="22"/>
+                <w:szCs w:val="22"/>
+              </w:rPr>
+            </w:pPr>
+            <w:proofErr w:type="spellStart"/>
             <w:r>
               <w:rPr>
                 <w:rFonts w:ascii="Arial" w:hAnsi="Arial" w:cs="Arial"/>
@@ -2784,8 +4462,9 @@
                 <w:sz w:val="22"/>
                 <w:szCs w:val="22"/>
               </w:rPr>
-              <w:t>Rodríguez</w:t>
-            </w:r>
+              <w:t>Quality</w:t>
+            </w:r>
+            <w:proofErr w:type="spellEnd"/>
             <w:r>
               <w:rPr>
                 <w:rFonts w:ascii="Arial" w:hAnsi="Arial" w:cs="Arial"/>
@@ -2793,23 +4472,8 @@
                 <w:sz w:val="22"/>
                 <w:szCs w:val="22"/>
               </w:rPr>
-              <w:t xml:space="preserve"> Galdamez</w:t>
-            </w:r>
-          </w:p>
-        </w:tc>
-        <w:tc>
-          <w:tcPr>
-            <w:tcW w:w="1980" w:type="dxa"/>
-          </w:tcPr>
-          <w:p>
-            <w:pPr>
-              <w:spacing w:line="480" w:lineRule="auto"/>
-              <w:rPr>
-                <w:rFonts w:ascii="Arial" w:hAnsi="Arial" w:cs="Arial"/>
-                <w:sz w:val="22"/>
-                <w:szCs w:val="22"/>
-              </w:rPr>
-            </w:pPr>
+              <w:t xml:space="preserve"> </w:t>
+            </w:r>
             <w:proofErr w:type="spellStart"/>
             <w:r>
               <w:rPr>
@@ -2818,7 +4482,7 @@
                 <w:sz w:val="22"/>
                 <w:szCs w:val="22"/>
               </w:rPr>
-              <w:t>Developer</w:t>
+              <w:t>Analyst</w:t>
             </w:r>
             <w:proofErr w:type="spellEnd"/>
           </w:p>
@@ -2839,11 +4503,10 @@
             <w:r>
               <w:rPr>
                 <w:rFonts w:ascii="Arial" w:hAnsi="Arial" w:cs="Arial"/>
-                <w:color w:val="000000"/>
-                <w:sz w:val="22"/>
-                <w:szCs w:val="22"/>
-              </w:rPr>
-              <w:t>Base de datos</w:t>
+                <w:sz w:val="22"/>
+                <w:szCs w:val="22"/>
+              </w:rPr>
+              <w:t>Analista de pruebas</w:t>
             </w:r>
           </w:p>
         </w:tc>
@@ -2892,16 +4555,7 @@
                 <w:sz w:val="22"/>
                 <w:szCs w:val="22"/>
               </w:rPr>
-              <w:t xml:space="preserve">Gabriel Alejandro Fuentes </w:t>
-            </w:r>
-            <w:r>
-              <w:rPr>
-                <w:rFonts w:ascii="Arial" w:hAnsi="Arial" w:cs="Arial"/>
-                <w:color w:val="000000"/>
-                <w:sz w:val="22"/>
-                <w:szCs w:val="22"/>
-              </w:rPr>
-              <w:t>Chavarría</w:t>
+              <w:t>Emerson Eduardo Candido Joya</w:t>
             </w:r>
           </w:p>
         </w:tc>
@@ -3019,7 +4673,7 @@
                 <w:sz w:val="22"/>
                 <w:szCs w:val="22"/>
               </w:rPr>
-              <w:t>Emerson Eduardo Candido Joya</w:t>
+              <w:t>Cindy Shaiel Canales Campos</w:t>
             </w:r>
           </w:p>
         </w:tc>
@@ -3036,6 +4690,15 @@
                 <w:szCs w:val="22"/>
               </w:rPr>
             </w:pPr>
+            <w:r>
+              <w:rPr>
+                <w:rFonts w:ascii="Arial" w:hAnsi="Arial" w:cs="Arial"/>
+                <w:color w:val="000000"/>
+                <w:sz w:val="22"/>
+                <w:szCs w:val="22"/>
+              </w:rPr>
+              <w:t xml:space="preserve">Business </w:t>
+            </w:r>
             <w:proofErr w:type="spellStart"/>
             <w:r>
               <w:rPr>
@@ -3044,29 +4707,9 @@
                 <w:sz w:val="22"/>
                 <w:szCs w:val="22"/>
               </w:rPr>
-              <w:t>Quality</w:t>
+              <w:t>Analyst</w:t>
             </w:r>
             <w:proofErr w:type="spellEnd"/>
-            <w:r>
-              <w:rPr>
-                <w:rFonts w:ascii="Arial" w:hAnsi="Arial" w:cs="Arial"/>
-                <w:color w:val="000000"/>
-                <w:sz w:val="22"/>
-                <w:szCs w:val="22"/>
-              </w:rPr>
-              <w:t xml:space="preserve"> </w:t>
-            </w:r>
-            <w:proofErr w:type="spellStart"/>
-            <w:r>
-              <w:rPr>
-                <w:rFonts w:ascii="Arial" w:hAnsi="Arial" w:cs="Arial"/>
-                <w:color w:val="000000"/>
-                <w:sz w:val="22"/>
-                <w:szCs w:val="22"/>
-              </w:rPr>
-              <w:t>Analyst</w:t>
-            </w:r>
-            <w:proofErr w:type="spellEnd"/>
           </w:p>
         </w:tc>
         <w:tc>
@@ -3088,7 +4731,7 @@
                 <w:sz w:val="22"/>
                 <w:szCs w:val="22"/>
               </w:rPr>
-              <w:t>Analista de pruebas</w:t>
+              <w:t>Analista de negocio</w:t>
             </w:r>
           </w:p>
         </w:tc>
@@ -3137,7 +4780,7 @@
                 <w:sz w:val="22"/>
                 <w:szCs w:val="22"/>
               </w:rPr>
-              <w:t>Cindy Shaiel Canales Campos</w:t>
+              <w:t>Julio Cesar Pérez Salazar</w:t>
             </w:r>
           </w:p>
         </w:tc>
@@ -3244,159 +4887,7 @@
                 <w:sz w:val="22"/>
                 <w:szCs w:val="22"/>
               </w:rPr>
-              <w:t xml:space="preserve">Julio Cesar </w:t>
-            </w:r>
-            <w:r>
-              <w:rPr>
-                <w:rFonts w:ascii="Arial" w:hAnsi="Arial" w:cs="Arial"/>
-                <w:color w:val="000000"/>
-                <w:sz w:val="22"/>
-                <w:szCs w:val="22"/>
-              </w:rPr>
-              <w:t>Pérez</w:t>
-            </w:r>
-            <w:r>
-              <w:rPr>
-                <w:rFonts w:ascii="Arial" w:hAnsi="Arial" w:cs="Arial"/>
-                <w:color w:val="000000"/>
-                <w:sz w:val="22"/>
-                <w:szCs w:val="22"/>
-              </w:rPr>
-              <w:t xml:space="preserve"> Salazar</w:t>
-            </w:r>
-          </w:p>
-        </w:tc>
-        <w:tc>
-          <w:tcPr>
-            <w:tcW w:w="1980" w:type="dxa"/>
-          </w:tcPr>
-          <w:p>
-            <w:pPr>
-              <w:spacing w:line="480" w:lineRule="auto"/>
-              <w:rPr>
-                <w:rFonts w:ascii="Arial" w:hAnsi="Arial" w:cs="Arial"/>
-                <w:sz w:val="22"/>
-                <w:szCs w:val="22"/>
-              </w:rPr>
-            </w:pPr>
-            <w:r>
-              <w:rPr>
-                <w:rFonts w:ascii="Arial" w:hAnsi="Arial" w:cs="Arial"/>
-                <w:color w:val="000000"/>
-                <w:sz w:val="22"/>
-                <w:szCs w:val="22"/>
-              </w:rPr>
-              <w:t xml:space="preserve">Business </w:t>
-            </w:r>
-            <w:proofErr w:type="spellStart"/>
-            <w:r>
-              <w:rPr>
-                <w:rFonts w:ascii="Arial" w:hAnsi="Arial" w:cs="Arial"/>
-                <w:color w:val="000000"/>
-                <w:sz w:val="22"/>
-                <w:szCs w:val="22"/>
-              </w:rPr>
-              <w:t>Analyst</w:t>
-            </w:r>
-            <w:proofErr w:type="spellEnd"/>
-          </w:p>
-        </w:tc>
-        <w:tc>
-          <w:tcPr>
-            <w:tcW w:w="2520" w:type="dxa"/>
-          </w:tcPr>
-          <w:p>
-            <w:pPr>
-              <w:spacing w:line="480" w:lineRule="auto"/>
-              <w:rPr>
-                <w:rFonts w:ascii="Arial" w:hAnsi="Arial" w:cs="Arial"/>
-                <w:sz w:val="22"/>
-                <w:szCs w:val="22"/>
-              </w:rPr>
-            </w:pPr>
-            <w:r>
-              <w:rPr>
-                <w:rFonts w:ascii="Arial" w:hAnsi="Arial" w:cs="Arial"/>
-                <w:sz w:val="22"/>
-                <w:szCs w:val="22"/>
-              </w:rPr>
-              <w:t>Analista de negocio</w:t>
-            </w:r>
-          </w:p>
-        </w:tc>
-      </w:tr>
-      <w:tr>
-        <w:tc>
-          <w:tcPr>
-            <w:tcW w:w="720" w:type="dxa"/>
-          </w:tcPr>
-          <w:p>
-            <w:pPr>
-              <w:spacing w:line="480" w:lineRule="auto"/>
-              <w:rPr>
-                <w:rFonts w:ascii="Arial" w:hAnsi="Arial" w:cs="Arial"/>
-                <w:sz w:val="22"/>
-                <w:szCs w:val="22"/>
-              </w:rPr>
-            </w:pPr>
-            <w:r>
-              <w:rPr>
-                <w:rFonts w:ascii="Arial" w:hAnsi="Arial" w:cs="Arial"/>
-                <w:sz w:val="22"/>
-                <w:szCs w:val="22"/>
-              </w:rPr>
-              <w:t>13</w:t>
-            </w:r>
-          </w:p>
-        </w:tc>
-        <w:tc>
-          <w:tcPr>
-            <w:tcW w:w="4140" w:type="dxa"/>
-          </w:tcPr>
-          <w:p>
-            <w:pPr>
-              <w:spacing w:line="480" w:lineRule="auto"/>
-              <w:rPr>
-                <w:rFonts w:ascii="Arial" w:hAnsi="Arial" w:cs="Arial"/>
-                <w:sz w:val="22"/>
-                <w:szCs w:val="22"/>
-              </w:rPr>
-            </w:pPr>
-            <w:r>
-              <w:rPr>
-                <w:rFonts w:ascii="Arial" w:hAnsi="Arial" w:cs="Arial"/>
-                <w:color w:val="000000"/>
-                <w:sz w:val="22"/>
-                <w:szCs w:val="22"/>
-              </w:rPr>
-              <w:t>Jesús</w:t>
-            </w:r>
-            <w:r>
-              <w:rPr>
-                <w:rFonts w:ascii="Arial" w:hAnsi="Arial" w:cs="Arial"/>
-                <w:color w:val="000000"/>
-                <w:sz w:val="22"/>
-                <w:szCs w:val="22"/>
-              </w:rPr>
-              <w:t xml:space="preserve"> Roberto </w:t>
-            </w:r>
-            <w:r>
-              <w:rPr>
-                <w:rFonts w:ascii="Arial" w:hAnsi="Arial" w:cs="Arial"/>
-                <w:color w:val="000000"/>
-                <w:sz w:val="22"/>
-                <w:szCs w:val="22"/>
-              </w:rPr>
-              <w:t>Sánchez</w:t>
-            </w:r>
-            <w:r>
-              <w:rPr>
-                <w:rFonts w:ascii="Arial" w:hAnsi="Arial" w:cs="Arial"/>
-                <w:color w:val="000000"/>
-                <w:sz w:val="22"/>
-                <w:szCs w:val="22"/>
-              </w:rPr>
-              <w:t xml:space="preserve"> Orellana</w:t>
+              <w:t>Jesús Roberto Sánchez Orellana</w:t>
             </w:r>
           </w:p>
         </w:tc>
@@ -3516,6 +5007,27 @@
           <w:szCs w:val="22"/>
         </w:rPr>
       </w:pPr>
+    </w:p>
+    <w:p>
+      <w:pPr>
+        <w:rPr>
+          <w:rFonts w:ascii="Arial" w:hAnsi="Arial" w:cs="Arial"/>
+          <w:b/>
+          <w:bCs/>
+          <w:sz w:val="22"/>
+          <w:szCs w:val="22"/>
+        </w:rPr>
+      </w:pPr>
+      <w:r>
+        <w:rPr>
+          <w:rFonts w:ascii="Arial" w:hAnsi="Arial" w:cs="Arial"/>
+          <w:b/>
+          <w:bCs/>
+          <w:sz w:val="22"/>
+          <w:szCs w:val="22"/>
+        </w:rPr>
+        <w:br w:type="page"/>
+      </w:r>
     </w:p>
     <w:p>
       <w:pPr>
@@ -7169,7 +8681,15 @@
                 <w:sz w:val="22"/>
                 <w:szCs w:val="22"/>
               </w:rPr>
-              <w:t>29 jul – 31 jul</w:t>
+              <w:t xml:space="preserve">29 jul – </w:t>
+            </w:r>
+            <w:r>
+              <w:rPr>
+                <w:rFonts w:ascii="Arial" w:hAnsi="Arial" w:cs="Arial"/>
+                <w:sz w:val="22"/>
+                <w:szCs w:val="22"/>
+              </w:rPr>
+              <w:t>27 sept</w:t>
             </w:r>
           </w:p>
         </w:tc>
@@ -8887,7 +10407,6 @@
           <w:p>
             <w:pPr>
               <w:spacing w:line="480" w:lineRule="auto"/>
-              <w:jc w:val="right"/>
               <w:rPr>
                 <w:rFonts w:ascii="Arial" w:hAnsi="Arial" w:cs="Arial"/>
                 <w:sz w:val="22"/>
@@ -9622,7 +11141,7 @@
                 <w:sz w:val="22"/>
                 <w:szCs w:val="22"/>
               </w:rPr>
-              <w:t>Diseñar e implementar arquitectura por capas (UI, Controller, Service, DAO, DTO)</w:t>
+              <w:t xml:space="preserve">Diseñar e implementar arquitectura por capas </w:t>
             </w:r>
           </w:p>
         </w:tc>
@@ -9721,7 +11240,7 @@
                 <w:sz w:val="22"/>
                 <w:szCs w:val="22"/>
               </w:rPr>
-              <w:t>Justificar el uso de colecciones en el documento</w:t>
+              <w:t>Redactar objetivo del Avance 2 en el documento</w:t>
             </w:r>
           </w:p>
         </w:tc>
@@ -9738,6 +11257,24 @@
                 <w:szCs w:val="22"/>
               </w:rPr>
             </w:pPr>
+            <w:proofErr w:type="spellStart"/>
+            <w:r>
+              <w:rPr>
+                <w:rFonts w:ascii="Arial" w:hAnsi="Arial" w:cs="Arial"/>
+                <w:sz w:val="22"/>
+                <w:szCs w:val="22"/>
+              </w:rPr>
+              <w:t>Product</w:t>
+            </w:r>
+            <w:proofErr w:type="spellEnd"/>
+            <w:r>
+              <w:rPr>
+                <w:rFonts w:ascii="Arial" w:hAnsi="Arial" w:cs="Arial"/>
+                <w:sz w:val="22"/>
+                <w:szCs w:val="22"/>
+              </w:rPr>
+              <w:t xml:space="preserve"> Owner</w:t>
+            </w:r>
           </w:p>
         </w:tc>
         <w:tc>
@@ -9753,6 +11290,14 @@
                 <w:szCs w:val="22"/>
               </w:rPr>
             </w:pPr>
+            <w:r>
+              <w:rPr>
+                <w:rFonts w:ascii="Arial" w:hAnsi="Arial" w:cs="Arial"/>
+                <w:sz w:val="22"/>
+                <w:szCs w:val="22"/>
+              </w:rPr>
+              <w:t>Jireh Alexander Trigueros Pérez</w:t>
+            </w:r>
           </w:p>
         </w:tc>
         <w:tc>
@@ -9768,6 +11313,14 @@
                 <w:szCs w:val="22"/>
               </w:rPr>
             </w:pPr>
+            <w:r>
+              <w:rPr>
+                <w:rFonts w:ascii="Arial" w:hAnsi="Arial" w:cs="Arial"/>
+                <w:sz w:val="22"/>
+                <w:szCs w:val="22"/>
+              </w:rPr>
+              <w:t>23 sept</w:t>
+            </w:r>
           </w:p>
         </w:tc>
       </w:tr>
@@ -9794,7 +11347,7 @@
                 <w:sz w:val="22"/>
                 <w:szCs w:val="22"/>
               </w:rPr>
-              <w:t>Redactar objetivo del Avance 2 en el documento</w:t>
+              <w:t>Actualizar y consolidar documento del avance</w:t>
             </w:r>
           </w:p>
         </w:tc>
@@ -9811,24 +11364,24 @@
                 <w:szCs w:val="22"/>
               </w:rPr>
             </w:pPr>
-            <w:proofErr w:type="spellStart"/>
-            <w:r>
-              <w:rPr>
-                <w:rFonts w:ascii="Arial" w:hAnsi="Arial" w:cs="Arial"/>
-                <w:sz w:val="22"/>
-                <w:szCs w:val="22"/>
-              </w:rPr>
-              <w:t>Product</w:t>
-            </w:r>
-            <w:proofErr w:type="spellEnd"/>
-            <w:r>
-              <w:rPr>
-                <w:rFonts w:ascii="Arial" w:hAnsi="Arial" w:cs="Arial"/>
-                <w:sz w:val="22"/>
-                <w:szCs w:val="22"/>
-              </w:rPr>
-              <w:t xml:space="preserve"> Owner</w:t>
-            </w:r>
+            <w:r>
+              <w:rPr>
+                <w:rFonts w:ascii="Arial" w:hAnsi="Arial" w:cs="Arial"/>
+                <w:sz w:val="22"/>
+                <w:szCs w:val="22"/>
+              </w:rPr>
+              <w:t xml:space="preserve">Scrum </w:t>
+            </w:r>
+            <w:proofErr w:type="gramStart"/>
+            <w:r>
+              <w:rPr>
+                <w:rFonts w:ascii="Arial" w:hAnsi="Arial" w:cs="Arial"/>
+                <w:sz w:val="22"/>
+                <w:szCs w:val="22"/>
+              </w:rPr>
+              <w:t>Master</w:t>
+            </w:r>
+            <w:proofErr w:type="gramEnd"/>
           </w:p>
         </w:tc>
         <w:tc>
@@ -9850,7 +11403,7 @@
                 <w:sz w:val="22"/>
                 <w:szCs w:val="22"/>
               </w:rPr>
-              <w:t>Jireh Alexander Trigueros Pérez</w:t>
+              <w:t>Carla Vanesa Franco Avelar</w:t>
             </w:r>
           </w:p>
         </w:tc>
@@ -9873,7 +11426,7 @@
                 <w:sz w:val="22"/>
                 <w:szCs w:val="22"/>
               </w:rPr>
-              <w:t>20 sept</w:t>
+              <w:t>26 sept</w:t>
             </w:r>
           </w:p>
         </w:tc>
@@ -9901,7 +11454,7 @@
                 <w:sz w:val="22"/>
                 <w:szCs w:val="22"/>
               </w:rPr>
-              <w:t>Actualizar y consolidar documento del avance</w:t>
+              <w:t>Probar flujo completo de reservas y validar código</w:t>
             </w:r>
           </w:p>
         </w:tc>
@@ -9924,18 +11477,8 @@
                 <w:sz w:val="22"/>
                 <w:szCs w:val="22"/>
               </w:rPr>
-              <w:t xml:space="preserve">Scrum </w:t>
-            </w:r>
-            <w:proofErr w:type="gramStart"/>
-            <w:r>
-              <w:rPr>
-                <w:rFonts w:ascii="Arial" w:hAnsi="Arial" w:cs="Arial"/>
-                <w:sz w:val="22"/>
-                <w:szCs w:val="22"/>
-              </w:rPr>
-              <w:t>Master</w:t>
-            </w:r>
-            <w:proofErr w:type="gramEnd"/>
+              <w:t>QA</w:t>
+            </w:r>
           </w:p>
         </w:tc>
         <w:tc>
@@ -9957,7 +11500,7 @@
                 <w:sz w:val="22"/>
                 <w:szCs w:val="22"/>
               </w:rPr>
-              <w:t>Carla Vanesa Franco Avelar</w:t>
+              <w:t>Gabriel Alejandro Fuentes Chavarría, Emerson Eduardo Candido Joya</w:t>
             </w:r>
           </w:p>
         </w:tc>
@@ -9980,7 +11523,7 @@
                 <w:sz w:val="22"/>
                 <w:szCs w:val="22"/>
               </w:rPr>
-              <w:t>27 sept</w:t>
+              <w:t>20 sept</w:t>
             </w:r>
           </w:p>
         </w:tc>
@@ -10008,7 +11551,43 @@
                 <w:sz w:val="22"/>
                 <w:szCs w:val="22"/>
               </w:rPr>
-              <w:t>Probar flujo completo de reservas y validar código</w:t>
+              <w:t xml:space="preserve">Revisar </w:t>
+            </w:r>
+            <w:proofErr w:type="spellStart"/>
+            <w:r>
+              <w:rPr>
+                <w:rFonts w:ascii="Arial" w:hAnsi="Arial" w:cs="Arial"/>
+                <w:sz w:val="22"/>
+                <w:szCs w:val="22"/>
+              </w:rPr>
+              <w:t>pull</w:t>
+            </w:r>
+            <w:proofErr w:type="spellEnd"/>
+            <w:r>
+              <w:rPr>
+                <w:rFonts w:ascii="Arial" w:hAnsi="Arial" w:cs="Arial"/>
+                <w:sz w:val="22"/>
+                <w:szCs w:val="22"/>
+              </w:rPr>
+              <w:t xml:space="preserve"> </w:t>
+            </w:r>
+            <w:proofErr w:type="spellStart"/>
+            <w:r>
+              <w:rPr>
+                <w:rFonts w:ascii="Arial" w:hAnsi="Arial" w:cs="Arial"/>
+                <w:sz w:val="22"/>
+                <w:szCs w:val="22"/>
+              </w:rPr>
+              <w:t>requests</w:t>
+            </w:r>
+            <w:proofErr w:type="spellEnd"/>
+            <w:r>
+              <w:rPr>
+                <w:rFonts w:ascii="Arial" w:hAnsi="Arial" w:cs="Arial"/>
+                <w:sz w:val="22"/>
+                <w:szCs w:val="22"/>
+              </w:rPr>
+              <w:t xml:space="preserve"> antes de integrarlos</w:t>
             </w:r>
           </w:p>
         </w:tc>
@@ -10077,7 +11656,7 @@
                 <w:sz w:val="22"/>
                 <w:szCs w:val="22"/>
               </w:rPr>
-              <w:t>20 sept</w:t>
+              <w:t>26 sept</w:t>
             </w:r>
           </w:p>
         </w:tc>
@@ -10106,7 +11685,7 @@
                 <w:szCs w:val="22"/>
               </w:rPr>
               <w:lastRenderedPageBreak/>
-              <w:t xml:space="preserve">Revisar </w:t>
+              <w:t>Integrar (</w:t>
             </w:r>
             <w:proofErr w:type="spellStart"/>
             <w:r>
@@ -10115,7 +11694,7 @@
                 <w:sz w:val="22"/>
                 <w:szCs w:val="22"/>
               </w:rPr>
-              <w:t>pull</w:t>
+              <w:t>merge</w:t>
             </w:r>
             <w:proofErr w:type="spellEnd"/>
             <w:r>
@@ -10124,8 +11703,23 @@
                 <w:sz w:val="22"/>
                 <w:szCs w:val="22"/>
               </w:rPr>
-              <w:t xml:space="preserve"> </w:t>
-            </w:r>
+              <w:t>) las ramas del equipo</w:t>
+            </w:r>
+          </w:p>
+        </w:tc>
+        <w:tc>
+          <w:tcPr>
+            <w:tcW w:w="2338" w:type="dxa"/>
+          </w:tcPr>
+          <w:p>
+            <w:pPr>
+              <w:spacing w:line="480" w:lineRule="auto"/>
+              <w:rPr>
+                <w:rFonts w:ascii="Arial" w:hAnsi="Arial" w:cs="Arial"/>
+                <w:sz w:val="22"/>
+                <w:szCs w:val="22"/>
+              </w:rPr>
+            </w:pPr>
             <w:proofErr w:type="spellStart"/>
             <w:r>
               <w:rPr>
@@ -10133,17 +11727,9 @@
                 <w:sz w:val="22"/>
                 <w:szCs w:val="22"/>
               </w:rPr>
-              <w:t>requests</w:t>
+              <w:t>Backend</w:t>
             </w:r>
             <w:proofErr w:type="spellEnd"/>
-            <w:r>
-              <w:rPr>
-                <w:rFonts w:ascii="Arial" w:hAnsi="Arial" w:cs="Arial"/>
-                <w:sz w:val="22"/>
-                <w:szCs w:val="22"/>
-              </w:rPr>
-              <w:t xml:space="preserve"> antes de integrarlos</w:t>
-            </w:r>
           </w:p>
         </w:tc>
         <w:tc>
@@ -10165,30 +11751,7 @@
                 <w:sz w:val="22"/>
                 <w:szCs w:val="22"/>
               </w:rPr>
-              <w:t>QA</w:t>
-            </w:r>
-          </w:p>
-        </w:tc>
-        <w:tc>
-          <w:tcPr>
-            <w:tcW w:w="2338" w:type="dxa"/>
-          </w:tcPr>
-          <w:p>
-            <w:pPr>
-              <w:spacing w:line="480" w:lineRule="auto"/>
-              <w:rPr>
-                <w:rFonts w:ascii="Arial" w:hAnsi="Arial" w:cs="Arial"/>
-                <w:sz w:val="22"/>
-                <w:szCs w:val="22"/>
-              </w:rPr>
-            </w:pPr>
-            <w:r>
-              <w:rPr>
-                <w:rFonts w:ascii="Arial" w:hAnsi="Arial" w:cs="Arial"/>
-                <w:sz w:val="22"/>
-                <w:szCs w:val="22"/>
-              </w:rPr>
-              <w:t>Gabriel Alejandro Fuentes Chavarría</w:t>
+              <w:t>Franklin Martin Fuentes Chávez</w:t>
             </w:r>
           </w:p>
         </w:tc>
@@ -10211,7 +11774,7 @@
                 <w:sz w:val="22"/>
                 <w:szCs w:val="22"/>
               </w:rPr>
-              <w:t>27 sept</w:t>
+              <w:t>26 sept</w:t>
             </w:r>
           </w:p>
         </w:tc>
@@ -10239,25 +11802,7 @@
                 <w:sz w:val="22"/>
                 <w:szCs w:val="22"/>
               </w:rPr>
-              <w:t>Integrar (</w:t>
-            </w:r>
-            <w:proofErr w:type="spellStart"/>
-            <w:r>
-              <w:rPr>
-                <w:rFonts w:ascii="Arial" w:hAnsi="Arial" w:cs="Arial"/>
-                <w:sz w:val="22"/>
-                <w:szCs w:val="22"/>
-              </w:rPr>
-              <w:t>merge</w:t>
-            </w:r>
-            <w:proofErr w:type="spellEnd"/>
-            <w:r>
-              <w:rPr>
-                <w:rFonts w:ascii="Arial" w:hAnsi="Arial" w:cs="Arial"/>
-                <w:sz w:val="22"/>
-                <w:szCs w:val="22"/>
-              </w:rPr>
-              <w:t>) las ramas del equipo</w:t>
+              <w:t xml:space="preserve">Grabar video explicativo del proyecto </w:t>
             </w:r>
           </w:p>
         </w:tc>
@@ -10274,16 +11819,14 @@
                 <w:szCs w:val="22"/>
               </w:rPr>
             </w:pPr>
-            <w:proofErr w:type="spellStart"/>
-            <w:r>
-              <w:rPr>
-                <w:rFonts w:ascii="Arial" w:hAnsi="Arial" w:cs="Arial"/>
-                <w:sz w:val="22"/>
-                <w:szCs w:val="22"/>
-              </w:rPr>
-              <w:t>Backend</w:t>
-            </w:r>
-            <w:proofErr w:type="spellEnd"/>
+            <w:r>
+              <w:rPr>
+                <w:rFonts w:ascii="Arial" w:hAnsi="Arial" w:cs="Arial"/>
+                <w:sz w:val="22"/>
+                <w:szCs w:val="22"/>
+              </w:rPr>
+              <w:t>Todos</w:t>
+            </w:r>
           </w:p>
         </w:tc>
         <w:tc>
@@ -10305,7 +11848,7 @@
                 <w:sz w:val="22"/>
                 <w:szCs w:val="22"/>
               </w:rPr>
-              <w:t>Franklin Martin Fuentes Chávez</w:t>
+              <w:t>Todos los integrantes</w:t>
             </w:r>
           </w:p>
         </w:tc>
@@ -10328,7 +11871,7 @@
                 <w:sz w:val="22"/>
                 <w:szCs w:val="22"/>
               </w:rPr>
-              <w:t>27 sept</w:t>
+              <w:t>24 sept</w:t>
             </w:r>
           </w:p>
         </w:tc>
@@ -10356,7 +11899,7 @@
                 <w:sz w:val="22"/>
                 <w:szCs w:val="22"/>
               </w:rPr>
-              <w:t>Grabar video explicativo del proyecto (participación de todo el equipo)</w:t>
+              <w:t>Editar y subir el video a YouTube</w:t>
             </w:r>
           </w:p>
         </w:tc>
@@ -10379,7 +11922,7 @@
                 <w:sz w:val="22"/>
                 <w:szCs w:val="22"/>
               </w:rPr>
-              <w:t>Todos</w:t>
+              <w:t>Base de datos</w:t>
             </w:r>
           </w:p>
         </w:tc>
@@ -10402,7 +11945,7 @@
                 <w:sz w:val="22"/>
                 <w:szCs w:val="22"/>
               </w:rPr>
-              <w:t>Todos los integrantes</w:t>
+              <w:t>Salvador Ernesto Rodríguez Galdamez</w:t>
             </w:r>
           </w:p>
         </w:tc>
@@ -10425,7 +11968,7 @@
                 <w:sz w:val="22"/>
                 <w:szCs w:val="22"/>
               </w:rPr>
-              <w:t>27 sept</w:t>
+              <w:t>25 sept</w:t>
             </w:r>
           </w:p>
         </w:tc>
@@ -10453,7 +11996,25 @@
                 <w:sz w:val="22"/>
                 <w:szCs w:val="22"/>
               </w:rPr>
-              <w:t>Editar y subir el video a YouTube</w:t>
+              <w:t xml:space="preserve">Avanzar en </w:t>
+            </w:r>
+            <w:proofErr w:type="spellStart"/>
+            <w:r>
+              <w:rPr>
+                <w:rFonts w:ascii="Arial" w:hAnsi="Arial" w:cs="Arial"/>
+                <w:sz w:val="22"/>
+                <w:szCs w:val="22"/>
+              </w:rPr>
+              <w:t>Frontend</w:t>
+            </w:r>
+            <w:proofErr w:type="spellEnd"/>
+            <w:r>
+              <w:rPr>
+                <w:rFonts w:ascii="Arial" w:hAnsi="Arial" w:cs="Arial"/>
+                <w:sz w:val="22"/>
+                <w:szCs w:val="22"/>
+              </w:rPr>
+              <w:t xml:space="preserve"> / Full Stack</w:t>
             </w:r>
           </w:p>
         </w:tc>
@@ -10470,13 +12031,23 @@
                 <w:szCs w:val="22"/>
               </w:rPr>
             </w:pPr>
-            <w:r>
-              <w:rPr>
-                <w:rFonts w:ascii="Arial" w:hAnsi="Arial" w:cs="Arial"/>
-                <w:sz w:val="22"/>
-                <w:szCs w:val="22"/>
-              </w:rPr>
-              <w:t>Base de datos</w:t>
+            <w:proofErr w:type="spellStart"/>
+            <w:r>
+              <w:rPr>
+                <w:rFonts w:ascii="Arial" w:hAnsi="Arial" w:cs="Arial"/>
+                <w:sz w:val="22"/>
+                <w:szCs w:val="22"/>
+              </w:rPr>
+              <w:t>Frontend</w:t>
+            </w:r>
+            <w:proofErr w:type="spellEnd"/>
+            <w:r>
+              <w:rPr>
+                <w:rFonts w:ascii="Arial" w:hAnsi="Arial" w:cs="Arial"/>
+                <w:sz w:val="22"/>
+                <w:szCs w:val="22"/>
+              </w:rPr>
+              <w:t xml:space="preserve"> / Full Stack</w:t>
             </w:r>
           </w:p>
         </w:tc>
@@ -10499,7 +12070,25 @@
                 <w:sz w:val="22"/>
                 <w:szCs w:val="22"/>
               </w:rPr>
-              <w:t>Salvador Ernesto Rodríguez Galdamez</w:t>
+              <w:t xml:space="preserve">Christian Alessandro Marín Sandoval, Alessandro Imanol Ramírez </w:t>
+            </w:r>
+            <w:proofErr w:type="spellStart"/>
+            <w:r>
+              <w:rPr>
+                <w:rFonts w:ascii="Arial" w:hAnsi="Arial" w:cs="Arial"/>
+                <w:sz w:val="22"/>
+                <w:szCs w:val="22"/>
+              </w:rPr>
+              <w:t>Moran</w:t>
+            </w:r>
+            <w:proofErr w:type="spellEnd"/>
+            <w:r>
+              <w:rPr>
+                <w:rFonts w:ascii="Arial" w:hAnsi="Arial" w:cs="Arial"/>
+                <w:sz w:val="22"/>
+                <w:szCs w:val="22"/>
+              </w:rPr>
+              <w:t>, Gabriela Michelle Pérez Portillo</w:t>
             </w:r>
           </w:p>
         </w:tc>
@@ -10522,7 +12111,7 @@
                 <w:sz w:val="22"/>
                 <w:szCs w:val="22"/>
               </w:rPr>
-              <w:t>25 sept</w:t>
+              <w:t>26 sept</w:t>
             </w:r>
           </w:p>
         </w:tc>
@@ -10550,25 +12139,7 @@
                 <w:sz w:val="22"/>
                 <w:szCs w:val="22"/>
               </w:rPr>
-              <w:t xml:space="preserve">Avanzar en </w:t>
-            </w:r>
-            <w:proofErr w:type="spellStart"/>
-            <w:r>
-              <w:rPr>
-                <w:rFonts w:ascii="Arial" w:hAnsi="Arial" w:cs="Arial"/>
-                <w:sz w:val="22"/>
-                <w:szCs w:val="22"/>
-              </w:rPr>
-              <w:t>Frontend</w:t>
-            </w:r>
-            <w:proofErr w:type="spellEnd"/>
-            <w:r>
-              <w:rPr>
-                <w:rFonts w:ascii="Arial" w:hAnsi="Arial" w:cs="Arial"/>
-                <w:sz w:val="22"/>
-                <w:szCs w:val="22"/>
-              </w:rPr>
-              <w:t xml:space="preserve"> / Full Stack</w:t>
+              <w:t>Entrega final del Avance 2</w:t>
             </w:r>
           </w:p>
         </w:tc>
@@ -10585,24 +12156,24 @@
                 <w:szCs w:val="22"/>
               </w:rPr>
             </w:pPr>
-            <w:proofErr w:type="spellStart"/>
-            <w:r>
-              <w:rPr>
-                <w:rFonts w:ascii="Arial" w:hAnsi="Arial" w:cs="Arial"/>
-                <w:sz w:val="22"/>
-                <w:szCs w:val="22"/>
-              </w:rPr>
-              <w:t>Frontend</w:t>
-            </w:r>
-            <w:proofErr w:type="spellEnd"/>
-            <w:r>
-              <w:rPr>
-                <w:rFonts w:ascii="Arial" w:hAnsi="Arial" w:cs="Arial"/>
-                <w:sz w:val="22"/>
-                <w:szCs w:val="22"/>
-              </w:rPr>
-              <w:t xml:space="preserve"> / Full Stack</w:t>
-            </w:r>
+            <w:r>
+              <w:rPr>
+                <w:rFonts w:ascii="Arial" w:hAnsi="Arial" w:cs="Arial"/>
+                <w:sz w:val="22"/>
+                <w:szCs w:val="22"/>
+              </w:rPr>
+              <w:t xml:space="preserve">Scrum </w:t>
+            </w:r>
+            <w:proofErr w:type="gramStart"/>
+            <w:r>
+              <w:rPr>
+                <w:rFonts w:ascii="Arial" w:hAnsi="Arial" w:cs="Arial"/>
+                <w:sz w:val="22"/>
+                <w:szCs w:val="22"/>
+              </w:rPr>
+              <w:t>Master</w:t>
+            </w:r>
+            <w:proofErr w:type="gramEnd"/>
           </w:p>
         </w:tc>
         <w:tc>
@@ -10624,25 +12195,7 @@
                 <w:sz w:val="22"/>
                 <w:szCs w:val="22"/>
               </w:rPr>
-              <w:t xml:space="preserve">Christian Alessandro Marín Sandoval, Alessandro Imanol Ramírez </w:t>
-            </w:r>
-            <w:proofErr w:type="spellStart"/>
-            <w:r>
-              <w:rPr>
-                <w:rFonts w:ascii="Arial" w:hAnsi="Arial" w:cs="Arial"/>
-                <w:sz w:val="22"/>
-                <w:szCs w:val="22"/>
-              </w:rPr>
-              <w:t>Moran</w:t>
-            </w:r>
-            <w:proofErr w:type="spellEnd"/>
-            <w:r>
-              <w:rPr>
-                <w:rFonts w:ascii="Arial" w:hAnsi="Arial" w:cs="Arial"/>
-                <w:sz w:val="22"/>
-                <w:szCs w:val="22"/>
-              </w:rPr>
-              <w:t>, Gabriela Michelle Pérez Portillo</w:t>
+              <w:t>Carla Vanesa Franco Avelar</w:t>
             </w:r>
           </w:p>
         </w:tc>
@@ -10665,114 +12218,7 @@
                 <w:sz w:val="22"/>
                 <w:szCs w:val="22"/>
               </w:rPr>
-              <w:t>27 sept</w:t>
-            </w:r>
-          </w:p>
-        </w:tc>
-      </w:tr>
-      <w:tr>
-        <w:trPr>
-          <w:trHeight w:val="300"/>
-        </w:trPr>
-        <w:tc>
-          <w:tcPr>
-            <w:tcW w:w="3050" w:type="dxa"/>
-          </w:tcPr>
-          <w:p>
-            <w:pPr>
-              <w:spacing w:line="480" w:lineRule="auto"/>
-              <w:rPr>
-                <w:rFonts w:ascii="Arial" w:hAnsi="Arial" w:cs="Arial"/>
-                <w:sz w:val="22"/>
-                <w:szCs w:val="22"/>
-              </w:rPr>
-            </w:pPr>
-            <w:r>
-              <w:rPr>
-                <w:rFonts w:ascii="Arial" w:hAnsi="Arial" w:cs="Arial"/>
-                <w:sz w:val="22"/>
-                <w:szCs w:val="22"/>
-              </w:rPr>
-              <w:t>Entrega final del Avance 2</w:t>
-            </w:r>
-          </w:p>
-        </w:tc>
-        <w:tc>
-          <w:tcPr>
-            <w:tcW w:w="2338" w:type="dxa"/>
-          </w:tcPr>
-          <w:p>
-            <w:pPr>
-              <w:spacing w:line="480" w:lineRule="auto"/>
-              <w:rPr>
-                <w:rFonts w:ascii="Arial" w:hAnsi="Arial" w:cs="Arial"/>
-                <w:sz w:val="22"/>
-                <w:szCs w:val="22"/>
-              </w:rPr>
-            </w:pPr>
-            <w:r>
-              <w:rPr>
-                <w:rFonts w:ascii="Arial" w:hAnsi="Arial" w:cs="Arial"/>
-                <w:sz w:val="22"/>
-                <w:szCs w:val="22"/>
-              </w:rPr>
-              <w:t xml:space="preserve">Scrum </w:t>
-            </w:r>
-            <w:proofErr w:type="gramStart"/>
-            <w:r>
-              <w:rPr>
-                <w:rFonts w:ascii="Arial" w:hAnsi="Arial" w:cs="Arial"/>
-                <w:sz w:val="22"/>
-                <w:szCs w:val="22"/>
-              </w:rPr>
-              <w:t>Master</w:t>
-            </w:r>
-            <w:proofErr w:type="gramEnd"/>
-          </w:p>
-        </w:tc>
-        <w:tc>
-          <w:tcPr>
-            <w:tcW w:w="2338" w:type="dxa"/>
-          </w:tcPr>
-          <w:p>
-            <w:pPr>
-              <w:spacing w:line="480" w:lineRule="auto"/>
-              <w:rPr>
-                <w:rFonts w:ascii="Arial" w:hAnsi="Arial" w:cs="Arial"/>
-                <w:sz w:val="22"/>
-                <w:szCs w:val="22"/>
-              </w:rPr>
-            </w:pPr>
-            <w:r>
-              <w:rPr>
-                <w:rFonts w:ascii="Arial" w:hAnsi="Arial" w:cs="Arial"/>
-                <w:sz w:val="22"/>
-                <w:szCs w:val="22"/>
-              </w:rPr>
-              <w:t>Carla Vanesa Franco Avelar</w:t>
-            </w:r>
-          </w:p>
-        </w:tc>
-        <w:tc>
-          <w:tcPr>
-            <w:tcW w:w="1634" w:type="dxa"/>
-          </w:tcPr>
-          <w:p>
-            <w:pPr>
-              <w:spacing w:line="480" w:lineRule="auto"/>
-              <w:rPr>
-                <w:rFonts w:ascii="Arial" w:hAnsi="Arial" w:cs="Arial"/>
-                <w:sz w:val="22"/>
-                <w:szCs w:val="22"/>
-              </w:rPr>
-            </w:pPr>
-            <w:r>
-              <w:rPr>
-                <w:rFonts w:ascii="Arial" w:hAnsi="Arial" w:cs="Arial"/>
-                <w:sz w:val="22"/>
-                <w:szCs w:val="22"/>
-              </w:rPr>
-              <w:t>27 sept</w:t>
+              <w:t>26 – 27 sept</w:t>
             </w:r>
           </w:p>
         </w:tc>
@@ -10822,7 +12268,6 @@
           <w:sz w:val="22"/>
           <w:szCs w:val="22"/>
         </w:rPr>
-        <w:lastRenderedPageBreak/>
         <w:br/>
       </w:r>
     </w:p>
@@ -17174,7 +18619,7 @@
                     <pic:cNvPicPr/>
                   </pic:nvPicPr>
                   <pic:blipFill>
-                    <a:blip r:embed="rId11">
+                    <a:blip r:embed="rId23">
                       <a:extLst>
                         <a:ext uri="{28A0092B-C50C-407E-A947-70E740481C1C}">
                           <a14:useLocalDpi xmlns:a14="http://schemas.microsoft.com/office/drawing/2010/main"/>
@@ -17264,7 +18709,7 @@
                     <pic:cNvPicPr/>
                   </pic:nvPicPr>
                   <pic:blipFill>
-                    <a:blip r:embed="rId12">
+                    <a:blip r:embed="rId24">
                       <a:extLst>
                         <a:ext uri="{28A0092B-C50C-407E-A947-70E740481C1C}">
                           <a14:useLocalDpi xmlns:a14="http://schemas.microsoft.com/office/drawing/2010/main"/>
@@ -21909,7 +23354,7 @@
       <w:proofErr w:type="spellEnd"/>
     </w:p>
     <w:sectPr>
-      <w:headerReference w:type="default" r:id="rId13"/>
+      <w:headerReference w:type="default" r:id="rId25"/>
       <w:pgSz w:w="12240" w:h="15840"/>
       <w:pgMar w:top="1440" w:right="1440" w:bottom="1440" w:left="1440" w:header="709" w:footer="709" w:gutter="0"/>
       <w:cols w:space="708"/>
@@ -24579,12 +26024,11 @@
 </file>
 
 <file path=customXml/item1.xml><?xml version="1.0" encoding="utf-8"?>
-<?mso-contentType ?>
-<FormTemplates xmlns="http://schemas.microsoft.com/sharepoint/v3/contenttype/forms">
-  <Display>DocumentLibraryForm</Display>
-  <Edit>DocumentLibraryForm</Edit>
-  <New>DocumentLibraryForm</New>
-</FormTemplates>
+<p:properties xmlns:p="http://schemas.microsoft.com/office/2006/metadata/properties" xmlns:xsi="http://www.w3.org/2001/XMLSchema-instance" xmlns:pc="http://schemas.microsoft.com/office/infopath/2007/PartnerControls">
+  <documentManagement>
+    <_activity xmlns="2d14f65b-dbd3-4b9e-8303-48eebe409733" xsi:nil="true"/>
+  </documentManagement>
+</p:properties>
 </file>
 
 <file path=customXml/item2.xml><?xml version="1.0" encoding="utf-8"?>
@@ -24768,17 +26212,20 @@
 </file>
 
 <file path=customXml/item3.xml><?xml version="1.0" encoding="utf-8"?>
-<p:properties xmlns:p="http://schemas.microsoft.com/office/2006/metadata/properties" xmlns:xsi="http://www.w3.org/2001/XMLSchema-instance" xmlns:pc="http://schemas.microsoft.com/office/infopath/2007/PartnerControls">
-  <documentManagement>
-    <_activity xmlns="2d14f65b-dbd3-4b9e-8303-48eebe409733" xsi:nil="true"/>
-  </documentManagement>
-</p:properties>
+<?mso-contentType ?>
+<FormTemplates xmlns="http://schemas.microsoft.com/sharepoint/v3/contenttype/forms">
+  <Display>DocumentLibraryForm</Display>
+  <Edit>DocumentLibraryForm</Edit>
+  <New>DocumentLibraryForm</New>
+</FormTemplates>
 </file>
 
 <file path=customXml/itemProps1.xml><?xml version="1.0" encoding="utf-8"?>
-<ds:datastoreItem xmlns:ds="http://schemas.openxmlformats.org/officeDocument/2006/customXml" ds:itemID="{822FDB6B-95BE-4B5C-AC35-77DE7E91BE8B}">
+<ds:datastoreItem xmlns:ds="http://schemas.openxmlformats.org/officeDocument/2006/customXml" ds:itemID="{7A03EBF7-18F6-4A1B-8837-FABCC598EF4B}">
   <ds:schemaRefs>
-    <ds:schemaRef ds:uri="http://schemas.microsoft.com/sharepoint/v3/contenttype/forms"/>
+    <ds:schemaRef ds:uri="http://schemas.microsoft.com/office/2006/metadata/properties"/>
+    <ds:schemaRef ds:uri="http://schemas.microsoft.com/office/infopath/2007/PartnerControls"/>
+    <ds:schemaRef ds:uri="2d14f65b-dbd3-4b9e-8303-48eebe409733"/>
   </ds:schemaRefs>
 </ds:datastoreItem>
 </file>
@@ -24802,11 +26249,9 @@
 </file>
 
 <file path=customXml/itemProps3.xml><?xml version="1.0" encoding="utf-8"?>
-<ds:datastoreItem xmlns:ds="http://schemas.openxmlformats.org/officeDocument/2006/customXml" ds:itemID="{7A03EBF7-18F6-4A1B-8837-FABCC598EF4B}">
+<ds:datastoreItem xmlns:ds="http://schemas.openxmlformats.org/officeDocument/2006/customXml" ds:itemID="{822FDB6B-95BE-4B5C-AC35-77DE7E91BE8B}">
   <ds:schemaRefs>
-    <ds:schemaRef ds:uri="http://schemas.microsoft.com/office/2006/metadata/properties"/>
-    <ds:schemaRef ds:uri="http://schemas.microsoft.com/office/infopath/2007/PartnerControls"/>
-    <ds:schemaRef ds:uri="2d14f65b-dbd3-4b9e-8303-48eebe409733"/>
+    <ds:schemaRef ds:uri="http://schemas.microsoft.com/sharepoint/v3/contenttype/forms"/>
   </ds:schemaRefs>
 </ds:datastoreItem>
 </file>
</xml_diff>

<commit_message>
Actualiza diagrama UML y arquitectura en capas con la informacion de Jesus
</commit_message>
<xml_diff>
--- a/docs/Proyecto de Gestión de Reservas para Hoteles.docx
+++ b/docs/Proyecto de Gestión de Reservas para Hoteles.docx
@@ -2198,7 +2198,7 @@
                 <w:noProof/>
               </w:rPr>
               <w:drawing>
-                <wp:inline distT="0" distB="0" distL="0" distR="0" wp14:anchorId="5BEF32B5" wp14:editId="40AFCA59">
+                <wp:inline distT="0" distB="0" distL="0" distR="0" wp14:anchorId="5BEF32B5" wp14:editId="4541BDD4">
                   <wp:extent cx="1638687" cy="1828800"/>
                   <wp:effectExtent l="152400" t="152400" r="361950" b="361950"/>
                   <wp:docPr id="2" name="Imagen 1"/>
@@ -2374,7 +2374,7 @@
                 <w:noProof/>
               </w:rPr>
               <w:drawing>
-                <wp:inline distT="0" distB="0" distL="0" distR="0" wp14:anchorId="0007AC8C" wp14:editId="02A9A1C6">
+                <wp:inline distT="0" distB="0" distL="0" distR="0" wp14:anchorId="0007AC8C" wp14:editId="3389B717">
                   <wp:extent cx="1653997" cy="1524000"/>
                   <wp:effectExtent l="171450" t="152400" r="365760" b="361950"/>
                   <wp:docPr id="8" name="Imagen 1"/>
@@ -18432,7 +18432,6 @@
     </w:p>
     <w:p>
       <w:pPr>
-        <w:spacing w:line="480" w:lineRule="auto"/>
         <w:rPr>
           <w:rFonts w:ascii="Arial" w:hAnsi="Arial" w:cs="Arial"/>
           <w:b/>
@@ -18440,11 +18439,17 @@
           <w:sz w:val="22"/>
           <w:szCs w:val="22"/>
         </w:rPr>
+        <w:sectPr>
+          <w:headerReference w:type="default" r:id="rId23"/>
+          <w:pgSz w:w="12240" w:h="15840"/>
+          <w:pgMar w:top="1440" w:right="1440" w:bottom="1440" w:left="1440" w:header="709" w:footer="709" w:gutter="0"/>
+          <w:cols w:space="708"/>
+          <w:docGrid w:linePitch="360"/>
+        </w:sectPr>
       </w:pPr>
     </w:p>
     <w:p>
       <w:pPr>
-        <w:spacing w:line="480" w:lineRule="auto"/>
         <w:rPr>
           <w:rFonts w:ascii="Arial" w:hAnsi="Arial" w:cs="Arial"/>
           <w:b/>
@@ -18452,129 +18457,6 @@
           <w:sz w:val="22"/>
           <w:szCs w:val="22"/>
         </w:rPr>
-      </w:pPr>
-    </w:p>
-    <w:p>
-      <w:pPr>
-        <w:spacing w:line="480" w:lineRule="auto"/>
-        <w:rPr>
-          <w:rFonts w:ascii="Arial" w:hAnsi="Arial" w:cs="Arial"/>
-          <w:b/>
-          <w:bCs/>
-          <w:sz w:val="22"/>
-          <w:szCs w:val="22"/>
-        </w:rPr>
-      </w:pPr>
-    </w:p>
-    <w:p>
-      <w:pPr>
-        <w:spacing w:line="480" w:lineRule="auto"/>
-        <w:rPr>
-          <w:rFonts w:ascii="Arial" w:hAnsi="Arial" w:cs="Arial"/>
-          <w:b/>
-          <w:bCs/>
-          <w:sz w:val="22"/>
-          <w:szCs w:val="22"/>
-        </w:rPr>
-      </w:pPr>
-    </w:p>
-    <w:p>
-      <w:pPr>
-        <w:spacing w:line="480" w:lineRule="auto"/>
-        <w:rPr>
-          <w:rFonts w:ascii="Arial" w:hAnsi="Arial" w:cs="Arial"/>
-          <w:b/>
-          <w:bCs/>
-          <w:sz w:val="22"/>
-          <w:szCs w:val="22"/>
-        </w:rPr>
-      </w:pPr>
-    </w:p>
-    <w:p>
-      <w:pPr>
-        <w:spacing w:line="480" w:lineRule="auto"/>
-        <w:rPr>
-          <w:rFonts w:ascii="Arial" w:hAnsi="Arial" w:cs="Arial"/>
-          <w:b/>
-          <w:bCs/>
-          <w:sz w:val="22"/>
-          <w:szCs w:val="22"/>
-        </w:rPr>
-      </w:pPr>
-    </w:p>
-    <w:p>
-      <w:pPr>
-        <w:spacing w:line="480" w:lineRule="auto"/>
-        <w:rPr>
-          <w:rFonts w:ascii="Arial" w:hAnsi="Arial" w:cs="Arial"/>
-          <w:b/>
-          <w:bCs/>
-          <w:sz w:val="22"/>
-          <w:szCs w:val="22"/>
-        </w:rPr>
-      </w:pPr>
-    </w:p>
-    <w:p>
-      <w:pPr>
-        <w:spacing w:line="480" w:lineRule="auto"/>
-        <w:rPr>
-          <w:rFonts w:ascii="Arial" w:hAnsi="Arial" w:cs="Arial"/>
-          <w:b/>
-          <w:bCs/>
-          <w:sz w:val="22"/>
-          <w:szCs w:val="22"/>
-        </w:rPr>
-      </w:pPr>
-    </w:p>
-    <w:p>
-      <w:pPr>
-        <w:spacing w:line="480" w:lineRule="auto"/>
-        <w:rPr>
-          <w:rFonts w:ascii="Arial" w:hAnsi="Arial" w:cs="Arial"/>
-          <w:b/>
-          <w:bCs/>
-          <w:sz w:val="22"/>
-          <w:szCs w:val="22"/>
-        </w:rPr>
-      </w:pPr>
-    </w:p>
-    <w:p>
-      <w:pPr>
-        <w:spacing w:line="480" w:lineRule="auto"/>
-        <w:ind w:left="708"/>
-        <w:rPr>
-          <w:rFonts w:ascii="Arial" w:hAnsi="Arial" w:cs="Arial"/>
-          <w:b/>
-          <w:bCs/>
-          <w:sz w:val="22"/>
-          <w:szCs w:val="22"/>
-        </w:rPr>
-      </w:pPr>
-    </w:p>
-    <w:p>
-      <w:pPr>
-        <w:rPr>
-          <w:rFonts w:ascii="Arial" w:hAnsi="Arial" w:cs="Arial"/>
-          <w:b/>
-          <w:bCs/>
-          <w:sz w:val="22"/>
-          <w:szCs w:val="22"/>
-        </w:rPr>
-      </w:pPr>
-      <w:r>
-        <w:rPr>
-          <w:rFonts w:ascii="Arial" w:hAnsi="Arial" w:cs="Arial"/>
-          <w:b/>
-          <w:bCs/>
-          <w:sz w:val="22"/>
-          <w:szCs w:val="22"/>
-        </w:rPr>
-        <w:br w:type="page"/>
-      </w:r>
-    </w:p>
-    <w:p>
-      <w:pPr>
-        <w:spacing w:line="480" w:lineRule="auto"/>
       </w:pPr>
       <w:r>
         <w:rPr>
@@ -18592,22 +18474,32 @@
       <w:pPr>
         <w:spacing w:line="480" w:lineRule="auto"/>
         <w:rPr>
-          <w:rFonts w:ascii="Arial" w:hAnsi="Arial" w:cs="Arial"/>
-          <w:b/>
-          <w:bCs/>
-          <w:sz w:val="22"/>
-          <w:szCs w:val="22"/>
+          <w:noProof/>
         </w:rPr>
       </w:pPr>
       <w:r>
         <w:rPr>
           <w:noProof/>
         </w:rPr>
+        <w:t>Parte 1</w:t>
+      </w:r>
+    </w:p>
+    <w:p>
+      <w:pPr>
+        <w:spacing w:line="480" w:lineRule="auto"/>
+        <w:rPr>
+          <w:noProof/>
+        </w:rPr>
+      </w:pPr>
+      <w:r>
+        <w:rPr>
+          <w:noProof/>
+        </w:rPr>
         <w:drawing>
-          <wp:inline distT="0" distB="0" distL="0" distR="0" wp14:anchorId="3A329CBD" wp14:editId="1CAF698F">
-            <wp:extent cx="5943600" cy="3045864"/>
-            <wp:effectExtent l="0" t="0" r="0" b="0"/>
-            <wp:docPr id="646762960" name="drawing"/>
+          <wp:inline distT="0" distB="0" distL="0" distR="0" wp14:anchorId="4A4EB118" wp14:editId="6AD15724">
+            <wp:extent cx="9144000" cy="4399496"/>
+            <wp:effectExtent l="0" t="0" r="0" b="1270"/>
+            <wp:docPr id="171830720" name="Imagen 1"/>
             <wp:cNvGraphicFramePr>
               <a:graphicFrameLocks xmlns:a="http://schemas.openxmlformats.org/drawingml/2006/main" noChangeAspect="1"/>
             </wp:cNvGraphicFramePr>
@@ -18615,29 +18507,129 @@
               <a:graphicData uri="http://schemas.openxmlformats.org/drawingml/2006/picture">
                 <pic:pic xmlns:pic="http://schemas.openxmlformats.org/drawingml/2006/picture">
                   <pic:nvPicPr>
-                    <pic:cNvPr id="589254357" name="Picture 589254357"/>
+                    <pic:cNvPr id="171830720" name=""/>
                     <pic:cNvPicPr/>
                   </pic:nvPicPr>
-                  <pic:blipFill>
-                    <a:blip r:embed="rId23">
-                      <a:extLst>
-                        <a:ext uri="{28A0092B-C50C-407E-A947-70E740481C1C}">
-                          <a14:useLocalDpi xmlns:a14="http://schemas.microsoft.com/office/drawing/2010/main"/>
-                        </a:ext>
-                      </a:extLst>
-                    </a:blip>
+                  <pic:blipFill rotWithShape="1">
+                    <a:blip r:embed="rId24"/>
+                    <a:srcRect l="695" r="1388"/>
                     <a:stretch>
                       <a:fillRect/>
                     </a:stretch>
                   </pic:blipFill>
-                  <pic:spPr>
+                  <pic:spPr bwMode="auto">
                     <a:xfrm>
                       <a:off x="0" y="0"/>
-                      <a:ext cx="5943600" cy="3045864"/>
+                      <a:ext cx="9182579" cy="4418058"/>
                     </a:xfrm>
                     <a:prstGeom prst="rect">
                       <a:avLst/>
                     </a:prstGeom>
+                    <a:ln>
+                      <a:noFill/>
+                    </a:ln>
+                    <a:extLst>
+                      <a:ext uri="{53640926-AAD7-44D8-BBD7-CCE9431645EC}">
+                        <a14:shadowObscured xmlns:a14="http://schemas.microsoft.com/office/drawing/2010/main"/>
+                      </a:ext>
+                    </a:extLst>
+                  </pic:spPr>
+                </pic:pic>
+              </a:graphicData>
+            </a:graphic>
+          </wp:inline>
+        </w:drawing>
+      </w:r>
+      <w:r>
+        <w:rPr>
+          <w:noProof/>
+        </w:rPr>
+        <w:br/>
+      </w:r>
+      <w:r>
+        <w:rPr>
+          <w:noProof/>
+        </w:rPr>
+        <w:br/>
+      </w:r>
+    </w:p>
+    <w:p>
+      <w:pPr>
+        <w:rPr>
+          <w:noProof/>
+        </w:rPr>
+      </w:pPr>
+      <w:r>
+        <w:rPr>
+          <w:noProof/>
+        </w:rPr>
+        <w:br w:type="page"/>
+      </w:r>
+    </w:p>
+    <w:p>
+      <w:pPr>
+        <w:spacing w:line="480" w:lineRule="auto"/>
+        <w:rPr>
+          <w:noProof/>
+        </w:rPr>
+      </w:pPr>
+      <w:r>
+        <w:rPr>
+          <w:noProof/>
+        </w:rPr>
+        <w:lastRenderedPageBreak/>
+        <w:t>Parte 2</w:t>
+      </w:r>
+    </w:p>
+    <w:p>
+      <w:pPr>
+        <w:spacing w:line="480" w:lineRule="auto"/>
+        <w:rPr>
+          <w:noProof/>
+        </w:rPr>
+      </w:pPr>
+      <w:r>
+        <w:rPr>
+          <w:noProof/>
+        </w:rPr>
+        <w:drawing>
+          <wp:inline distT="0" distB="0" distL="0" distR="0" wp14:anchorId="2187EA72" wp14:editId="7A75A931">
+            <wp:extent cx="9144000" cy="4281173"/>
+            <wp:effectExtent l="0" t="0" r="0" b="5080"/>
+            <wp:docPr id="681883669" name="Imagen 1"/>
+            <wp:cNvGraphicFramePr>
+              <a:graphicFrameLocks xmlns:a="http://schemas.openxmlformats.org/drawingml/2006/main" noChangeAspect="1"/>
+            </wp:cNvGraphicFramePr>
+            <a:graphic xmlns:a="http://schemas.openxmlformats.org/drawingml/2006/main">
+              <a:graphicData uri="http://schemas.openxmlformats.org/drawingml/2006/picture">
+                <pic:pic xmlns:pic="http://schemas.openxmlformats.org/drawingml/2006/picture">
+                  <pic:nvPicPr>
+                    <pic:cNvPr id="681883669" name=""/>
+                    <pic:cNvPicPr/>
+                  </pic:nvPicPr>
+                  <pic:blipFill rotWithShape="1">
+                    <a:blip r:embed="rId25"/>
+                    <a:srcRect l="2686" r="1571"/>
+                    <a:stretch>
+                      <a:fillRect/>
+                    </a:stretch>
+                  </pic:blipFill>
+                  <pic:spPr bwMode="auto">
+                    <a:xfrm>
+                      <a:off x="0" y="0"/>
+                      <a:ext cx="9157270" cy="4287386"/>
+                    </a:xfrm>
+                    <a:prstGeom prst="rect">
+                      <a:avLst/>
+                    </a:prstGeom>
+                    <a:ln>
+                      <a:noFill/>
+                    </a:ln>
+                    <a:extLst>
+                      <a:ext uri="{53640926-AAD7-44D8-BBD7-CCE9431645EC}">
+                        <a14:shadowObscured xmlns:a14="http://schemas.microsoft.com/office/drawing/2010/main"/>
+                      </a:ext>
+                    </a:extLst>
                   </pic:spPr>
                 </pic:pic>
               </a:graphicData>
@@ -18648,6 +18640,7 @@
     </w:p>
     <w:p>
       <w:pPr>
+        <w:spacing w:line="480" w:lineRule="auto"/>
         <w:rPr>
           <w:rFonts w:ascii="Arial" w:hAnsi="Arial" w:cs="Arial"/>
           <w:b/>
@@ -18656,7 +18649,9 @@
           <w:szCs w:val="22"/>
         </w:rPr>
       </w:pPr>
-      <w:r>
+    </w:p>
+    <w:p>
+      <w:pPr>
         <w:rPr>
           <w:rFonts w:ascii="Arial" w:hAnsi="Arial" w:cs="Arial"/>
           <w:b/>
@@ -18664,7 +18659,51 @@
           <w:sz w:val="22"/>
           <w:szCs w:val="22"/>
         </w:rPr>
-        <w:br w:type="page"/>
+        <w:sectPr>
+          <w:pgSz w:w="15840" w:h="12240" w:orient="landscape"/>
+          <w:pgMar w:top="720" w:right="720" w:bottom="720" w:left="720" w:header="709" w:footer="709" w:gutter="0"/>
+          <w:cols w:space="708"/>
+          <w:docGrid w:linePitch="360"/>
+        </w:sectPr>
+      </w:pPr>
+    </w:p>
+    <w:p>
+      <w:pPr>
+        <w:rPr>
+          <w:rFonts w:ascii="Arial" w:hAnsi="Arial" w:cs="Arial"/>
+          <w:b/>
+          <w:bCs/>
+          <w:sz w:val="22"/>
+          <w:szCs w:val="22"/>
+        </w:rPr>
+      </w:pPr>
+    </w:p>
+    <w:p>
+      <w:pPr>
+        <w:spacing w:line="480" w:lineRule="auto"/>
+        <w:rPr>
+          <w:noProof/>
+        </w:rPr>
+      </w:pPr>
+      <w:r>
+        <w:rPr>
+          <w:rFonts w:ascii="Arial" w:hAnsi="Arial" w:cs="Arial"/>
+          <w:b/>
+          <w:bCs/>
+          <w:sz w:val="22"/>
+          <w:szCs w:val="22"/>
+        </w:rPr>
+        <w:t>A</w:t>
+      </w:r>
+      <w:r>
+        <w:rPr>
+          <w:rFonts w:ascii="Arial" w:hAnsi="Arial" w:cs="Arial"/>
+          <w:b/>
+          <w:bCs/>
+          <w:sz w:val="22"/>
+          <w:szCs w:val="22"/>
+        </w:rPr>
+        <w:t>rquitectura en Capas</w:t>
       </w:r>
     </w:p>
     <w:p>
@@ -18683,21 +18722,15 @@
           <w:rFonts w:ascii="Arial" w:hAnsi="Arial" w:cs="Arial"/>
           <w:b/>
           <w:bCs/>
-          <w:sz w:val="22"/>
-          <w:szCs w:val="22"/>
-        </w:rPr>
-        <w:lastRenderedPageBreak/>
-        <w:t>Arquitectura en Capas</w:t>
-      </w:r>
-      <w:r>
-        <w:rPr>
           <w:noProof/>
+          <w:sz w:val="22"/>
+          <w:szCs w:val="22"/>
         </w:rPr>
         <w:drawing>
-          <wp:inline distT="0" distB="0" distL="0" distR="0" wp14:anchorId="36085DBE" wp14:editId="45A8FBA4">
-            <wp:extent cx="4943475" cy="3374872"/>
-            <wp:effectExtent l="0" t="0" r="0" b="0"/>
-            <wp:docPr id="204809306" name="drawing"/>
+          <wp:inline distT="0" distB="0" distL="0" distR="0" wp14:anchorId="285937DF" wp14:editId="35BB08C9">
+            <wp:extent cx="6285431" cy="5730546"/>
+            <wp:effectExtent l="0" t="0" r="1270" b="3810"/>
+            <wp:docPr id="1661102170" name="Imagen 2"/>
             <wp:cNvGraphicFramePr>
               <a:graphicFrameLocks xmlns:a="http://schemas.openxmlformats.org/drawingml/2006/main" noChangeAspect="1"/>
             </wp:cNvGraphicFramePr>
@@ -18705,29 +18738,33 @@
               <a:graphicData uri="http://schemas.openxmlformats.org/drawingml/2006/picture">
                 <pic:pic xmlns:pic="http://schemas.openxmlformats.org/drawingml/2006/picture">
                   <pic:nvPicPr>
-                    <pic:cNvPr id="1225524158" name="Picture 1225524158"/>
-                    <pic:cNvPicPr/>
+                    <pic:cNvPr id="0" name="Picture 2"/>
+                    <pic:cNvPicPr>
+                      <a:picLocks noChangeAspect="1" noChangeArrowheads="1"/>
+                    </pic:cNvPicPr>
                   </pic:nvPicPr>
                   <pic:blipFill>
-                    <a:blip r:embed="rId24">
+                    <a:blip r:embed="rId26">
                       <a:extLst>
                         <a:ext uri="{28A0092B-C50C-407E-A947-70E740481C1C}">
-                          <a14:useLocalDpi xmlns:a14="http://schemas.microsoft.com/office/drawing/2010/main"/>
+                          <a14:useLocalDpi xmlns:a14="http://schemas.microsoft.com/office/drawing/2010/main" val="0"/>
                         </a:ext>
                       </a:extLst>
                     </a:blip>
+                    <a:srcRect/>
                     <a:stretch>
                       <a:fillRect/>
                     </a:stretch>
                   </pic:blipFill>
-                  <pic:spPr>
+                  <pic:spPr bwMode="auto">
                     <a:xfrm>
                       <a:off x="0" y="0"/>
-                      <a:ext cx="4943475" cy="3374872"/>
+                      <a:ext cx="6298006" cy="5742011"/>
                     </a:xfrm>
                     <a:prstGeom prst="rect">
                       <a:avLst/>
                     </a:prstGeom>
+                    <a:noFill/>
                   </pic:spPr>
                 </pic:pic>
               </a:graphicData>
@@ -23354,7 +23391,6 @@
       <w:proofErr w:type="spellEnd"/>
     </w:p>
     <w:sectPr>
-      <w:headerReference w:type="default" r:id="rId25"/>
       <w:pgSz w:w="12240" w:h="15840"/>
       <w:pgMar w:top="1440" w:right="1440" w:bottom="1440" w:left="1440" w:header="709" w:footer="709" w:gutter="0"/>
       <w:cols w:space="708"/>
@@ -25263,6 +25299,7 @@
   <w:style w:type="character" w:default="1" w:styleId="Fuentedeprrafopredeter">
     <w:name w:val="Default Paragraph Font"/>
     <w:uiPriority w:val="1"/>
+    <w:semiHidden/>
     <w:unhideWhenUsed/>
   </w:style>
   <w:style w:type="table" w:default="1" w:styleId="Tablanormal">
@@ -26024,14 +26061,6 @@
 </file>
 
 <file path=customXml/item1.xml><?xml version="1.0" encoding="utf-8"?>
-<p:properties xmlns:p="http://schemas.microsoft.com/office/2006/metadata/properties" xmlns:xsi="http://www.w3.org/2001/XMLSchema-instance" xmlns:pc="http://schemas.microsoft.com/office/infopath/2007/PartnerControls">
-  <documentManagement>
-    <_activity xmlns="2d14f65b-dbd3-4b9e-8303-48eebe409733" xsi:nil="true"/>
-  </documentManagement>
-</p:properties>
-</file>
-
-<file path=customXml/item2.xml><?xml version="1.0" encoding="utf-8"?>
 <ct:contentTypeSchema xmlns:ct="http://schemas.microsoft.com/office/2006/metadata/contentType" xmlns:ma="http://schemas.microsoft.com/office/2006/metadata/properties/metaAttributes" ct:_="" ma:_="" ma:contentTypeName="Documento" ma:contentTypeID="0x0101003AF49DDEF441504A9AC76EA29892912D" ma:contentTypeVersion="10" ma:contentTypeDescription="Crear nuevo documento." ma:contentTypeScope="" ma:versionID="3a9b1abba21c2f4c9de24f68e7e68b8e">
   <xsd:schema xmlns:xsd="http://www.w3.org/2001/XMLSchema" xmlns:xs="http://www.w3.org/2001/XMLSchema" xmlns:p="http://schemas.microsoft.com/office/2006/metadata/properties" xmlns:ns3="2d14f65b-dbd3-4b9e-8303-48eebe409733" targetNamespace="http://schemas.microsoft.com/office/2006/metadata/properties" ma:root="true" ma:fieldsID="ac178463c80ba25e562b98e3f0c366a2" ns3:_="">
     <xsd:import namespace="2d14f65b-dbd3-4b9e-8303-48eebe409733"/>
@@ -26211,6 +26240,14 @@
 </ct:contentTypeSchema>
 </file>
 
+<file path=customXml/item2.xml><?xml version="1.0" encoding="utf-8"?>
+<p:properties xmlns:p="http://schemas.microsoft.com/office/2006/metadata/properties" xmlns:xsi="http://www.w3.org/2001/XMLSchema-instance" xmlns:pc="http://schemas.microsoft.com/office/infopath/2007/PartnerControls">
+  <documentManagement>
+    <_activity xmlns="2d14f65b-dbd3-4b9e-8303-48eebe409733" xsi:nil="true"/>
+  </documentManagement>
+</p:properties>
+</file>
+
 <file path=customXml/item3.xml><?xml version="1.0" encoding="utf-8"?>
 <?mso-contentType ?>
 <FormTemplates xmlns="http://schemas.microsoft.com/sharepoint/v3/contenttype/forms">
@@ -26221,16 +26258,6 @@
 </file>
 
 <file path=customXml/itemProps1.xml><?xml version="1.0" encoding="utf-8"?>
-<ds:datastoreItem xmlns:ds="http://schemas.openxmlformats.org/officeDocument/2006/customXml" ds:itemID="{7A03EBF7-18F6-4A1B-8837-FABCC598EF4B}">
-  <ds:schemaRefs>
-    <ds:schemaRef ds:uri="http://schemas.microsoft.com/office/2006/metadata/properties"/>
-    <ds:schemaRef ds:uri="http://schemas.microsoft.com/office/infopath/2007/PartnerControls"/>
-    <ds:schemaRef ds:uri="2d14f65b-dbd3-4b9e-8303-48eebe409733"/>
-  </ds:schemaRefs>
-</ds:datastoreItem>
-</file>
-
-<file path=customXml/itemProps2.xml><?xml version="1.0" encoding="utf-8"?>
 <ds:datastoreItem xmlns:ds="http://schemas.openxmlformats.org/officeDocument/2006/customXml" ds:itemID="{F411C895-2ABD-4A22-A82C-5EA52C010223}">
   <ds:schemaRefs>
     <ds:schemaRef ds:uri="http://schemas.microsoft.com/office/2006/metadata/contentType"/>
@@ -26248,6 +26275,16 @@
 </ds:datastoreItem>
 </file>
 
+<file path=customXml/itemProps2.xml><?xml version="1.0" encoding="utf-8"?>
+<ds:datastoreItem xmlns:ds="http://schemas.openxmlformats.org/officeDocument/2006/customXml" ds:itemID="{7A03EBF7-18F6-4A1B-8837-FABCC598EF4B}">
+  <ds:schemaRefs>
+    <ds:schemaRef ds:uri="http://schemas.microsoft.com/office/2006/metadata/properties"/>
+    <ds:schemaRef ds:uri="http://schemas.microsoft.com/office/infopath/2007/PartnerControls"/>
+    <ds:schemaRef ds:uri="2d14f65b-dbd3-4b9e-8303-48eebe409733"/>
+  </ds:schemaRefs>
+</ds:datastoreItem>
+</file>
+
 <file path=customXml/itemProps3.xml><?xml version="1.0" encoding="utf-8"?>
 <ds:datastoreItem xmlns:ds="http://schemas.openxmlformats.org/officeDocument/2006/customXml" ds:itemID="{822FDB6B-95BE-4B5C-AC35-77DE7E91BE8B}">
   <ds:schemaRefs>

</xml_diff>